<commit_message>
Added Placeholer for AI Summary
Now Our Integration can communicate with the LLM running on the local machine (Ollama integration is not needed for it)
as a test prompt "define human" is given and its result can be seen in the insights sidebox
</commit_message>
<xml_diff>
--- a/FYP Documents/fyp_thesis.docx
+++ b/FYP Documents/fyp_thesis.docx
@@ -2474,8 +2474,6 @@
         </w:rPr>
         <w:t xml:space="preserve"> ............................ 6</w:t>
       </w:r>
-      <w:bookmarkStart w:id="2" w:name="_GoBack"/>
-      <w:bookmarkEnd w:id="2"/>
     </w:p>
     <w:p>
       <w:pPr>
@@ -2911,12 +2909,12 @@
         <w:spacing w:line="360" w:lineRule="auto"/>
         <w:jc w:val="center"/>
       </w:pPr>
-      <w:bookmarkStart w:id="3" w:name="_Toc209711644"/>
+      <w:bookmarkStart w:id="2" w:name="_Toc209711644"/>
       <w:r>
         <w:lastRenderedPageBreak/>
         <w:t>ABSTRACT</w:t>
       </w:r>
-      <w:bookmarkEnd w:id="3"/>
+      <w:bookmarkEnd w:id="2"/>
     </w:p>
     <w:p>
       <w:pPr>
@@ -2971,7 +2969,13 @@
       </w:r>
       <w:proofErr w:type="spellEnd"/>
       <w:r>
-        <w:t>. The proposed system integrates real-time data acquisition from multiple solar inverters, smart communication with critical loads, and intell</w:t>
+        <w:t xml:space="preserve">. The proposed system integrates real-time data acquisition </w:t>
+      </w:r>
+      <w:r>
+        <w:t>from</w:t>
+      </w:r>
+      <w:r>
+        <w:t xml:space="preserve"> solar inverters, smart communication with critical loads, and intell</w:t>
       </w:r>
       <w:r>
         <w:t>igent decision-making algorithm</w:t>
@@ -2986,7 +2990,10 @@
         <w:t>Home Assistant–based interface</w:t>
       </w:r>
       <w:r>
-        <w:t xml:space="preserve"> was developed to provide seamless monitoring, control, and automation, enabling both system-driven and user-controlled operations. Additionally, a power monitoring framework was implemented at multiple levels — device, room, and building — to provide granular visibility into energy consumption patterns.</w:t>
+        <w:t xml:space="preserve"> was developed to provide seamless monitoring, control, and automation, enabling both system-driven and user-controlled operations. Additionally, a power monitoring framework was implemented </w:t>
+      </w:r>
+      <w:r>
+        <w:t>at the main distribution box of the building for non-solar data acquisition.</w:t>
       </w:r>
     </w:p>
     <w:p>
@@ -2994,7 +3001,25 @@
         <w:pStyle w:val="NormalWeb"/>
       </w:pPr>
       <w:r>
-        <w:t>The developed solution demonstrates the potential to enhance energy efficiency, reduce dependency on grid power, and optimize overall system performance. By combining renewable energy integration, intelligent load prioritization, and user interaction, the project contributes toward building sustainable, cost-effective, and reliable commercial energy management systems.</w:t>
+        <w:t>The developed solution demonstrates the potential to enhance energy efficiency, reduce dependency on grid power, and optimize overall system performance. By combining renewable energy integration, intelligent load prioritization</w:t>
+      </w:r>
+      <w:r>
+        <w:t xml:space="preserve"> using </w:t>
+      </w:r>
+      <w:r>
+        <w:rPr>
+          <w:b/>
+        </w:rPr>
+        <w:t xml:space="preserve">AI based </w:t>
+      </w:r>
+      <w:r>
+        <w:rPr>
+          <w:b/>
+        </w:rPr>
+        <w:t>algorithms</w:t>
+      </w:r>
+      <w:r>
+        <w:t>, and user interaction, the project contributes toward building sustainable, cost-effective, and reliable commercial energy management systems.</w:t>
       </w:r>
     </w:p>
     <w:p>
@@ -3008,7 +3033,7 @@
       <w:r>
         <w:br w:type="page"/>
       </w:r>
-      <w:bookmarkStart w:id="4" w:name="_TOC_250002"/>
+      <w:bookmarkStart w:id="3" w:name="_TOC_250002"/>
     </w:p>
     <w:p/>
     <w:p>
@@ -3034,7 +3059,7 @@
           <w:u w:val="single"/>
         </w:rPr>
       </w:pPr>
-      <w:bookmarkStart w:id="5" w:name="_Toc209711645"/>
+      <w:bookmarkStart w:id="4" w:name="_Toc209711645"/>
       <w:r>
         <w:rPr>
           <w:sz w:val="24"/>
@@ -3068,16 +3093,16 @@
         </w:rPr>
         <w:t xml:space="preserve"> </w:t>
       </w:r>
+      <w:bookmarkEnd w:id="3"/>
+      <w:r>
+        <w:rPr>
+          <w:sz w:val="24"/>
+          <w:szCs w:val="24"/>
+          <w:u w:val="single"/>
+        </w:rPr>
+        <w:t>FIGURES</w:t>
+      </w:r>
       <w:bookmarkEnd w:id="4"/>
-      <w:r>
-        <w:rPr>
-          <w:sz w:val="24"/>
-          <w:szCs w:val="24"/>
-          <w:u w:val="single"/>
-        </w:rPr>
-        <w:t>FIGURES</w:t>
-      </w:r>
-      <w:bookmarkEnd w:id="5"/>
     </w:p>
     <w:p>
       <w:pPr>
@@ -3117,7 +3142,7 @@
             <w:rStyle w:val="Hyperlink"/>
             <w:noProof/>
           </w:rPr>
-          <w:t>Figure 1- Wind Turbine</w:t>
+          <w:t>Figure 1-</w:t>
         </w:r>
         <w:r>
           <w:rPr>
@@ -3145,20 +3170,16 @@
             <w:noProof/>
             <w:webHidden/>
           </w:rPr>
-        </w:r>
-        <w:r>
-          <w:rPr>
-            <w:noProof/>
-            <w:webHidden/>
-          </w:rPr>
           <w:fldChar w:fldCharType="separate"/>
         </w:r>
         <w:r>
           <w:rPr>
+            <w:b/>
+            <w:bCs/>
             <w:noProof/>
             <w:webHidden/>
           </w:rPr>
-          <w:t>1</w:t>
+          <w:t>Error! Bookmark not defined.</w:t>
         </w:r>
         <w:r>
           <w:rPr>
@@ -3249,7 +3270,7 @@
       <w:r>
         <w:t xml:space="preserve"> </w:t>
       </w:r>
-      <w:bookmarkStart w:id="6" w:name="_Toc209711646"/>
+      <w:bookmarkStart w:id="5" w:name="_Toc209711646"/>
       <w:r>
         <w:rPr>
           <w:sz w:val="24"/>
@@ -3258,7 +3279,7 @@
         </w:rPr>
         <w:t>LIST OF TABLES</w:t>
       </w:r>
-      <w:bookmarkEnd w:id="6"/>
+      <w:bookmarkEnd w:id="5"/>
       <w:r>
         <w:rPr>
           <w:b w:val="0"/>
@@ -3332,20 +3353,16 @@
             <w:noProof/>
             <w:webHidden/>
           </w:rPr>
-        </w:r>
-        <w:r>
-          <w:rPr>
-            <w:noProof/>
-            <w:webHidden/>
-          </w:rPr>
           <w:fldChar w:fldCharType="separate"/>
         </w:r>
         <w:r>
           <w:rPr>
+            <w:b/>
+            <w:bCs/>
             <w:noProof/>
             <w:webHidden/>
           </w:rPr>
-          <w:t>3</w:t>
+          <w:t>Error! Bookmark not defined.</w:t>
         </w:r>
         <w:r>
           <w:rPr>
@@ -3817,7 +3834,7 @@
           <w:lang w:val="en-GB"/>
         </w:rPr>
       </w:pPr>
-      <w:bookmarkStart w:id="7" w:name="_Toc209711647"/>
+      <w:bookmarkStart w:id="6" w:name="_Toc209711647"/>
       <w:r>
         <w:rPr>
           <w:u w:val="single"/>
@@ -3846,7 +3863,7 @@
         </w:rPr>
         <w:t xml:space="preserve"> INTRODUCTION</w:t>
       </w:r>
-      <w:bookmarkEnd w:id="7"/>
+      <w:bookmarkEnd w:id="6"/>
     </w:p>
     <w:p>
       <w:pPr>
@@ -3896,7 +3913,21 @@
           <w:rFonts w:eastAsia="Times New Roman" w:cs="Times New Roman"/>
           <w:szCs w:val="24"/>
         </w:rPr>
-        <w:t xml:space="preserve">Despite the increasing adoption of renewable energy systems, most commercial buildings lack intelligent frameworks that can seamlessly integrate photovoltaic (PV) generation, grid supply, and battery storage with automated load management. Data acquisition from these facilities is fragmented across disparate vendors and applications; for instance, smart switches, solar inverters, and other </w:t>
+        <w:t xml:space="preserve">Despite the increasing adoption of renewable energy systems, most commercial buildings lack intelligent frameworks that can seamlessly integrate photovoltaic (PV) generation, grid supply, and battery storage with automated load management. Data acquisition </w:t>
+      </w:r>
+      <w:r>
+        <w:rPr>
+          <w:rFonts w:eastAsia="Times New Roman" w:cs="Times New Roman"/>
+          <w:szCs w:val="24"/>
+        </w:rPr>
+        <w:t xml:space="preserve">and load control </w:t>
+      </w:r>
+      <w:r>
+        <w:rPr>
+          <w:rFonts w:eastAsia="Times New Roman" w:cs="Times New Roman"/>
+          <w:szCs w:val="24"/>
+        </w:rPr>
+        <w:t xml:space="preserve">from these facilities is fragmented across disparate vendors and applications; for instance, smart switches, solar inverters, and other </w:t>
       </w:r>
       <w:proofErr w:type="spellStart"/>
       <w:r>
@@ -3934,16 +3965,28 @@
         <w:rPr>
           <w:rStyle w:val="Strong"/>
         </w:rPr>
-        <w:t xml:space="preserve">Smart Energy Management and Load Optimization System for Commercial </w:t>
+        <w:t xml:space="preserve">Smart Energy Management and Load Optimization </w:t>
+      </w:r>
+      <w:r>
+        <w:rPr>
+          <w:rStyle w:val="Strong"/>
+        </w:rPr>
+        <w:t xml:space="preserve">for Commercial </w:t>
       </w:r>
       <w:proofErr w:type="spellStart"/>
       <w:r>
         <w:rPr>
           <w:rStyle w:val="Strong"/>
         </w:rPr>
-        <w:t>Microgrids</w:t>
+        <w:t>Microgrid</w:t>
       </w:r>
       <w:proofErr w:type="spellEnd"/>
+      <w:r>
+        <w:rPr>
+          <w:rStyle w:val="Strong"/>
+        </w:rPr>
+        <w:t xml:space="preserve"> System</w:t>
+      </w:r>
       <w:r>
         <w:t>. The specific objectives are:</w:t>
       </w:r>
@@ -3985,7 +4028,22 @@
       </w:pPr>
       <w:r>
         <w:lastRenderedPageBreak/>
-        <w:t>To design an intelligent load management algorithm that optimizes energy usage through automation and prioritization.</w:t>
+        <w:t>To design an intelligent load management algorithm</w:t>
+      </w:r>
+      <w:r>
+        <w:t xml:space="preserve"> or a </w:t>
+      </w:r>
+      <w:r>
+        <w:rPr>
+          <w:b/>
+        </w:rPr>
+        <w:t>RAG</w:t>
+      </w:r>
+      <w:r>
+        <w:t xml:space="preserve"> based framework</w:t>
+      </w:r>
+      <w:r>
+        <w:t xml:space="preserve"> that optimizes energy usage through automation and prioritization.</w:t>
       </w:r>
     </w:p>
     <w:p>
@@ -4020,7 +4078,16 @@
         <w:spacing w:before="100" w:beforeAutospacing="1" w:after="100" w:afterAutospacing="1" w:line="240" w:lineRule="auto"/>
       </w:pPr>
       <w:r>
-        <w:t>To implement a multi-level power monitoring node (device, room, and building level) for detailed energy analysis.</w:t>
+        <w:t xml:space="preserve">To implement a </w:t>
+      </w:r>
+      <w:r>
+        <w:t>power monitoring node</w:t>
+      </w:r>
+      <w:r>
+        <w:t xml:space="preserve"> </w:t>
+      </w:r>
+      <w:r>
+        <w:t>for detailed energy analysis.</w:t>
       </w:r>
     </w:p>
     <w:p>
@@ -4064,7 +4131,7 @@
           <w:u w:val="single"/>
         </w:rPr>
       </w:pPr>
-      <w:bookmarkStart w:id="8" w:name="_Toc209711648"/>
+      <w:bookmarkStart w:id="7" w:name="_Toc209711648"/>
       <w:r>
         <w:rPr>
           <w:u w:val="single"/>
@@ -4084,7 +4151,7 @@
         </w:rPr>
         <w:t>LITERATURE</w:t>
       </w:r>
-      <w:bookmarkEnd w:id="8"/>
+      <w:bookmarkEnd w:id="7"/>
       <w:r>
         <w:rPr>
           <w:u w:val="single"/>
@@ -4099,7 +4166,7 @@
           <w:sz w:val="48"/>
         </w:rPr>
       </w:pPr>
-      <w:bookmarkStart w:id="9" w:name="_Toc209711649"/>
+      <w:bookmarkStart w:id="8" w:name="_Toc209711649"/>
       <w:r>
         <w:rPr>
           <w:rStyle w:val="Strong"/>
@@ -4707,7 +4774,7 @@
         <w:t xml:space="preserve"> Higher capital and installation costs, increased system complexity, and dependency on regulatory policies.</w:t>
       </w:r>
     </w:p>
-    <w:bookmarkEnd w:id="9"/>
+    <w:bookmarkEnd w:id="8"/>
     <w:p>
       <w:pPr>
         <w:pStyle w:val="Heading2"/>
@@ -5309,6 +5376,20 @@
         <w:rPr>
           <w:rStyle w:val="Strong"/>
         </w:rPr>
+        <w:t>RS23</w:t>
+      </w:r>
+      <w:bookmarkStart w:id="9" w:name="_GoBack"/>
+      <w:bookmarkEnd w:id="9"/>
+      <w:r>
+        <w:rPr>
+          <w:rStyle w:val="Strong"/>
+        </w:rPr>
+        <w:t>2/</w:t>
+      </w:r>
+      <w:r>
+        <w:rPr>
+          <w:rStyle w:val="Strong"/>
+        </w:rPr>
         <w:t>RS485 physical layer with Modbus RTU application protocol</w:t>
       </w:r>
       <w:r>
@@ -5529,24 +5610,18 @@
       <w:pPr>
         <w:pStyle w:val="Heading3"/>
         <w:rPr>
-          <w:sz w:val="27"/>
-        </w:rPr>
-      </w:pPr>
-      <w:r>
-        <w:rPr>
           <w:rStyle w:val="Strong"/>
           <w:b/>
           <w:bCs/>
         </w:rPr>
-        <w:t>2.</w:t>
-      </w:r>
+      </w:pPr>
       <w:r>
         <w:rPr>
           <w:rStyle w:val="Strong"/>
           <w:b/>
           <w:bCs/>
         </w:rPr>
-        <w:t>3</w:t>
+        <w:t>2.</w:t>
       </w:r>
       <w:r>
         <w:rPr>
@@ -5554,17 +5629,1353 @@
           <w:b/>
           <w:bCs/>
         </w:rPr>
+        <w:t>3</w:t>
+      </w:r>
+      <w:r>
+        <w:rPr>
+          <w:rStyle w:val="Strong"/>
+          <w:b/>
+          <w:bCs/>
+        </w:rPr>
         <w:t xml:space="preserve"> Home Assistant Custom Integration</w:t>
       </w:r>
       <w:bookmarkStart w:id="10" w:name="_Toc209711651"/>
     </w:p>
     <w:p>
+      <w:r>
+        <w:t xml:space="preserve">Home Assistant (HA) is an open-source platform designed for smart home automation, emphasizing local control, privacy, and integration with a wide array of devices. Developed as a non-profit project under the Open Home Foundation, HA runs on local hardware such as Raspberry Pi or servers, avoiding cloud dependencies to ensure data privacy—all device communication and storage occur locally, with cloud fallback only if </w:t>
+      </w:r>
+      <w:r>
+        <w:lastRenderedPageBreak/>
+        <w:t xml:space="preserve">explicitly configured. Its key features include support for over 1,000 brands and devices through integrations (e.g., </w:t>
+      </w:r>
+      <w:proofErr w:type="spellStart"/>
+      <w:r>
+        <w:t>Zigbee</w:t>
+      </w:r>
+      <w:proofErr w:type="spellEnd"/>
+      <w:r>
+        <w:t xml:space="preserve">, Z-Wave, Thread, </w:t>
+      </w:r>
+      <w:proofErr w:type="gramStart"/>
+      <w:r>
+        <w:t>Matter</w:t>
+      </w:r>
+      <w:proofErr w:type="gramEnd"/>
+      <w:r>
+        <w:t>), automatic network scanning for setup, customizable dashboards with drag-and-drop interfaces for monitoring and control, and a voice assistant called Assist that processes commands locally using natural language.</w:t>
+      </w:r>
+    </w:p>
+    <w:p/>
+    <w:p>
       <w:pPr>
         <w:pStyle w:val="Heading1"/>
         <w:rPr>
           <w:u w:val="single"/>
         </w:rPr>
       </w:pPr>
+    </w:p>
+    <w:p/>
+    <w:p/>
+    <w:p>
+      <w:r>
+        <w:t xml:space="preserve">Energy management and load optimization in </w:t>
+      </w:r>
+      <w:proofErr w:type="spellStart"/>
+      <w:r>
+        <w:t>microgrids</w:t>
+      </w:r>
+      <w:proofErr w:type="spellEnd"/>
+      <w:r>
+        <w:t xml:space="preserve"> have received significant attention due to the integration of renewables, battery storage, and variable loads in commercial and building environments. Existing approaches generally fall into simulation-based optimization, forecasting-driven demand management, and scheduling algorithms.</w:t>
+      </w:r>
+    </w:p>
+    <w:p>
+      <w:r>
+        <w:t xml:space="preserve">Several studies focus on algorithmic optimization for power dispatch and load management. For instance, an improved adaptive genetic algorithm has been proposed for multi-objective power system load optimization dispatch, aiming to balance cost, emissions, and reliability while handling discrete decision variables [1]. Similarly, commercial tools such as the ABB Energy Simulator provide user-friendly web-based platforms for </w:t>
+      </w:r>
+      <w:proofErr w:type="spellStart"/>
+      <w:r>
+        <w:t>microgrid</w:t>
+      </w:r>
+      <w:proofErr w:type="spellEnd"/>
+      <w:r>
+        <w:t xml:space="preserve"> planning, allowing simulation of solar, battery, and demand scenarios to estimate ROI and environmental benefits [2].</w:t>
+      </w:r>
+    </w:p>
+    <w:p>
+      <w:r>
+        <w:t xml:space="preserve">Advanced AI-driven frameworks have also emerged for smart building </w:t>
+      </w:r>
+      <w:proofErr w:type="spellStart"/>
+      <w:r>
+        <w:t>microgrids</w:t>
+      </w:r>
+      <w:proofErr w:type="spellEnd"/>
+      <w:r>
+        <w:t xml:space="preserve"> (SBMGs). A notable example is the </w:t>
+      </w:r>
+      <w:proofErr w:type="spellStart"/>
+      <w:r>
+        <w:t>Greylag</w:t>
+      </w:r>
+      <w:proofErr w:type="spellEnd"/>
+      <w:r>
+        <w:t xml:space="preserve"> Goose Optimization (GGO) combined with Relational Bi-Level Aggregation Graph Convolutional Network (RBAGCN), enhanced by Fast Resampled Iterative Filtering (FRIF) preprocessing and Prairie Dog Optimization (PDO) feature selection [3]. This hybrid model achieves high simulation accuracy (98.3%) in load forecasting and battery-conscious demand management by capturing interrelations among energy variables (e.g., solar voltage, battery discharge power, temperature). Another residential-focused approach uses bio-inspired optimization algorithms (BOSA, SSA, CSO) for demand-side management in smart grids, scheduling </w:t>
+      </w:r>
+      <w:proofErr w:type="spellStart"/>
+      <w:r>
+        <w:t>shiftable</w:t>
+      </w:r>
+      <w:proofErr w:type="spellEnd"/>
+      <w:r>
+        <w:t xml:space="preserve"> loads (e.g., air conditioners, washing machines, dishwashers) to reduce peak demand and electricity costs by up to 16% while integrating solar resources [4].</w:t>
+      </w:r>
+    </w:p>
+    <w:p>
+      <w:r>
+        <w:rPr>
+          <w:b/>
+          <w:bCs/>
+        </w:rPr>
+        <w:t>Disadvantages of Existing Solutions</w:t>
+      </w:r>
+    </w:p>
+    <w:p>
+      <w:r>
+        <w:lastRenderedPageBreak/>
+        <w:t xml:space="preserve">Despite their contributions, these works have notable limitations. Most are heavily simulation-oriented (MATLAB-based) with no real hardware validation, ignoring practical issues such as sensor noise, communication delays, device failures, or real-time execution constraints [1][3]. They typically assume the availability of sophisticated, high-resolution data and inherently smart infrastructure, which is rarely the case in legacy commercial setups where inverters and HVAC systems lack native </w:t>
+      </w:r>
+      <w:proofErr w:type="spellStart"/>
+      <w:r>
+        <w:t>IoT</w:t>
+      </w:r>
+      <w:proofErr w:type="spellEnd"/>
+      <w:r>
+        <w:t xml:space="preserve"> connectivity or standardized APIs [3</w:t>
+      </w:r>
+      <w:proofErr w:type="gramStart"/>
+      <w:r>
+        <w:t>][</w:t>
+      </w:r>
+      <w:proofErr w:type="gramEnd"/>
+      <w:r>
+        <w:t>4].</w:t>
+      </w:r>
+    </w:p>
+    <w:p>
+      <w:r>
+        <w:t>Computational complexity is another major drawback. Hybrid graph-based models (RBAGCN + GGO) and multi-stage pipelines (FRIF + PDO + optimization) demand significant resources, making them unsuitable for edge deployment or small-to-medium commercial buildings [3]. Optimization tools like the ABB simulator or genetic algorithms treat loads in highly generalized terms (total demand or aggregate power), without addressing specific controllable devices such as HVAC units or split ACs that dominate commercial energy consumption [1</w:t>
+      </w:r>
+      <w:proofErr w:type="gramStart"/>
+      <w:r>
+        <w:t>][</w:t>
+      </w:r>
+      <w:proofErr w:type="gramEnd"/>
+      <w:r>
+        <w:t>2].</w:t>
+      </w:r>
+    </w:p>
+    <w:p>
+      <w:r>
+        <w:t>Furthermore, most solutions lack support for retrofitting non-smart devices. There is minimal emphasis on practical communication protocols (e.g., Modbus RTU over RS485 for inverters or IR/wired interfaces for HVAC) or integration with accessible platforms for monitoring and control [3</w:t>
+      </w:r>
+      <w:proofErr w:type="gramStart"/>
+      <w:r>
+        <w:t>][</w:t>
+      </w:r>
+      <w:proofErr w:type="gramEnd"/>
+      <w:r>
+        <w:t>4]. User interaction, remote/cloud-based overrides, and occupant comfort considerations are often absent, resulting in rigid, centralized systems that prioritize algorithmic performance over real-world usability and flexibility [2</w:t>
+      </w:r>
+      <w:proofErr w:type="gramStart"/>
+      <w:r>
+        <w:t>][</w:t>
+      </w:r>
+      <w:proofErr w:type="gramEnd"/>
+      <w:r>
+        <w:t>4].</w:t>
+      </w:r>
+      <w:r>
+        <w:br/>
+      </w:r>
+      <w:r>
+        <w:rPr>
+          <w:b/>
+          <w:bCs/>
+        </w:rPr>
+        <w:t>Limitations of Existing Solutions</w:t>
+      </w:r>
+    </w:p>
+    <w:p>
+      <w:r>
+        <w:t xml:space="preserve">These approaches, while innovative, have notable drawbacks. Most rely heavily on </w:t>
+      </w:r>
+      <w:r>
+        <w:rPr>
+          <w:b/>
+          <w:bCs/>
+        </w:rPr>
+        <w:t>simulations</w:t>
+      </w:r>
+      <w:r>
+        <w:t xml:space="preserve"> (MATLAB or theoretical models) without real-world hardware deployment, risking poor translation due to unaccounted factors like sensor noise, communication delays, or device failures [1</w:t>
+      </w:r>
+      <w:proofErr w:type="gramStart"/>
+      <w:r>
+        <w:t>,2,4</w:t>
+      </w:r>
+      <w:proofErr w:type="gramEnd"/>
+      <w:r>
+        <w:t xml:space="preserve">]. They often treat loads in </w:t>
+      </w:r>
+      <w:r>
+        <w:rPr>
+          <w:b/>
+          <w:bCs/>
+        </w:rPr>
+        <w:t>general terms</w:t>
+      </w:r>
+      <w:r>
+        <w:t xml:space="preserve"> (total demand or aggregated power) or focus on residential </w:t>
+      </w:r>
+      <w:proofErr w:type="spellStart"/>
+      <w:r>
+        <w:t>shiftable</w:t>
+      </w:r>
+      <w:proofErr w:type="spellEnd"/>
+      <w:r>
+        <w:t xml:space="preserve"> appliances, lacking emphasis on </w:t>
+      </w:r>
+      <w:r>
+        <w:rPr>
+          <w:b/>
+          <w:bCs/>
+        </w:rPr>
+        <w:t>commercial HVAC and split ACs</w:t>
+      </w:r>
+      <w:r>
+        <w:t xml:space="preserve"> — which constitute the majority of energy use in commercial buildings [2,3,4].</w:t>
+      </w:r>
+    </w:p>
+    <w:p>
+      <w:r>
+        <w:t xml:space="preserve">Many assume </w:t>
+      </w:r>
+      <w:r>
+        <w:rPr>
+          <w:b/>
+          <w:bCs/>
+        </w:rPr>
+        <w:t xml:space="preserve">smart or </w:t>
+      </w:r>
+      <w:proofErr w:type="spellStart"/>
+      <w:r>
+        <w:rPr>
+          <w:b/>
+          <w:bCs/>
+        </w:rPr>
+        <w:t>IoT</w:t>
+      </w:r>
+      <w:proofErr w:type="spellEnd"/>
+      <w:r>
+        <w:rPr>
+          <w:b/>
+          <w:bCs/>
+        </w:rPr>
+        <w:t>-enabled devices</w:t>
+      </w:r>
+      <w:r>
+        <w:t xml:space="preserve"> with native connectivity and detailed data streams, ignoring the need to retrofit </w:t>
+      </w:r>
+      <w:r>
+        <w:rPr>
+          <w:b/>
+          <w:bCs/>
+        </w:rPr>
+        <w:t>non-smart inverters, HVAC controllers, and IR-based split ACs</w:t>
+      </w:r>
+      <w:r>
+        <w:t xml:space="preserve"> common in legacy commercial setups [2</w:t>
+      </w:r>
+      <w:proofErr w:type="gramStart"/>
+      <w:r>
+        <w:t>,4</w:t>
+      </w:r>
+      <w:proofErr w:type="gramEnd"/>
+      <w:r>
+        <w:t>]. High computational complexity (e.g., graph convolutions, multi-stage optimization, swarm algorithms) limits real-time edge deployment and scalability in resource-constrained environments [1</w:t>
+      </w:r>
+      <w:proofErr w:type="gramStart"/>
+      <w:r>
+        <w:t>,4</w:t>
+      </w:r>
+      <w:proofErr w:type="gramEnd"/>
+      <w:r>
+        <w:t xml:space="preserve">]. Few provide </w:t>
+      </w:r>
+      <w:r>
+        <w:rPr>
+          <w:b/>
+          <w:bCs/>
+        </w:rPr>
+        <w:t>user-friendly interfaces</w:t>
+      </w:r>
+      <w:r>
+        <w:t xml:space="preserve"> for monitoring, remote/cloud control, or manual overrides, reducing practicality and occupant comfort [3]. Finally, the focus is often on full forecasting-heavy EMS or planning simulators rather than targeted </w:t>
+      </w:r>
+      <w:r>
+        <w:rPr>
+          <w:b/>
+          <w:bCs/>
+        </w:rPr>
+        <w:t>load optimization</w:t>
+      </w:r>
+      <w:r>
+        <w:t xml:space="preserve"> with prioritization and automation of specific high-consumption loads like HVAC.</w:t>
+      </w:r>
+    </w:p>
+    <w:p>
+      <w:r>
+        <w:rPr>
+          <w:b/>
+          <w:bCs/>
+        </w:rPr>
+        <w:lastRenderedPageBreak/>
+        <w:t>Value Proposition of the Proposed Work</w:t>
+      </w:r>
+    </w:p>
+    <w:p>
+      <w:r>
+        <w:t xml:space="preserve">In contrast, the proposed system delivers a practical, deployable </w:t>
+      </w:r>
+      <w:r>
+        <w:rPr>
+          <w:b/>
+          <w:bCs/>
+        </w:rPr>
+        <w:t>load optimization-based energy management framework</w:t>
+      </w:r>
+      <w:r>
+        <w:t xml:space="preserve"> for commercial hybrid solar </w:t>
+      </w:r>
+      <w:proofErr w:type="spellStart"/>
+      <w:r>
+        <w:t>microgrids</w:t>
+      </w:r>
+      <w:proofErr w:type="spellEnd"/>
+      <w:r>
+        <w:t xml:space="preserve"> that directly addresses these gaps. It retrofits </w:t>
+      </w:r>
+      <w:r>
+        <w:rPr>
+          <w:b/>
+          <w:bCs/>
+        </w:rPr>
+        <w:t>non-smart inverters</w:t>
+      </w:r>
+      <w:r>
+        <w:t xml:space="preserve"> via RS485/Modbus RTU for real-time data acquisition (PV generation, battery SOC, </w:t>
+      </w:r>
+      <w:proofErr w:type="gramStart"/>
+      <w:r>
+        <w:t>grid</w:t>
+      </w:r>
+      <w:proofErr w:type="gramEnd"/>
+      <w:r>
+        <w:t xml:space="preserve"> import/export) and integrates with </w:t>
+      </w:r>
+      <w:r>
+        <w:rPr>
+          <w:b/>
+          <w:bCs/>
+        </w:rPr>
+        <w:t>HVAC and split AC units</w:t>
+      </w:r>
+      <w:r>
+        <w:t xml:space="preserve"> through wired controllers and IR protocols for actual remote control — making legacy devices "smart" without requiring replacements.</w:t>
+      </w:r>
+    </w:p>
+    <w:p>
+      <w:r>
+        <w:t xml:space="preserve">By leveraging a custom </w:t>
+      </w:r>
+      <w:r>
+        <w:rPr>
+          <w:b/>
+          <w:bCs/>
+        </w:rPr>
+        <w:t>Home Assistant integration</w:t>
+      </w:r>
+      <w:r>
+        <w:t xml:space="preserve">, the system enables seamless monitoring, intelligent prioritization/automation of specific high-energy loads (primarily HVAC/ACs), user overrides, and cloud-based remote access. This emphasizes </w:t>
+      </w:r>
+      <w:r>
+        <w:rPr>
+          <w:b/>
+          <w:bCs/>
+        </w:rPr>
+        <w:t>load optimization</w:t>
+      </w:r>
+      <w:r>
+        <w:t xml:space="preserve"> over pure forecasting, prioritizing renewables, minimizing grid dependency and costs, while maintaining comfort in small-to-medium commercial setups. The approach is hardware-validated in a real commercial environment, offering lower complexity, higher </w:t>
+      </w:r>
+      <w:proofErr w:type="spellStart"/>
+      <w:r>
+        <w:t>deployability</w:t>
+      </w:r>
+      <w:proofErr w:type="spellEnd"/>
+      <w:r>
+        <w:t>, and greater relevance to industry compared to simulation-centric or residential-focused existing solutions.</w:t>
+      </w:r>
+    </w:p>
+    <w:p>
+      <w:pPr>
+        <w:spacing w:before="100" w:beforeAutospacing="1" w:after="100" w:afterAutospacing="1" w:line="240" w:lineRule="auto"/>
+        <w:rPr>
+          <w:rFonts w:eastAsia="Times New Roman" w:cs="Times New Roman"/>
+          <w:b/>
+          <w:szCs w:val="24"/>
+        </w:rPr>
+      </w:pPr>
+      <w:r>
+        <w:rPr>
+          <w:rFonts w:eastAsia="Times New Roman" w:cs="Times New Roman"/>
+          <w:b/>
+          <w:szCs w:val="24"/>
+        </w:rPr>
+        <w:t xml:space="preserve">System Design/Methodology </w:t>
+      </w:r>
+    </w:p>
+    <w:p>
+      <w:pPr>
+        <w:spacing w:before="100" w:beforeAutospacing="1" w:after="100" w:afterAutospacing="1" w:line="240" w:lineRule="auto"/>
+        <w:rPr>
+          <w:rFonts w:eastAsia="Times New Roman" w:cs="Times New Roman"/>
+          <w:b/>
+          <w:szCs w:val="24"/>
+        </w:rPr>
+      </w:pPr>
+      <w:r>
+        <w:rPr>
+          <w:rFonts w:eastAsia="Times New Roman" w:cs="Times New Roman"/>
+          <w:b/>
+          <w:szCs w:val="24"/>
+        </w:rPr>
+        <w:t xml:space="preserve">1. </w:t>
+      </w:r>
+      <w:r>
+        <w:rPr>
+          <w:rFonts w:eastAsia="Times New Roman" w:cs="Times New Roman"/>
+          <w:b/>
+          <w:szCs w:val="24"/>
+        </w:rPr>
+        <w:t xml:space="preserve">System </w:t>
+      </w:r>
+      <w:proofErr w:type="spellStart"/>
+      <w:r>
+        <w:rPr>
+          <w:rFonts w:eastAsia="Times New Roman" w:cs="Times New Roman"/>
+          <w:b/>
+          <w:szCs w:val="24"/>
+        </w:rPr>
+        <w:t>archtecture</w:t>
+      </w:r>
+      <w:proofErr w:type="spellEnd"/>
+    </w:p>
+    <w:p>
+      <w:pPr>
+        <w:numPr>
+          <w:ilvl w:val="0"/>
+          <w:numId w:val="21"/>
+        </w:numPr>
+        <w:spacing w:before="100" w:beforeAutospacing="1" w:after="100" w:afterAutospacing="1" w:line="240" w:lineRule="auto"/>
+        <w:rPr>
+          <w:rFonts w:eastAsia="Times New Roman" w:cs="Times New Roman"/>
+          <w:szCs w:val="24"/>
+        </w:rPr>
+      </w:pPr>
+      <w:r>
+        <w:rPr>
+          <w:rFonts w:eastAsia="Times New Roman" w:cs="Times New Roman"/>
+          <w:szCs w:val="24"/>
+        </w:rPr>
+        <w:t xml:space="preserve">Data </w:t>
+      </w:r>
+      <w:proofErr w:type="spellStart"/>
+      <w:r>
+        <w:rPr>
+          <w:rFonts w:eastAsia="Times New Roman" w:cs="Times New Roman"/>
+          <w:szCs w:val="24"/>
+        </w:rPr>
+        <w:t>Acquisiton</w:t>
+      </w:r>
+      <w:proofErr w:type="spellEnd"/>
+      <w:r>
+        <w:rPr>
+          <w:rFonts w:eastAsia="Times New Roman" w:cs="Times New Roman"/>
+          <w:szCs w:val="24"/>
+        </w:rPr>
+        <w:t xml:space="preserve"> from Solar Inverter </w:t>
+      </w:r>
+      <w:r>
+        <w:rPr>
+          <w:rFonts w:eastAsia="Times New Roman" w:cs="Times New Roman"/>
+          <w:szCs w:val="24"/>
+        </w:rPr>
+        <w:t xml:space="preserve"> </w:t>
+      </w:r>
+      <w:r>
+        <w:rPr>
+          <w:rFonts w:eastAsia="Times New Roman" w:cs="Times New Roman"/>
+          <w:szCs w:val="24"/>
+        </w:rPr>
+        <w:t xml:space="preserve">sending this data to home assistant for monitoring </w:t>
+      </w:r>
+    </w:p>
+    <w:p>
+      <w:pPr>
+        <w:pStyle w:val="ListParagraph"/>
+        <w:numPr>
+          <w:ilvl w:val="0"/>
+          <w:numId w:val="21"/>
+        </w:numPr>
+        <w:rPr>
+          <w:rFonts w:eastAsia="Times New Roman" w:cs="Times New Roman"/>
+          <w:szCs w:val="24"/>
+        </w:rPr>
+      </w:pPr>
+      <w:r>
+        <w:rPr>
+          <w:rFonts w:eastAsia="Times New Roman" w:cs="Times New Roman"/>
+          <w:szCs w:val="24"/>
+        </w:rPr>
+        <w:t xml:space="preserve">Data Monitoring and </w:t>
+      </w:r>
+      <w:proofErr w:type="spellStart"/>
+      <w:r>
+        <w:rPr>
+          <w:rFonts w:eastAsia="Times New Roman" w:cs="Times New Roman"/>
+          <w:szCs w:val="24"/>
+        </w:rPr>
+        <w:t>Implimentation</w:t>
+      </w:r>
+      <w:proofErr w:type="spellEnd"/>
+      <w:r>
+        <w:rPr>
+          <w:rFonts w:eastAsia="Times New Roman" w:cs="Times New Roman"/>
+          <w:szCs w:val="24"/>
+        </w:rPr>
+        <w:t xml:space="preserve"> of AI Based Decision making </w:t>
+      </w:r>
+      <w:r>
+        <w:rPr>
+          <w:rFonts w:eastAsia="Times New Roman" w:cs="Times New Roman"/>
+          <w:szCs w:val="24"/>
+        </w:rPr>
+        <w:t>on Home Assistant</w:t>
+      </w:r>
+    </w:p>
+    <w:p>
+      <w:pPr>
+        <w:pStyle w:val="ListParagraph"/>
+        <w:numPr>
+          <w:ilvl w:val="0"/>
+          <w:numId w:val="21"/>
+        </w:numPr>
+        <w:spacing w:before="100" w:beforeAutospacing="1" w:after="100" w:afterAutospacing="1" w:line="240" w:lineRule="auto"/>
+        <w:rPr>
+          <w:rFonts w:eastAsia="Times New Roman" w:cs="Times New Roman"/>
+          <w:szCs w:val="24"/>
+        </w:rPr>
+      </w:pPr>
+      <w:r>
+        <w:rPr>
+          <w:rFonts w:eastAsia="Times New Roman" w:cs="Times New Roman"/>
+          <w:szCs w:val="24"/>
+        </w:rPr>
+        <w:t xml:space="preserve">full </w:t>
+      </w:r>
+      <w:proofErr w:type="spellStart"/>
+      <w:r>
+        <w:rPr>
+          <w:rFonts w:eastAsia="Times New Roman" w:cs="Times New Roman"/>
+          <w:szCs w:val="24"/>
+        </w:rPr>
+        <w:t>implimentation</w:t>
+      </w:r>
+      <w:proofErr w:type="spellEnd"/>
+      <w:r>
+        <w:rPr>
+          <w:rFonts w:eastAsia="Times New Roman" w:cs="Times New Roman"/>
+          <w:szCs w:val="24"/>
+        </w:rPr>
+        <w:t xml:space="preserve"> of the optimization (controlling the loads setting </w:t>
+      </w:r>
+      <w:proofErr w:type="spellStart"/>
+      <w:r>
+        <w:rPr>
+          <w:rFonts w:eastAsia="Times New Roman" w:cs="Times New Roman"/>
+          <w:szCs w:val="24"/>
+        </w:rPr>
+        <w:t>hvac</w:t>
+      </w:r>
+      <w:proofErr w:type="spellEnd"/>
+      <w:r>
+        <w:rPr>
+          <w:rFonts w:eastAsia="Times New Roman" w:cs="Times New Roman"/>
+          <w:szCs w:val="24"/>
+        </w:rPr>
+        <w:t xml:space="preserve"> </w:t>
+      </w:r>
+      <w:proofErr w:type="spellStart"/>
+      <w:r>
+        <w:rPr>
+          <w:rFonts w:eastAsia="Times New Roman" w:cs="Times New Roman"/>
+          <w:szCs w:val="24"/>
+        </w:rPr>
+        <w:t>tempratures,modes</w:t>
+      </w:r>
+      <w:proofErr w:type="spellEnd"/>
+      <w:r>
+        <w:rPr>
+          <w:rFonts w:eastAsia="Times New Roman" w:cs="Times New Roman"/>
+          <w:szCs w:val="24"/>
+        </w:rPr>
+        <w:t xml:space="preserve">, turning them on/off, controlling smart switches </w:t>
+      </w:r>
+      <w:proofErr w:type="spellStart"/>
+      <w:r>
+        <w:rPr>
+          <w:rFonts w:eastAsia="Times New Roman" w:cs="Times New Roman"/>
+          <w:szCs w:val="24"/>
+        </w:rPr>
+        <w:t>etc</w:t>
+      </w:r>
+      <w:proofErr w:type="spellEnd"/>
+      <w:r>
+        <w:rPr>
+          <w:rFonts w:eastAsia="Times New Roman" w:cs="Times New Roman"/>
+          <w:szCs w:val="24"/>
+        </w:rPr>
+        <w:t>)</w:t>
+      </w:r>
+      <w:r>
+        <w:rPr>
+          <w:rFonts w:eastAsia="Times New Roman" w:cs="Times New Roman"/>
+          <w:szCs w:val="24"/>
+        </w:rPr>
+        <w:t xml:space="preserve"> from home assistant</w:t>
+      </w:r>
+      <w:r>
+        <w:rPr>
+          <w:rFonts w:eastAsia="Times New Roman" w:cs="Times New Roman"/>
+          <w:szCs w:val="24"/>
+        </w:rPr>
+        <w:t xml:space="preserve"> based on 2</w:t>
+      </w:r>
+    </w:p>
+    <w:p>
+      <w:pPr>
+        <w:spacing w:before="100" w:beforeAutospacing="1" w:after="100" w:afterAutospacing="1" w:line="240" w:lineRule="auto"/>
+        <w:rPr>
+          <w:rFonts w:eastAsia="Times New Roman" w:cs="Times New Roman"/>
+          <w:szCs w:val="24"/>
+        </w:rPr>
+      </w:pPr>
+      <w:r>
+        <w:rPr>
+          <w:rFonts w:eastAsia="Times New Roman" w:cs="Times New Roman"/>
+          <w:b/>
+          <w:szCs w:val="24"/>
+        </w:rPr>
+        <w:t xml:space="preserve">2. </w:t>
+      </w:r>
+      <w:r>
+        <w:rPr>
+          <w:rFonts w:eastAsia="Times New Roman" w:cs="Times New Roman"/>
+          <w:b/>
+          <w:szCs w:val="24"/>
+        </w:rPr>
+        <w:t>Procedure</w:t>
+      </w:r>
+      <w:r>
+        <w:rPr>
+          <w:rFonts w:eastAsia="Times New Roman" w:cs="Times New Roman"/>
+          <w:szCs w:val="24"/>
+        </w:rPr>
+        <w:t xml:space="preserve"> </w:t>
+      </w:r>
+    </w:p>
+    <w:p>
+      <w:pPr>
+        <w:spacing w:before="100" w:beforeAutospacing="1" w:after="100" w:afterAutospacing="1" w:line="240" w:lineRule="auto"/>
+        <w:rPr>
+          <w:rFonts w:eastAsia="Times New Roman" w:cs="Times New Roman"/>
+          <w:szCs w:val="24"/>
+        </w:rPr>
+      </w:pPr>
+      <w:r>
+        <w:rPr>
+          <w:rFonts w:eastAsia="Times New Roman" w:cs="Times New Roman"/>
+          <w:szCs w:val="24"/>
+        </w:rPr>
+        <w:t xml:space="preserve">1. data </w:t>
+      </w:r>
+      <w:proofErr w:type="spellStart"/>
+      <w:r>
+        <w:rPr>
+          <w:rFonts w:eastAsia="Times New Roman" w:cs="Times New Roman"/>
+          <w:szCs w:val="24"/>
+        </w:rPr>
+        <w:t>acquistion</w:t>
+      </w:r>
+      <w:proofErr w:type="spellEnd"/>
+      <w:r>
+        <w:rPr>
+          <w:rFonts w:eastAsia="Times New Roman" w:cs="Times New Roman"/>
+          <w:szCs w:val="24"/>
+        </w:rPr>
+        <w:t xml:space="preserve"> from inverters:</w:t>
+      </w:r>
+      <w:r>
+        <w:rPr>
+          <w:rFonts w:eastAsia="Times New Roman" w:cs="Times New Roman"/>
+          <w:szCs w:val="24"/>
+        </w:rPr>
+        <w:br/>
+        <w:t xml:space="preserve">we made our </w:t>
+      </w:r>
+      <w:r>
+        <w:rPr>
+          <w:rFonts w:eastAsia="Times New Roman" w:cs="Times New Roman"/>
+          <w:szCs w:val="24"/>
+        </w:rPr>
+        <w:t>custom hardware compromising of 3 things</w:t>
+      </w:r>
+      <w:r>
+        <w:rPr>
+          <w:rFonts w:eastAsia="Times New Roman" w:cs="Times New Roman"/>
+          <w:szCs w:val="24"/>
+        </w:rPr>
+        <w:t xml:space="preserve"> </w:t>
+      </w:r>
+      <w:proofErr w:type="spellStart"/>
+      <w:r>
+        <w:rPr>
+          <w:rFonts w:eastAsia="Times New Roman" w:cs="Times New Roman"/>
+          <w:szCs w:val="24"/>
+        </w:rPr>
+        <w:t>esp</w:t>
+      </w:r>
+      <w:proofErr w:type="spellEnd"/>
+      <w:r>
+        <w:rPr>
+          <w:rFonts w:eastAsia="Times New Roman" w:cs="Times New Roman"/>
+          <w:szCs w:val="24"/>
+        </w:rPr>
+        <w:t xml:space="preserve"> 32</w:t>
+      </w:r>
+      <w:r>
+        <w:rPr>
+          <w:rFonts w:eastAsia="Times New Roman" w:cs="Times New Roman"/>
+          <w:szCs w:val="24"/>
+        </w:rPr>
+        <w:t>,</w:t>
+      </w:r>
+      <w:r>
+        <w:rPr>
+          <w:rFonts w:eastAsia="Times New Roman" w:cs="Times New Roman"/>
+          <w:szCs w:val="24"/>
+        </w:rPr>
+        <w:t xml:space="preserve"> </w:t>
+      </w:r>
+      <w:r>
+        <w:rPr>
+          <w:rFonts w:eastAsia="Times New Roman" w:cs="Times New Roman"/>
+          <w:szCs w:val="24"/>
+        </w:rPr>
+        <w:t xml:space="preserve">custom cable consisting of  RS485(RJ45 cable) and RS232 (DB9 cable), and a 232/485 to UART converter </w:t>
+      </w:r>
+      <w:r>
+        <w:rPr>
+          <w:rFonts w:eastAsia="Times New Roman" w:cs="Times New Roman"/>
+          <w:szCs w:val="24"/>
+        </w:rPr>
+        <w:br/>
+        <w:t xml:space="preserve">this device gets attached with the inverter and serves as a data logger and also sends this data to Home Assistant over </w:t>
+      </w:r>
+      <w:proofErr w:type="spellStart"/>
+      <w:r>
+        <w:rPr>
+          <w:rFonts w:eastAsia="Times New Roman" w:cs="Times New Roman"/>
+          <w:szCs w:val="24"/>
+        </w:rPr>
+        <w:t>WiFi</w:t>
+      </w:r>
+      <w:proofErr w:type="spellEnd"/>
+      <w:r>
+        <w:rPr>
+          <w:rFonts w:eastAsia="Times New Roman" w:cs="Times New Roman"/>
+          <w:szCs w:val="24"/>
+        </w:rPr>
+        <w:t>. This device is discoverable from the home assistant and can be configured from there wirelessly.</w:t>
+      </w:r>
+      <w:r>
+        <w:rPr>
+          <w:rFonts w:eastAsia="Times New Roman" w:cs="Times New Roman"/>
+          <w:szCs w:val="24"/>
+        </w:rPr>
+        <w:br/>
+      </w:r>
+      <w:r>
+        <w:rPr>
+          <w:rFonts w:eastAsia="Times New Roman" w:cs="Times New Roman"/>
+          <w:szCs w:val="24"/>
+        </w:rPr>
+        <w:br/>
+        <w:t>2 Making Smart Controllers for Heavy Loads (HVACs and ACs</w:t>
+      </w:r>
+      <w:proofErr w:type="gramStart"/>
+      <w:r>
+        <w:rPr>
+          <w:rFonts w:eastAsia="Times New Roman" w:cs="Times New Roman"/>
+          <w:szCs w:val="24"/>
+        </w:rPr>
+        <w:t>)</w:t>
+      </w:r>
+      <w:proofErr w:type="gramEnd"/>
+      <w:r>
+        <w:rPr>
+          <w:rFonts w:eastAsia="Times New Roman" w:cs="Times New Roman"/>
+          <w:szCs w:val="24"/>
+        </w:rPr>
+        <w:br/>
+      </w:r>
+      <w:proofErr w:type="spellStart"/>
+      <w:r>
+        <w:rPr>
+          <w:rFonts w:eastAsia="Times New Roman" w:cs="Times New Roman"/>
+          <w:szCs w:val="24"/>
+        </w:rPr>
+        <w:t>i</w:t>
+      </w:r>
+      <w:proofErr w:type="spellEnd"/>
+      <w:r>
+        <w:rPr>
+          <w:rFonts w:eastAsia="Times New Roman" w:cs="Times New Roman"/>
+          <w:szCs w:val="24"/>
+        </w:rPr>
+        <w:t xml:space="preserve">) </w:t>
+      </w:r>
+      <w:r>
+        <w:rPr>
+          <w:rFonts w:eastAsia="Times New Roman" w:cs="Times New Roman"/>
+          <w:szCs w:val="24"/>
+        </w:rPr>
+        <w:t xml:space="preserve">HVACs: </w:t>
+      </w:r>
+      <w:r>
+        <w:rPr>
+          <w:rFonts w:eastAsia="Times New Roman" w:cs="Times New Roman"/>
+          <w:szCs w:val="24"/>
+        </w:rPr>
+        <w:br/>
+        <w:t xml:space="preserve">Different </w:t>
+      </w:r>
+      <w:proofErr w:type="spellStart"/>
+      <w:r>
+        <w:rPr>
+          <w:rFonts w:eastAsia="Times New Roman" w:cs="Times New Roman"/>
+          <w:szCs w:val="24"/>
+        </w:rPr>
+        <w:t>Hvac</w:t>
+      </w:r>
+      <w:proofErr w:type="spellEnd"/>
+      <w:r>
+        <w:rPr>
+          <w:rFonts w:eastAsia="Times New Roman" w:cs="Times New Roman"/>
+          <w:szCs w:val="24"/>
+        </w:rPr>
+        <w:t xml:space="preserve"> wired controllers were reverse engineered and decoded to understand their communication protocols in order to make a custom hardware which can control the </w:t>
+      </w:r>
+      <w:proofErr w:type="spellStart"/>
+      <w:r>
+        <w:rPr>
+          <w:rFonts w:eastAsia="Times New Roman" w:cs="Times New Roman"/>
+          <w:szCs w:val="24"/>
+        </w:rPr>
+        <w:t>hvacs</w:t>
+      </w:r>
+      <w:proofErr w:type="spellEnd"/>
+      <w:r>
+        <w:rPr>
+          <w:rFonts w:eastAsia="Times New Roman" w:cs="Times New Roman"/>
+          <w:szCs w:val="24"/>
+        </w:rPr>
+        <w:t xml:space="preserve"> and make them smart that is they are now also discoverable and controllable from </w:t>
+      </w:r>
+      <w:r>
+        <w:rPr>
+          <w:rFonts w:eastAsia="Times New Roman" w:cs="Times New Roman"/>
+          <w:szCs w:val="24"/>
+        </w:rPr>
+        <w:lastRenderedPageBreak/>
+        <w:t xml:space="preserve">Home Assistant Custom Hardware Consist of A touch panel (for manual control as well) with esp32 at its backend </w:t>
+      </w:r>
+    </w:p>
+    <w:p>
+      <w:pPr>
+        <w:spacing w:before="100" w:beforeAutospacing="1" w:after="100" w:afterAutospacing="1" w:line="240" w:lineRule="auto"/>
+        <w:rPr>
+          <w:rFonts w:eastAsia="Times New Roman" w:cs="Times New Roman"/>
+          <w:szCs w:val="24"/>
+        </w:rPr>
+      </w:pPr>
+      <w:proofErr w:type="gramStart"/>
+      <w:r>
+        <w:rPr>
+          <w:rFonts w:eastAsia="Times New Roman" w:cs="Times New Roman"/>
+          <w:szCs w:val="24"/>
+        </w:rPr>
+        <w:t>ii)</w:t>
+      </w:r>
+      <w:proofErr w:type="gramEnd"/>
+      <w:r>
+        <w:rPr>
+          <w:rFonts w:eastAsia="Times New Roman" w:cs="Times New Roman"/>
+          <w:szCs w:val="24"/>
+        </w:rPr>
+        <w:t>Split ACs:</w:t>
+      </w:r>
+      <w:r>
+        <w:rPr>
+          <w:rFonts w:eastAsia="Times New Roman" w:cs="Times New Roman"/>
+          <w:szCs w:val="24"/>
+        </w:rPr>
+        <w:br/>
+        <w:t xml:space="preserve">Almost all </w:t>
+      </w:r>
+      <w:proofErr w:type="spellStart"/>
+      <w:r>
+        <w:rPr>
+          <w:rFonts w:eastAsia="Times New Roman" w:cs="Times New Roman"/>
+          <w:szCs w:val="24"/>
+        </w:rPr>
+        <w:t>acs</w:t>
+      </w:r>
+      <w:proofErr w:type="spellEnd"/>
+      <w:r>
+        <w:rPr>
+          <w:rFonts w:eastAsia="Times New Roman" w:cs="Times New Roman"/>
+          <w:szCs w:val="24"/>
+        </w:rPr>
+        <w:t xml:space="preserve"> are controlled using </w:t>
+      </w:r>
+      <w:proofErr w:type="spellStart"/>
+      <w:r>
+        <w:rPr>
+          <w:rFonts w:eastAsia="Times New Roman" w:cs="Times New Roman"/>
+          <w:szCs w:val="24"/>
+        </w:rPr>
+        <w:t>ir</w:t>
+      </w:r>
+      <w:proofErr w:type="spellEnd"/>
+      <w:r>
+        <w:rPr>
+          <w:rFonts w:eastAsia="Times New Roman" w:cs="Times New Roman"/>
+          <w:szCs w:val="24"/>
+        </w:rPr>
+        <w:t xml:space="preserve"> remotes. A custom hardware was made </w:t>
+      </w:r>
+      <w:proofErr w:type="spellStart"/>
+      <w:r>
+        <w:rPr>
+          <w:rFonts w:eastAsia="Times New Roman" w:cs="Times New Roman"/>
+          <w:szCs w:val="24"/>
+        </w:rPr>
+        <w:t>consisiting</w:t>
+      </w:r>
+      <w:proofErr w:type="spellEnd"/>
+      <w:r>
+        <w:rPr>
+          <w:rFonts w:eastAsia="Times New Roman" w:cs="Times New Roman"/>
+          <w:szCs w:val="24"/>
+        </w:rPr>
+        <w:t xml:space="preserve"> of a few IR transmitters and esp32 like an IR blaster. This </w:t>
+      </w:r>
+      <w:r>
+        <w:rPr>
+          <w:rFonts w:eastAsia="Times New Roman" w:cs="Times New Roman"/>
+          <w:szCs w:val="24"/>
+        </w:rPr>
+        <w:t>will be installed in any room which contains those ACs (to be controlled) and it will be able to control them wirelessly through home assistant</w:t>
+      </w:r>
+      <w:r>
+        <w:rPr>
+          <w:rFonts w:eastAsia="Times New Roman" w:cs="Times New Roman"/>
+          <w:szCs w:val="24"/>
+        </w:rPr>
+        <w:t>.</w:t>
+      </w:r>
+      <w:r>
+        <w:rPr>
+          <w:rFonts w:eastAsia="Times New Roman" w:cs="Times New Roman"/>
+          <w:szCs w:val="24"/>
+        </w:rPr>
+        <w:br/>
+      </w:r>
+      <w:r>
+        <w:rPr>
+          <w:rFonts w:eastAsia="Times New Roman" w:cs="Times New Roman"/>
+          <w:szCs w:val="24"/>
+        </w:rPr>
+        <w:br/>
+      </w:r>
+      <w:r>
+        <w:rPr>
+          <w:rFonts w:eastAsia="Times New Roman" w:cs="Times New Roman"/>
+          <w:szCs w:val="24"/>
+        </w:rPr>
+        <w:t>ii</w:t>
+      </w:r>
+      <w:r>
+        <w:rPr>
+          <w:rFonts w:eastAsia="Times New Roman" w:cs="Times New Roman"/>
+          <w:szCs w:val="24"/>
+        </w:rPr>
+        <w:t>i</w:t>
+      </w:r>
+      <w:r>
+        <w:rPr>
+          <w:rFonts w:eastAsia="Times New Roman" w:cs="Times New Roman"/>
+          <w:szCs w:val="24"/>
+        </w:rPr>
+        <w:t>)</w:t>
+      </w:r>
+      <w:r>
+        <w:rPr>
+          <w:rFonts w:eastAsia="Times New Roman" w:cs="Times New Roman"/>
+          <w:szCs w:val="24"/>
+        </w:rPr>
+        <w:t xml:space="preserve"> </w:t>
+      </w:r>
+      <w:r>
+        <w:rPr>
+          <w:rFonts w:eastAsia="Times New Roman" w:cs="Times New Roman"/>
+          <w:szCs w:val="24"/>
+        </w:rPr>
+        <w:t>Smart Switches</w:t>
+      </w:r>
+      <w:proofErr w:type="gramStart"/>
+      <w:r>
+        <w:rPr>
+          <w:rFonts w:eastAsia="Times New Roman" w:cs="Times New Roman"/>
+          <w:szCs w:val="24"/>
+        </w:rPr>
+        <w:t>:</w:t>
+      </w:r>
+      <w:proofErr w:type="gramEnd"/>
+      <w:r>
+        <w:rPr>
+          <w:rFonts w:eastAsia="Times New Roman" w:cs="Times New Roman"/>
+          <w:szCs w:val="24"/>
+        </w:rPr>
+        <w:br/>
+        <w:t>Any sort of switch which is already smart can also be controlled from home assistant</w:t>
+      </w:r>
+      <w:r>
+        <w:rPr>
+          <w:rFonts w:eastAsia="Times New Roman" w:cs="Times New Roman"/>
+          <w:szCs w:val="24"/>
+        </w:rPr>
+        <w:br/>
+        <w:t>provided that it has an existing integration in HA</w:t>
+      </w:r>
+      <w:r>
+        <w:rPr>
+          <w:rFonts w:eastAsia="Times New Roman" w:cs="Times New Roman"/>
+          <w:szCs w:val="24"/>
+        </w:rPr>
+        <w:br/>
+      </w:r>
+      <w:r>
+        <w:rPr>
+          <w:rFonts w:eastAsia="Times New Roman" w:cs="Times New Roman"/>
+          <w:szCs w:val="24"/>
+        </w:rPr>
+        <w:br/>
+        <w:t xml:space="preserve">3.  </w:t>
+      </w:r>
+      <w:proofErr w:type="spellStart"/>
+      <w:r>
+        <w:rPr>
+          <w:rFonts w:eastAsia="Times New Roman" w:cs="Times New Roman"/>
+          <w:szCs w:val="24"/>
+        </w:rPr>
+        <w:t>Implimentation</w:t>
+      </w:r>
+      <w:proofErr w:type="spellEnd"/>
+      <w:r>
+        <w:rPr>
+          <w:rFonts w:eastAsia="Times New Roman" w:cs="Times New Roman"/>
+          <w:szCs w:val="24"/>
+        </w:rPr>
+        <w:t xml:space="preserve"> of AI Based Decision making using RAG</w:t>
+      </w:r>
+    </w:p>
+    <w:p>
+      <w:pPr>
+        <w:spacing w:before="100" w:beforeAutospacing="1" w:after="100" w:afterAutospacing="1" w:line="240" w:lineRule="auto"/>
+        <w:rPr>
+          <w:rFonts w:eastAsia="Times New Roman" w:cs="Times New Roman"/>
+          <w:szCs w:val="24"/>
+        </w:rPr>
+      </w:pPr>
+      <w:proofErr w:type="spellStart"/>
+      <w:r>
+        <w:rPr>
+          <w:rFonts w:eastAsia="Times New Roman" w:cs="Times New Roman"/>
+          <w:szCs w:val="24"/>
+        </w:rPr>
+        <w:t>i</w:t>
+      </w:r>
+      <w:proofErr w:type="spellEnd"/>
+      <w:r>
+        <w:rPr>
+          <w:rFonts w:eastAsia="Times New Roman" w:cs="Times New Roman"/>
+          <w:szCs w:val="24"/>
+        </w:rPr>
+        <w:t>)_</w:t>
+      </w:r>
+      <w:proofErr w:type="spellStart"/>
+      <w:r>
+        <w:rPr>
+          <w:rFonts w:eastAsia="Times New Roman" w:cs="Times New Roman"/>
+          <w:szCs w:val="24"/>
+        </w:rPr>
+        <w:t>propriteary</w:t>
+      </w:r>
+      <w:proofErr w:type="spellEnd"/>
+      <w:r>
+        <w:rPr>
+          <w:rFonts w:eastAsia="Times New Roman" w:cs="Times New Roman"/>
+          <w:szCs w:val="24"/>
+        </w:rPr>
+        <w:t xml:space="preserve"> database (which will be converted to vector database using vector embedding)</w:t>
+      </w:r>
+      <w:r>
+        <w:rPr>
+          <w:rFonts w:eastAsia="Times New Roman" w:cs="Times New Roman"/>
+          <w:szCs w:val="24"/>
+        </w:rPr>
+        <w:t xml:space="preserve"> the database is basically decision making conditions</w:t>
+      </w:r>
+      <w:r>
+        <w:rPr>
+          <w:rFonts w:eastAsia="Times New Roman" w:cs="Times New Roman"/>
+          <w:szCs w:val="24"/>
+        </w:rPr>
+        <w:br/>
+        <w:t xml:space="preserve">ii) Real time data coming from inverter will act as query for semantic search in the database (retrieval) which will yield a suitable context from the database </w:t>
+      </w:r>
+    </w:p>
+    <w:p>
+      <w:pPr>
+        <w:spacing w:before="100" w:beforeAutospacing="1" w:after="100" w:afterAutospacing="1" w:line="240" w:lineRule="auto"/>
+        <w:rPr>
+          <w:rFonts w:eastAsia="Times New Roman" w:cs="Times New Roman"/>
+          <w:szCs w:val="24"/>
+        </w:rPr>
+      </w:pPr>
+      <w:r>
+        <w:rPr>
+          <w:rFonts w:eastAsia="Times New Roman" w:cs="Times New Roman"/>
+          <w:szCs w:val="24"/>
+        </w:rPr>
+        <w:t xml:space="preserve">iii) </w:t>
+      </w:r>
+      <w:proofErr w:type="spellStart"/>
+      <w:proofErr w:type="gramStart"/>
+      <w:r>
+        <w:rPr>
+          <w:rFonts w:eastAsia="Times New Roman" w:cs="Times New Roman"/>
+          <w:szCs w:val="24"/>
+        </w:rPr>
+        <w:t>implimetation</w:t>
+      </w:r>
+      <w:proofErr w:type="spellEnd"/>
+      <w:proofErr w:type="gramEnd"/>
+      <w:r>
+        <w:rPr>
+          <w:rFonts w:eastAsia="Times New Roman" w:cs="Times New Roman"/>
+          <w:szCs w:val="24"/>
+        </w:rPr>
+        <w:t xml:space="preserve"> of  local </w:t>
+      </w:r>
+      <w:proofErr w:type="spellStart"/>
+      <w:r>
+        <w:rPr>
+          <w:rFonts w:eastAsia="Times New Roman" w:cs="Times New Roman"/>
+          <w:szCs w:val="24"/>
+        </w:rPr>
+        <w:t>llm</w:t>
+      </w:r>
+      <w:proofErr w:type="spellEnd"/>
+      <w:r>
+        <w:rPr>
+          <w:rFonts w:eastAsia="Times New Roman" w:cs="Times New Roman"/>
+          <w:szCs w:val="24"/>
+        </w:rPr>
+        <w:t xml:space="preserve"> :</w:t>
+      </w:r>
+    </w:p>
+    <w:p>
+      <w:pPr>
+        <w:spacing w:before="100" w:beforeAutospacing="1" w:after="100" w:afterAutospacing="1" w:line="240" w:lineRule="auto"/>
+        <w:rPr>
+          <w:rFonts w:eastAsia="Times New Roman" w:cs="Times New Roman"/>
+          <w:szCs w:val="24"/>
+        </w:rPr>
+      </w:pPr>
+      <w:r>
+        <w:rPr>
+          <w:rFonts w:eastAsia="Times New Roman" w:cs="Times New Roman"/>
+          <w:szCs w:val="24"/>
+        </w:rPr>
+        <w:t xml:space="preserve">It will run on the same machine as HA the context and the query (real time data) will be passed to the </w:t>
+      </w:r>
+      <w:proofErr w:type="spellStart"/>
+      <w:r>
+        <w:rPr>
+          <w:rFonts w:eastAsia="Times New Roman" w:cs="Times New Roman"/>
+          <w:szCs w:val="24"/>
+        </w:rPr>
+        <w:t>llm</w:t>
+      </w:r>
+      <w:proofErr w:type="spellEnd"/>
+      <w:r>
+        <w:rPr>
+          <w:rFonts w:eastAsia="Times New Roman" w:cs="Times New Roman"/>
+          <w:szCs w:val="24"/>
+        </w:rPr>
+        <w:t xml:space="preserve"> (augmentation). The LLM will output two things: a summary based on the real time data and recommended actions (generation) this action will be implementable from HA by pressing a single </w:t>
+      </w:r>
+      <w:r>
+        <w:rPr>
+          <w:rFonts w:eastAsia="Times New Roman" w:cs="Times New Roman"/>
+          <w:szCs w:val="24"/>
+        </w:rPr>
+        <w:t>button</w:t>
+      </w:r>
+      <w:r>
+        <w:rPr>
+          <w:rFonts w:eastAsia="Times New Roman" w:cs="Times New Roman"/>
+          <w:szCs w:val="24"/>
+        </w:rPr>
+        <w:br/>
+      </w:r>
+      <w:r>
+        <w:rPr>
+          <w:rFonts w:eastAsia="Times New Roman" w:cs="Times New Roman"/>
+          <w:szCs w:val="24"/>
+        </w:rPr>
+        <w:br/>
+        <w:t>Results:</w:t>
+      </w:r>
+      <w:r>
+        <w:rPr>
+          <w:rFonts w:eastAsia="Times New Roman" w:cs="Times New Roman"/>
+          <w:szCs w:val="24"/>
+        </w:rPr>
+        <w:t xml:space="preserve"> </w:t>
+      </w:r>
+      <w:proofErr w:type="spellStart"/>
+      <w:r>
+        <w:rPr>
+          <w:rFonts w:eastAsia="Times New Roman" w:cs="Times New Roman"/>
+          <w:szCs w:val="24"/>
+        </w:rPr>
+        <w:t>wrte</w:t>
+      </w:r>
+      <w:proofErr w:type="spellEnd"/>
+      <w:r>
+        <w:rPr>
+          <w:rFonts w:eastAsia="Times New Roman" w:cs="Times New Roman"/>
+          <w:szCs w:val="24"/>
+        </w:rPr>
+        <w:t xml:space="preserve"> at your own</w:t>
+      </w:r>
+      <w:r>
+        <w:rPr>
+          <w:rFonts w:eastAsia="Times New Roman" w:cs="Times New Roman"/>
+          <w:szCs w:val="24"/>
+        </w:rPr>
+        <w:br/>
+        <w:t xml:space="preserve">Discussions: we have commercial solution for now in which only 3 major Loads (HVAC, ACs and smart switches future road map we can give a customized solution for the client all desired loads can be made </w:t>
+      </w:r>
+      <w:proofErr w:type="spellStart"/>
+      <w:r>
+        <w:rPr>
+          <w:rFonts w:eastAsia="Times New Roman" w:cs="Times New Roman"/>
+          <w:szCs w:val="24"/>
+        </w:rPr>
+        <w:t>smart.this</w:t>
+      </w:r>
+      <w:proofErr w:type="spellEnd"/>
+      <w:r>
+        <w:rPr>
+          <w:rFonts w:eastAsia="Times New Roman" w:cs="Times New Roman"/>
+          <w:szCs w:val="24"/>
+        </w:rPr>
+        <w:t xml:space="preserve"> will also include the addition of a smart plug and occupancy sensor both of which have ha integration</w:t>
+      </w:r>
+      <w:r>
+        <w:rPr>
+          <w:rFonts w:eastAsia="Times New Roman" w:cs="Times New Roman"/>
+          <w:szCs w:val="24"/>
+        </w:rPr>
+        <w:t xml:space="preserve">  </w:t>
+      </w:r>
+    </w:p>
+    <w:p>
+      <w:pPr>
+        <w:spacing w:before="100" w:beforeAutospacing="1" w:after="100" w:afterAutospacing="1" w:line="240" w:lineRule="auto"/>
+        <w:rPr>
+          <w:rFonts w:eastAsia="Times New Roman" w:cs="Times New Roman"/>
+          <w:szCs w:val="24"/>
+        </w:rPr>
+      </w:pPr>
+      <w:r>
+        <w:rPr>
+          <w:rFonts w:eastAsia="Times New Roman" w:cs="Times New Roman"/>
+          <w:szCs w:val="24"/>
+        </w:rPr>
+        <w:br/>
+      </w:r>
+    </w:p>
+    <w:p>
+      <w:pPr>
+        <w:spacing w:before="100" w:beforeAutospacing="1" w:after="100" w:afterAutospacing="1" w:line="240" w:lineRule="auto"/>
+        <w:rPr>
+          <w:rFonts w:eastAsia="Times New Roman" w:cs="Times New Roman"/>
+          <w:szCs w:val="24"/>
+        </w:rPr>
+      </w:pPr>
+      <w:r>
+        <w:rPr>
+          <w:rFonts w:eastAsia="Times New Roman" w:cs="Times New Roman"/>
+          <w:szCs w:val="24"/>
+        </w:rPr>
+        <w:br/>
+      </w:r>
+      <w:r>
+        <w:rPr>
+          <w:rFonts w:eastAsia="Times New Roman" w:cs="Times New Roman"/>
+          <w:szCs w:val="24"/>
+        </w:rPr>
+        <w:br/>
+      </w:r>
     </w:p>
     <w:p/>
     <w:p/>
@@ -5867,7 +7278,7 @@
           <w:rPr>
             <w:noProof/>
           </w:rPr>
-          <w:t>8</w:t>
+          <w:t>6</w:t>
         </w:r>
         <w:r>
           <w:rPr>
@@ -6507,6 +7918,119 @@
     </w:lvl>
   </w:abstractNum>
   <w:abstractNum w:abstractNumId="10">
+    <w:nsid w:val="3F920D04"/>
+    <w:multiLevelType w:val="multilevel"/>
+    <w:tmpl w:val="007E4742"/>
+    <w:lvl w:ilvl="0">
+      <w:start w:val="1"/>
+      <w:numFmt w:val="decimal"/>
+      <w:lvlText w:val="%1."/>
+      <w:lvlJc w:val="left"/>
+      <w:pPr>
+        <w:tabs>
+          <w:tab w:val="num" w:pos="720"/>
+        </w:tabs>
+        <w:ind w:left="720" w:hanging="360"/>
+      </w:pPr>
+    </w:lvl>
+    <w:lvl w:ilvl="1" w:tentative="1">
+      <w:start w:val="1"/>
+      <w:numFmt w:val="decimal"/>
+      <w:lvlText w:val="%2."/>
+      <w:lvlJc w:val="left"/>
+      <w:pPr>
+        <w:tabs>
+          <w:tab w:val="num" w:pos="1440"/>
+        </w:tabs>
+        <w:ind w:left="1440" w:hanging="360"/>
+      </w:pPr>
+    </w:lvl>
+    <w:lvl w:ilvl="2" w:tentative="1">
+      <w:start w:val="1"/>
+      <w:numFmt w:val="decimal"/>
+      <w:lvlText w:val="%3."/>
+      <w:lvlJc w:val="left"/>
+      <w:pPr>
+        <w:tabs>
+          <w:tab w:val="num" w:pos="2160"/>
+        </w:tabs>
+        <w:ind w:left="2160" w:hanging="360"/>
+      </w:pPr>
+    </w:lvl>
+    <w:lvl w:ilvl="3" w:tentative="1">
+      <w:start w:val="1"/>
+      <w:numFmt w:val="decimal"/>
+      <w:lvlText w:val="%4."/>
+      <w:lvlJc w:val="left"/>
+      <w:pPr>
+        <w:tabs>
+          <w:tab w:val="num" w:pos="2880"/>
+        </w:tabs>
+        <w:ind w:left="2880" w:hanging="360"/>
+      </w:pPr>
+    </w:lvl>
+    <w:lvl w:ilvl="4" w:tentative="1">
+      <w:start w:val="1"/>
+      <w:numFmt w:val="decimal"/>
+      <w:lvlText w:val="%5."/>
+      <w:lvlJc w:val="left"/>
+      <w:pPr>
+        <w:tabs>
+          <w:tab w:val="num" w:pos="3600"/>
+        </w:tabs>
+        <w:ind w:left="3600" w:hanging="360"/>
+      </w:pPr>
+    </w:lvl>
+    <w:lvl w:ilvl="5" w:tentative="1">
+      <w:start w:val="1"/>
+      <w:numFmt w:val="decimal"/>
+      <w:lvlText w:val="%6."/>
+      <w:lvlJc w:val="left"/>
+      <w:pPr>
+        <w:tabs>
+          <w:tab w:val="num" w:pos="4320"/>
+        </w:tabs>
+        <w:ind w:left="4320" w:hanging="360"/>
+      </w:pPr>
+    </w:lvl>
+    <w:lvl w:ilvl="6" w:tentative="1">
+      <w:start w:val="1"/>
+      <w:numFmt w:val="decimal"/>
+      <w:lvlText w:val="%7."/>
+      <w:lvlJc w:val="left"/>
+      <w:pPr>
+        <w:tabs>
+          <w:tab w:val="num" w:pos="5040"/>
+        </w:tabs>
+        <w:ind w:left="5040" w:hanging="360"/>
+      </w:pPr>
+    </w:lvl>
+    <w:lvl w:ilvl="7" w:tentative="1">
+      <w:start w:val="1"/>
+      <w:numFmt w:val="decimal"/>
+      <w:lvlText w:val="%8."/>
+      <w:lvlJc w:val="left"/>
+      <w:pPr>
+        <w:tabs>
+          <w:tab w:val="num" w:pos="5760"/>
+        </w:tabs>
+        <w:ind w:left="5760" w:hanging="360"/>
+      </w:pPr>
+    </w:lvl>
+    <w:lvl w:ilvl="8" w:tentative="1">
+      <w:start w:val="1"/>
+      <w:numFmt w:val="decimal"/>
+      <w:lvlText w:val="%9."/>
+      <w:lvlJc w:val="left"/>
+      <w:pPr>
+        <w:tabs>
+          <w:tab w:val="num" w:pos="6480"/>
+        </w:tabs>
+        <w:ind w:left="6480" w:hanging="360"/>
+      </w:pPr>
+    </w:lvl>
+  </w:abstractNum>
+  <w:abstractNum w:abstractNumId="11">
     <w:nsid w:val="41E12850"/>
     <w:multiLevelType w:val="multilevel"/>
     <w:tmpl w:val="8DC68B80"/>
@@ -6655,7 +8179,7 @@
       </w:rPr>
     </w:lvl>
   </w:abstractNum>
-  <w:abstractNum w:abstractNumId="11">
+  <w:abstractNum w:abstractNumId="12">
     <w:nsid w:val="42334D90"/>
     <w:multiLevelType w:val="hybridMultilevel"/>
     <w:tmpl w:val="8AD225D8"/>
@@ -6744,7 +8268,7 @@
       </w:pPr>
     </w:lvl>
   </w:abstractNum>
-  <w:abstractNum w:abstractNumId="12">
+  <w:abstractNum w:abstractNumId="13">
     <w:nsid w:val="4FE95623"/>
     <w:multiLevelType w:val="multilevel"/>
     <w:tmpl w:val="6AA00ECE"/>
@@ -6861,7 +8385,7 @@
       </w:pPr>
     </w:lvl>
   </w:abstractNum>
-  <w:abstractNum w:abstractNumId="13">
+  <w:abstractNum w:abstractNumId="14">
     <w:nsid w:val="4FEA0B46"/>
     <w:multiLevelType w:val="multilevel"/>
     <w:tmpl w:val="3D3A236C"/>
@@ -7010,7 +8534,7 @@
       </w:rPr>
     </w:lvl>
   </w:abstractNum>
-  <w:abstractNum w:abstractNumId="14">
+  <w:abstractNum w:abstractNumId="15">
     <w:nsid w:val="610B3A49"/>
     <w:multiLevelType w:val="multilevel"/>
     <w:tmpl w:val="9B1CF134"/>
@@ -7159,7 +8683,7 @@
       </w:rPr>
     </w:lvl>
   </w:abstractNum>
-  <w:abstractNum w:abstractNumId="15">
+  <w:abstractNum w:abstractNumId="16">
     <w:nsid w:val="696B0B06"/>
     <w:multiLevelType w:val="multilevel"/>
     <w:tmpl w:val="390A94B8"/>
@@ -7308,7 +8832,7 @@
       </w:rPr>
     </w:lvl>
   </w:abstractNum>
-  <w:abstractNum w:abstractNumId="16">
+  <w:abstractNum w:abstractNumId="17">
     <w:nsid w:val="6C554E36"/>
     <w:multiLevelType w:val="multilevel"/>
     <w:tmpl w:val="498C15BE"/>
@@ -7457,7 +8981,7 @@
       </w:rPr>
     </w:lvl>
   </w:abstractNum>
-  <w:abstractNum w:abstractNumId="17">
+  <w:abstractNum w:abstractNumId="18">
     <w:nsid w:val="6C9853AE"/>
     <w:multiLevelType w:val="multilevel"/>
     <w:tmpl w:val="0A70BE6E"/>
@@ -7606,10 +9130,10 @@
       </w:rPr>
     </w:lvl>
   </w:abstractNum>
-  <w:abstractNum w:abstractNumId="18">
+  <w:abstractNum w:abstractNumId="19">
     <w:nsid w:val="72045464"/>
     <w:multiLevelType w:val="multilevel"/>
-    <w:tmpl w:val="A1AA8176"/>
+    <w:tmpl w:val="BDA4CAF0"/>
     <w:lvl w:ilvl="0">
       <w:start w:val="1"/>
       <w:numFmt w:val="bullet"/>
@@ -7626,20 +9150,16 @@
         <w:sz w:val="20"/>
       </w:rPr>
     </w:lvl>
-    <w:lvl w:ilvl="1" w:tentative="1">
+    <w:lvl w:ilvl="1">
       <w:start w:val="1"/>
-      <w:numFmt w:val="bullet"/>
-      <w:lvlText w:val="o"/>
+      <w:numFmt w:val="decimal"/>
+      <w:lvlText w:val="%2."/>
       <w:lvlJc w:val="left"/>
       <w:pPr>
-        <w:tabs>
-          <w:tab w:val="num" w:pos="1440"/>
-        </w:tabs>
         <w:ind w:left="1440" w:hanging="360"/>
       </w:pPr>
       <w:rPr>
-        <w:rFonts w:ascii="Courier New" w:hAnsi="Courier New" w:hint="default"/>
-        <w:sz w:val="20"/>
+        <w:rFonts w:hint="default"/>
       </w:rPr>
     </w:lvl>
     <w:lvl w:ilvl="2" w:tentative="1">
@@ -7755,7 +9275,120 @@
       </w:rPr>
     </w:lvl>
   </w:abstractNum>
-  <w:abstractNum w:abstractNumId="19">
+  <w:abstractNum w:abstractNumId="20">
+    <w:nsid w:val="7D98020E"/>
+    <w:multiLevelType w:val="multilevel"/>
+    <w:tmpl w:val="DE52B460"/>
+    <w:lvl w:ilvl="0">
+      <w:start w:val="1"/>
+      <w:numFmt w:val="decimal"/>
+      <w:lvlText w:val="%1."/>
+      <w:lvlJc w:val="left"/>
+      <w:pPr>
+        <w:tabs>
+          <w:tab w:val="num" w:pos="720"/>
+        </w:tabs>
+        <w:ind w:left="720" w:hanging="360"/>
+      </w:pPr>
+    </w:lvl>
+    <w:lvl w:ilvl="1" w:tentative="1">
+      <w:start w:val="1"/>
+      <w:numFmt w:val="decimal"/>
+      <w:lvlText w:val="%2."/>
+      <w:lvlJc w:val="left"/>
+      <w:pPr>
+        <w:tabs>
+          <w:tab w:val="num" w:pos="1440"/>
+        </w:tabs>
+        <w:ind w:left="1440" w:hanging="360"/>
+      </w:pPr>
+    </w:lvl>
+    <w:lvl w:ilvl="2" w:tentative="1">
+      <w:start w:val="1"/>
+      <w:numFmt w:val="decimal"/>
+      <w:lvlText w:val="%3."/>
+      <w:lvlJc w:val="left"/>
+      <w:pPr>
+        <w:tabs>
+          <w:tab w:val="num" w:pos="2160"/>
+        </w:tabs>
+        <w:ind w:left="2160" w:hanging="360"/>
+      </w:pPr>
+    </w:lvl>
+    <w:lvl w:ilvl="3" w:tentative="1">
+      <w:start w:val="1"/>
+      <w:numFmt w:val="decimal"/>
+      <w:lvlText w:val="%4."/>
+      <w:lvlJc w:val="left"/>
+      <w:pPr>
+        <w:tabs>
+          <w:tab w:val="num" w:pos="2880"/>
+        </w:tabs>
+        <w:ind w:left="2880" w:hanging="360"/>
+      </w:pPr>
+    </w:lvl>
+    <w:lvl w:ilvl="4" w:tentative="1">
+      <w:start w:val="1"/>
+      <w:numFmt w:val="decimal"/>
+      <w:lvlText w:val="%5."/>
+      <w:lvlJc w:val="left"/>
+      <w:pPr>
+        <w:tabs>
+          <w:tab w:val="num" w:pos="3600"/>
+        </w:tabs>
+        <w:ind w:left="3600" w:hanging="360"/>
+      </w:pPr>
+    </w:lvl>
+    <w:lvl w:ilvl="5" w:tentative="1">
+      <w:start w:val="1"/>
+      <w:numFmt w:val="decimal"/>
+      <w:lvlText w:val="%6."/>
+      <w:lvlJc w:val="left"/>
+      <w:pPr>
+        <w:tabs>
+          <w:tab w:val="num" w:pos="4320"/>
+        </w:tabs>
+        <w:ind w:left="4320" w:hanging="360"/>
+      </w:pPr>
+    </w:lvl>
+    <w:lvl w:ilvl="6" w:tentative="1">
+      <w:start w:val="1"/>
+      <w:numFmt w:val="decimal"/>
+      <w:lvlText w:val="%7."/>
+      <w:lvlJc w:val="left"/>
+      <w:pPr>
+        <w:tabs>
+          <w:tab w:val="num" w:pos="5040"/>
+        </w:tabs>
+        <w:ind w:left="5040" w:hanging="360"/>
+      </w:pPr>
+    </w:lvl>
+    <w:lvl w:ilvl="7" w:tentative="1">
+      <w:start w:val="1"/>
+      <w:numFmt w:val="decimal"/>
+      <w:lvlText w:val="%8."/>
+      <w:lvlJc w:val="left"/>
+      <w:pPr>
+        <w:tabs>
+          <w:tab w:val="num" w:pos="5760"/>
+        </w:tabs>
+        <w:ind w:left="5760" w:hanging="360"/>
+      </w:pPr>
+    </w:lvl>
+    <w:lvl w:ilvl="8" w:tentative="1">
+      <w:start w:val="1"/>
+      <w:numFmt w:val="decimal"/>
+      <w:lvlText w:val="%9."/>
+      <w:lvlJc w:val="left"/>
+      <w:pPr>
+        <w:tabs>
+          <w:tab w:val="num" w:pos="6480"/>
+        </w:tabs>
+        <w:ind w:left="6480" w:hanging="360"/>
+      </w:pPr>
+    </w:lvl>
+  </w:abstractNum>
+  <w:abstractNum w:abstractNumId="21">
     <w:nsid w:val="7E9C71E4"/>
     <w:multiLevelType w:val="multilevel"/>
     <w:tmpl w:val="2708D3CA"/>
@@ -7926,43 +9559,49 @@
     <w:abstractNumId w:val="6"/>
   </w:num>
   <w:num w:numId="8">
-    <w:abstractNumId w:val="11"/>
+    <w:abstractNumId w:val="12"/>
   </w:num>
   <w:num w:numId="9">
     <w:abstractNumId w:val="9"/>
   </w:num>
   <w:num w:numId="10">
-    <w:abstractNumId w:val="14"/>
+    <w:abstractNumId w:val="15"/>
   </w:num>
   <w:num w:numId="11">
-    <w:abstractNumId w:val="10"/>
+    <w:abstractNumId w:val="11"/>
   </w:num>
   <w:num w:numId="12">
     <w:abstractNumId w:val="7"/>
   </w:num>
   <w:num w:numId="13">
-    <w:abstractNumId w:val="16"/>
+    <w:abstractNumId w:val="17"/>
   </w:num>
   <w:num w:numId="14">
     <w:abstractNumId w:val="8"/>
   </w:num>
   <w:num w:numId="15">
-    <w:abstractNumId w:val="17"/>
+    <w:abstractNumId w:val="18"/>
   </w:num>
   <w:num w:numId="16">
+    <w:abstractNumId w:val="21"/>
+  </w:num>
+  <w:num w:numId="17">
+    <w:abstractNumId w:val="13"/>
+  </w:num>
+  <w:num w:numId="18">
+    <w:abstractNumId w:val="16"/>
+  </w:num>
+  <w:num w:numId="19">
     <w:abstractNumId w:val="19"/>
   </w:num>
-  <w:num w:numId="17">
-    <w:abstractNumId w:val="12"/>
+  <w:num w:numId="20">
+    <w:abstractNumId w:val="14"/>
   </w:num>
-  <w:num w:numId="18">
-    <w:abstractNumId w:val="15"/>
+  <w:num w:numId="21">
+    <w:abstractNumId w:val="20"/>
   </w:num>
-  <w:num w:numId="19">
-    <w:abstractNumId w:val="18"/>
-  </w:num>
-  <w:num w:numId="20">
-    <w:abstractNumId w:val="13"/>
+  <w:num w:numId="22">
+    <w:abstractNumId w:val="10"/>
   </w:num>
   <w:numIdMacAtCleanup w:val="9"/>
 </w:numbering>
@@ -8569,7 +10208,6 @@
   <w:style w:type="character" w:default="1" w:styleId="DefaultParagraphFont">
     <w:name w:val="Default Paragraph Font"/>
     <w:uiPriority w:val="1"/>
-    <w:semiHidden/>
     <w:unhideWhenUsed/>
   </w:style>
   <w:style w:type="table" w:default="1" w:styleId="TableNormal">
@@ -20736,7 +22374,7 @@
 </file>
 
 <file path=customXml/itemProps1.xml><?xml version="1.0" encoding="utf-8"?>
-<ds:datastoreItem xmlns:ds="http://schemas.openxmlformats.org/officeDocument/2006/customXml" ds:itemID="{03ADD32F-0182-4B52-A3EE-ECBAF6F26595}">
+<ds:datastoreItem xmlns:ds="http://schemas.openxmlformats.org/officeDocument/2006/customXml" ds:itemID="{FC629CD1-217B-4AB5-972B-5C82F3404A9D}">
   <ds:schemaRefs>
     <ds:schemaRef ds:uri="http://schemas.openxmlformats.org/officeDocument/2006/bibliography"/>
   </ds:schemaRefs>

</xml_diff>

<commit_message>
ICRAI papers added only
</commit_message>
<xml_diff>
--- a/FYP Documents/fyp_thesis.docx
+++ b/FYP Documents/fyp_thesis.docx
@@ -1184,21 +1184,12 @@
           <w:szCs w:val="26"/>
         </w:rPr>
       </w:pPr>
-      <w:proofErr w:type="gramStart"/>
       <w:r>
         <w:rPr>
           <w:sz w:val="26"/>
           <w:szCs w:val="26"/>
         </w:rPr>
-        <w:t>in</w:t>
-      </w:r>
-      <w:proofErr w:type="gramEnd"/>
-      <w:r>
-        <w:rPr>
-          <w:sz w:val="26"/>
-          <w:szCs w:val="26"/>
-        </w:rPr>
-        <w:t xml:space="preserve"> partial fulfillment of the requirements</w:t>
+        <w:t>in partial fulfillment of the requirements</w:t>
       </w:r>
     </w:p>
     <w:p>
@@ -1402,35 +1393,14 @@
       <w:r>
         <w:t xml:space="preserve">Dr. </w:t>
       </w:r>
-      <w:proofErr w:type="spellStart"/>
-      <w:r>
-        <w:t>Zaki</w:t>
-      </w:r>
-      <w:proofErr w:type="spellEnd"/>
-      <w:r>
-        <w:t xml:space="preserve"> </w:t>
-      </w:r>
-      <w:proofErr w:type="spellStart"/>
-      <w:r>
-        <w:t>Ud</w:t>
-      </w:r>
-      <w:proofErr w:type="spellEnd"/>
-      <w:r>
-        <w:t xml:space="preserve"> Din</w:t>
+      <w:r>
+        <w:t>Zaki Ud Din</w:t>
       </w:r>
       <w:r>
         <w:t xml:space="preserve">                                             </w:t>
       </w:r>
       <w:r>
-        <w:t xml:space="preserve">                              M. Ahmed </w:t>
-      </w:r>
-      <w:proofErr w:type="spellStart"/>
-      <w:r>
-        <w:t>Hussain</w:t>
-      </w:r>
-      <w:proofErr w:type="spellEnd"/>
-      <w:r>
-        <w:t xml:space="preserve"> Babar</w:t>
+        <w:t xml:space="preserve">                              M. Ahmed Hussain Babar</w:t>
       </w:r>
     </w:p>
     <w:p>
@@ -1446,19 +1416,9 @@
       <w:r>
         <w:t xml:space="preserve"> </w:t>
       </w:r>
-      <w:proofErr w:type="spellStart"/>
-      <w:r>
-        <w:t>Zohaib</w:t>
-      </w:r>
-      <w:proofErr w:type="spellEnd"/>
-      <w:r>
-        <w:t xml:space="preserve"> </w:t>
-      </w:r>
-      <w:proofErr w:type="spellStart"/>
-      <w:r>
-        <w:t>Riaz</w:t>
-      </w:r>
-      <w:proofErr w:type="spellEnd"/>
+      <w:r>
+        <w:t>Zohaib Riaz</w:t>
+      </w:r>
       <w:r>
         <w:tab/>
       </w:r>
@@ -1476,33 +1436,15 @@
       </w:r>
       <w:r>
         <w:tab/>
-        <w:t xml:space="preserve">     Abdul </w:t>
-      </w:r>
-      <w:proofErr w:type="spellStart"/>
-      <w:r>
-        <w:t>Haseeb</w:t>
-      </w:r>
-      <w:proofErr w:type="spellEnd"/>
-      <w:r>
-        <w:t xml:space="preserve"> </w:t>
-      </w:r>
-      <w:proofErr w:type="spellStart"/>
-      <w:r>
-        <w:t>Zahid</w:t>
-      </w:r>
-      <w:proofErr w:type="spellEnd"/>
+        <w:t xml:space="preserve">     Abdul Haseeb Zahid</w:t>
+      </w:r>
     </w:p>
     <w:p>
       <w:pPr>
         <w:spacing w:after="0"/>
       </w:pPr>
-      <w:proofErr w:type="spellStart"/>
-      <w:r>
-        <w:t>Engr</w:t>
-      </w:r>
-      <w:proofErr w:type="spellEnd"/>
-      <w:r>
-        <w:t xml:space="preserve"> Mustafa</w:t>
+      <w:r>
+        <w:t>Engr Mustafa</w:t>
       </w:r>
       <w:r>
         <w:t xml:space="preserve"> Aziz</w:t>
@@ -1668,7 +1610,6 @@
         </w:rPr>
         <w:br/>
       </w:r>
-      <w:proofErr w:type="gramStart"/>
       <w:r>
         <w:rPr>
           <w:rFonts w:eastAsia="Times New Roman" w:cs="Times New Roman"/>
@@ -1690,25 +1631,15 @@
           <w:rFonts w:eastAsia="Times New Roman" w:cs="Times New Roman"/>
           <w:szCs w:val="24"/>
         </w:rPr>
-        <w:t>..............................</w:t>
-      </w:r>
-      <w:proofErr w:type="gramEnd"/>
+        <w:t xml:space="preserve">.............................. </w:t>
+      </w:r>
       <w:r>
         <w:rPr>
           <w:rFonts w:eastAsia="Times New Roman" w:cs="Times New Roman"/>
           <w:szCs w:val="24"/>
         </w:rPr>
-        <w:t xml:space="preserve"> </w:t>
-      </w:r>
-      <w:proofErr w:type="gramStart"/>
-      <w:r>
-        <w:rPr>
-          <w:rFonts w:eastAsia="Times New Roman" w:cs="Times New Roman"/>
-          <w:szCs w:val="24"/>
-        </w:rPr>
         <w:t>v</w:t>
       </w:r>
-      <w:proofErr w:type="gramEnd"/>
       <w:r>
         <w:rPr>
           <w:rFonts w:eastAsia="Times New Roman" w:cs="Times New Roman"/>
@@ -1730,17 +1661,8 @@
           <w:rFonts w:eastAsia="Times New Roman" w:cs="Times New Roman"/>
           <w:szCs w:val="24"/>
         </w:rPr>
-        <w:t xml:space="preserve"> ................................................................. </w:t>
-      </w:r>
-      <w:proofErr w:type="gramStart"/>
-      <w:r>
-        <w:rPr>
-          <w:rFonts w:eastAsia="Times New Roman" w:cs="Times New Roman"/>
-          <w:szCs w:val="24"/>
-        </w:rPr>
-        <w:t>vi</w:t>
-      </w:r>
-      <w:proofErr w:type="gramEnd"/>
+        <w:t xml:space="preserve"> ................................................................. vi</w:t>
+      </w:r>
       <w:r>
         <w:rPr>
           <w:rFonts w:eastAsia="Times New Roman" w:cs="Times New Roman"/>
@@ -1762,17 +1684,8 @@
           <w:rFonts w:eastAsia="Times New Roman" w:cs="Times New Roman"/>
           <w:szCs w:val="24"/>
         </w:rPr>
-        <w:t xml:space="preserve"> ................................................................. </w:t>
-      </w:r>
-      <w:proofErr w:type="gramStart"/>
-      <w:r>
-        <w:rPr>
-          <w:rFonts w:eastAsia="Times New Roman" w:cs="Times New Roman"/>
-          <w:szCs w:val="24"/>
-        </w:rPr>
-        <w:t>vii</w:t>
-      </w:r>
-      <w:proofErr w:type="gramEnd"/>
+        <w:t xml:space="preserve"> ................................................................. vii</w:t>
+      </w:r>
       <w:r>
         <w:rPr>
           <w:rFonts w:eastAsia="Times New Roman" w:cs="Times New Roman"/>
@@ -1794,17 +1707,8 @@
           <w:rFonts w:eastAsia="Times New Roman" w:cs="Times New Roman"/>
           <w:szCs w:val="24"/>
         </w:rPr>
-        <w:t xml:space="preserve"> .............................................................. </w:t>
-      </w:r>
-      <w:proofErr w:type="gramStart"/>
-      <w:r>
-        <w:rPr>
-          <w:rFonts w:eastAsia="Times New Roman" w:cs="Times New Roman"/>
-          <w:szCs w:val="24"/>
-        </w:rPr>
-        <w:t>viii</w:t>
-      </w:r>
-      <w:proofErr w:type="gramEnd"/>
+        <w:t xml:space="preserve"> .............................................................. viii</w:t>
+      </w:r>
       <w:r>
         <w:rPr>
           <w:rFonts w:eastAsia="Times New Roman" w:cs="Times New Roman"/>
@@ -1862,9 +1766,95 @@
           <w:bCs/>
           <w:szCs w:val="24"/>
         </w:rPr>
-        <w:t xml:space="preserve">Chapter 1 – </w:t>
-      </w:r>
-      <w:proofErr w:type="gramStart"/>
+        <w:t>Chapter 1 – Introduction</w:t>
+      </w:r>
+      <w:r>
+        <w:rPr>
+          <w:rFonts w:eastAsia="Times New Roman" w:cs="Times New Roman"/>
+          <w:szCs w:val="24"/>
+        </w:rPr>
+        <w:t xml:space="preserve"> .................................................. 1</w:t>
+      </w:r>
+      <w:r>
+        <w:rPr>
+          <w:rFonts w:eastAsia="Times New Roman" w:cs="Times New Roman"/>
+          <w:szCs w:val="24"/>
+        </w:rPr>
+        <w:br/>
+        <w:t>1.1 Background ................................................................ 1</w:t>
+      </w:r>
+      <w:r>
+        <w:rPr>
+          <w:rFonts w:eastAsia="Times New Roman" w:cs="Times New Roman"/>
+          <w:szCs w:val="24"/>
+        </w:rPr>
+        <w:br/>
+        <w:t>1.2 Problem Statement .......................</w:t>
+      </w:r>
+      <w:r>
+        <w:rPr>
+          <w:rFonts w:eastAsia="Times New Roman" w:cs="Times New Roman"/>
+          <w:szCs w:val="24"/>
+        </w:rPr>
+        <w:t>.............................. 1</w:t>
+      </w:r>
+      <w:r>
+        <w:rPr>
+          <w:rFonts w:eastAsia="Times New Roman" w:cs="Times New Roman"/>
+          <w:szCs w:val="24"/>
+        </w:rPr>
+        <w:br/>
+        <w:t>1.3 Objectives ....................................</w:t>
+      </w:r>
+      <w:r>
+        <w:rPr>
+          <w:rFonts w:eastAsia="Times New Roman" w:cs="Times New Roman"/>
+          <w:szCs w:val="24"/>
+        </w:rPr>
+        <w:t>.............................. 1</w:t>
+      </w:r>
+      <w:r>
+        <w:rPr>
+          <w:rFonts w:eastAsia="Times New Roman" w:cs="Times New Roman"/>
+          <w:szCs w:val="24"/>
+        </w:rPr>
+        <w:br/>
+        <w:t>1.4 Scope of Work ............................</w:t>
+      </w:r>
+      <w:r>
+        <w:rPr>
+          <w:rFonts w:eastAsia="Times New Roman" w:cs="Times New Roman"/>
+          <w:szCs w:val="24"/>
+        </w:rPr>
+        <w:t>.............................. 2</w:t>
+      </w:r>
+    </w:p>
+    <w:p>
+      <w:pPr>
+        <w:spacing w:after="0" w:line="240" w:lineRule="auto"/>
+        <w:rPr>
+          <w:rFonts w:eastAsia="Times New Roman" w:cs="Times New Roman"/>
+          <w:szCs w:val="24"/>
+        </w:rPr>
+      </w:pPr>
+      <w:r>
+        <w:rPr>
+          <w:rFonts w:eastAsia="Times New Roman" w:cs="Times New Roman"/>
+          <w:szCs w:val="24"/>
+        </w:rPr>
+        <w:pict w14:anchorId="7E3063DC">
+          <v:rect id="_x0000_i1026" style="width:0;height:1.5pt" o:hralign="center" o:hrstd="t" o:hr="t" fillcolor="#a0a0a0" stroked="f"/>
+        </w:pict>
+      </w:r>
+    </w:p>
+    <w:p>
+      <w:pPr>
+        <w:spacing w:before="100" w:beforeAutospacing="1" w:after="100" w:afterAutospacing="1" w:line="240" w:lineRule="auto"/>
+        <w:rPr>
+          <w:rFonts w:eastAsia="Times New Roman" w:cs="Times New Roman"/>
+          <w:szCs w:val="24"/>
+        </w:rPr>
+      </w:pPr>
       <w:r>
         <w:rPr>
           <w:rFonts w:eastAsia="Times New Roman" w:cs="Times New Roman"/>
@@ -1872,22 +1862,21 @@
           <w:bCs/>
           <w:szCs w:val="24"/>
         </w:rPr>
-        <w:t>Introduction</w:t>
+        <w:t>Chapter 2 – Background Literature</w:t>
       </w:r>
       <w:r>
         <w:rPr>
           <w:rFonts w:eastAsia="Times New Roman" w:cs="Times New Roman"/>
           <w:szCs w:val="24"/>
         </w:rPr>
-        <w:t xml:space="preserve"> ..................................................</w:t>
-      </w:r>
-      <w:proofErr w:type="gramEnd"/>
+        <w:t xml:space="preserve"> ...</w:t>
+      </w:r>
       <w:r>
         <w:rPr>
           <w:rFonts w:eastAsia="Times New Roman" w:cs="Times New Roman"/>
           <w:szCs w:val="24"/>
         </w:rPr>
-        <w:t xml:space="preserve"> 1</w:t>
+        <w:t>.............................. 3</w:t>
       </w:r>
       <w:r>
         <w:rPr>
@@ -1895,68 +1884,337 @@
           <w:szCs w:val="24"/>
         </w:rPr>
         <w:br/>
-        <w:t>1.1 Background ................................................................ 1</w:t>
+        <w:t>2.1 Types of Conventional Solar Microgri</w:t>
       </w:r>
       <w:r>
         <w:rPr>
           <w:rFonts w:eastAsia="Times New Roman" w:cs="Times New Roman"/>
           <w:szCs w:val="24"/>
         </w:rPr>
+        <w:t>d Systems .................... 3</w:t>
+      </w:r>
+      <w:r>
+        <w:rPr>
+          <w:rFonts w:eastAsia="Times New Roman" w:cs="Times New Roman"/>
+          <w:szCs w:val="24"/>
+        </w:rPr>
         <w:br/>
-        <w:t xml:space="preserve">1.2 Problem </w:t>
-      </w:r>
-      <w:proofErr w:type="gramStart"/>
+      </w:r>
       <w:r>
         <w:rPr>
           <w:rFonts w:eastAsia="Times New Roman" w:cs="Times New Roman"/>
           <w:szCs w:val="24"/>
         </w:rPr>
-        <w:t>Statement .......................</w:t>
+        <w:t> </w:t>
       </w:r>
       <w:r>
         <w:rPr>
           <w:rFonts w:eastAsia="Times New Roman" w:cs="Times New Roman"/>
           <w:szCs w:val="24"/>
         </w:rPr>
-        <w:t>..............................</w:t>
-      </w:r>
-      <w:proofErr w:type="gramEnd"/>
+        <w:t> </w:t>
+      </w:r>
       <w:r>
         <w:rPr>
           <w:rFonts w:eastAsia="Times New Roman" w:cs="Times New Roman"/>
           <w:szCs w:val="24"/>
         </w:rPr>
-        <w:t xml:space="preserve"> 1</w:t>
+        <w:t>2.1.1 Off-Grid Microgrid Systems ..........</w:t>
       </w:r>
       <w:r>
         <w:rPr>
           <w:rFonts w:eastAsia="Times New Roman" w:cs="Times New Roman"/>
           <w:szCs w:val="24"/>
         </w:rPr>
+        <w:t>.............................. 3</w:t>
+      </w:r>
+      <w:r>
+        <w:rPr>
+          <w:rFonts w:eastAsia="Times New Roman" w:cs="Times New Roman"/>
+          <w:szCs w:val="24"/>
+        </w:rPr>
         <w:br/>
-        <w:t>1.3 Objectives ....................................</w:t>
       </w:r>
       <w:r>
         <w:rPr>
           <w:rFonts w:eastAsia="Times New Roman" w:cs="Times New Roman"/>
           <w:szCs w:val="24"/>
         </w:rPr>
-        <w:t>.............................. 1</w:t>
+        <w:t> </w:t>
       </w:r>
       <w:r>
         <w:rPr>
           <w:rFonts w:eastAsia="Times New Roman" w:cs="Times New Roman"/>
           <w:szCs w:val="24"/>
         </w:rPr>
+        <w:t> </w:t>
+      </w:r>
+      <w:r>
+        <w:rPr>
+          <w:rFonts w:eastAsia="Times New Roman" w:cs="Times New Roman"/>
+          <w:szCs w:val="24"/>
+        </w:rPr>
+        <w:t>2.1.2 On-Grid Microgrid Systems ..........</w:t>
+      </w:r>
+      <w:r>
+        <w:rPr>
+          <w:rFonts w:eastAsia="Times New Roman" w:cs="Times New Roman"/>
+          <w:szCs w:val="24"/>
+        </w:rPr>
+        <w:t>.............................. 3</w:t>
+      </w:r>
+      <w:r>
+        <w:rPr>
+          <w:rFonts w:eastAsia="Times New Roman" w:cs="Times New Roman"/>
+          <w:szCs w:val="24"/>
+        </w:rPr>
         <w:br/>
-        <w:t>1.4 Scope of Work ............................</w:t>
       </w:r>
       <w:r>
         <w:rPr>
           <w:rFonts w:eastAsia="Times New Roman" w:cs="Times New Roman"/>
           <w:szCs w:val="24"/>
         </w:rPr>
-        <w:t>.............................. 2</w:t>
+        <w:t> </w:t>
+      </w:r>
+      <w:r>
+        <w:rPr>
+          <w:rFonts w:eastAsia="Times New Roman" w:cs="Times New Roman"/>
+          <w:szCs w:val="24"/>
+        </w:rPr>
+        <w:t> </w:t>
+      </w:r>
+      <w:r>
+        <w:rPr>
+          <w:rFonts w:eastAsia="Times New Roman" w:cs="Times New Roman"/>
+          <w:szCs w:val="24"/>
+        </w:rPr>
+        <w:t>2.1.3 Hybrid Microgrid Systems ............</w:t>
+      </w:r>
+      <w:r>
+        <w:rPr>
+          <w:rFonts w:eastAsia="Times New Roman" w:cs="Times New Roman"/>
+          <w:szCs w:val="24"/>
+        </w:rPr>
+        <w:t>.............................. 4</w:t>
+      </w:r>
+      <w:r>
+        <w:rPr>
+          <w:rFonts w:eastAsia="Times New Roman" w:cs="Times New Roman"/>
+          <w:szCs w:val="24"/>
+        </w:rPr>
+        <w:br/>
+        <w:t>2.2 Communication Protocols for Solar Invert</w:t>
+      </w:r>
+      <w:r>
+        <w:rPr>
+          <w:rFonts w:eastAsia="Times New Roman" w:cs="Times New Roman"/>
+          <w:szCs w:val="24"/>
+        </w:rPr>
+        <w:t>ers .......................... 4</w:t>
+      </w:r>
+      <w:r>
+        <w:rPr>
+          <w:rFonts w:eastAsia="Times New Roman" w:cs="Times New Roman"/>
+          <w:szCs w:val="24"/>
+        </w:rPr>
+        <w:br/>
+      </w:r>
+      <w:r>
+        <w:rPr>
+          <w:rFonts w:eastAsia="Times New Roman" w:cs="Times New Roman"/>
+          <w:szCs w:val="24"/>
+        </w:rPr>
+        <w:t> </w:t>
+      </w:r>
+      <w:r>
+        <w:rPr>
+          <w:rFonts w:eastAsia="Times New Roman" w:cs="Times New Roman"/>
+          <w:szCs w:val="24"/>
+        </w:rPr>
+        <w:t> </w:t>
+      </w:r>
+      <w:r>
+        <w:rPr>
+          <w:rFonts w:eastAsia="Times New Roman" w:cs="Times New Roman"/>
+          <w:szCs w:val="24"/>
+        </w:rPr>
+        <w:t xml:space="preserve">2.2.1 Three-Layer Communication Model </w:t>
+      </w:r>
+      <w:r>
+        <w:rPr>
+          <w:rFonts w:eastAsia="Times New Roman" w:cs="Times New Roman"/>
+          <w:szCs w:val="24"/>
+        </w:rPr>
+        <w:t>............................. 4</w:t>
+      </w:r>
+      <w:r>
+        <w:rPr>
+          <w:rFonts w:eastAsia="Times New Roman" w:cs="Times New Roman"/>
+          <w:szCs w:val="24"/>
+        </w:rPr>
+        <w:br/>
+      </w:r>
+      <w:r>
+        <w:rPr>
+          <w:rFonts w:eastAsia="Times New Roman" w:cs="Times New Roman"/>
+          <w:szCs w:val="24"/>
+        </w:rPr>
+        <w:t> </w:t>
+      </w:r>
+      <w:r>
+        <w:rPr>
+          <w:rFonts w:eastAsia="Times New Roman" w:cs="Times New Roman"/>
+          <w:szCs w:val="24"/>
+        </w:rPr>
+        <w:t> </w:t>
+      </w:r>
+      <w:r>
+        <w:rPr>
+          <w:rFonts w:eastAsia="Times New Roman" w:cs="Times New Roman"/>
+          <w:szCs w:val="24"/>
+        </w:rPr>
+        <w:t>2.2.2 Common Protocols for Solar Inverte</w:t>
+      </w:r>
+      <w:r>
+        <w:rPr>
+          <w:rFonts w:eastAsia="Times New Roman" w:cs="Times New Roman"/>
+          <w:szCs w:val="24"/>
+        </w:rPr>
+        <w:t>rs .......................... 5</w:t>
+      </w:r>
+      <w:r>
+        <w:rPr>
+          <w:rFonts w:eastAsia="Times New Roman" w:cs="Times New Roman"/>
+          <w:szCs w:val="24"/>
+        </w:rPr>
+        <w:br/>
+      </w:r>
+      <w:r>
+        <w:rPr>
+          <w:rFonts w:eastAsia="Times New Roman" w:cs="Times New Roman"/>
+          <w:szCs w:val="24"/>
+        </w:rPr>
+        <w:t> </w:t>
+      </w:r>
+      <w:r>
+        <w:rPr>
+          <w:rFonts w:eastAsia="Times New Roman" w:cs="Times New Roman"/>
+          <w:szCs w:val="24"/>
+        </w:rPr>
+        <w:t> </w:t>
+      </w:r>
+      <w:r>
+        <w:rPr>
+          <w:rFonts w:eastAsia="Times New Roman" w:cs="Times New Roman"/>
+          <w:szCs w:val="24"/>
+        </w:rPr>
+        <w:t>2.2.3 Relevance to the Proposed System .</w:t>
+      </w:r>
+      <w:r>
+        <w:rPr>
+          <w:rFonts w:eastAsia="Times New Roman" w:cs="Times New Roman"/>
+          <w:szCs w:val="24"/>
+        </w:rPr>
+        <w:t>............................. 6</w:t>
+      </w:r>
+      <w:r>
+        <w:rPr>
+          <w:rFonts w:eastAsia="Times New Roman" w:cs="Times New Roman"/>
+          <w:szCs w:val="24"/>
+        </w:rPr>
+        <w:br/>
+      </w:r>
+      <w:r>
+        <w:rPr>
+          <w:rFonts w:eastAsia="Times New Roman" w:cs="Times New Roman"/>
+          <w:szCs w:val="24"/>
+        </w:rPr>
+        <w:t> </w:t>
+      </w:r>
+      <w:r>
+        <w:rPr>
+          <w:rFonts w:eastAsia="Times New Roman" w:cs="Times New Roman"/>
+          <w:szCs w:val="24"/>
+        </w:rPr>
+        <w:t> </w:t>
+      </w:r>
+      <w:r>
+        <w:rPr>
+          <w:rFonts w:eastAsia="Times New Roman" w:cs="Times New Roman"/>
+          <w:szCs w:val="24"/>
+        </w:rPr>
+        <w:t>2.2.4 HVAC Communication Protocols .............................</w:t>
+      </w:r>
+      <w:r>
+        <w:rPr>
+          <w:rFonts w:eastAsia="Times New Roman" w:cs="Times New Roman"/>
+          <w:szCs w:val="24"/>
+        </w:rPr>
+        <w:t>..... 6</w:t>
+      </w:r>
+      <w:r>
+        <w:rPr>
+          <w:rFonts w:eastAsia="Times New Roman" w:cs="Times New Roman"/>
+          <w:szCs w:val="24"/>
+        </w:rPr>
+        <w:br/>
+      </w:r>
+      <w:r>
+        <w:rPr>
+          <w:rFonts w:eastAsia="Times New Roman" w:cs="Times New Roman"/>
+          <w:szCs w:val="24"/>
+        </w:rPr>
+        <w:t> </w:t>
+      </w:r>
+      <w:r>
+        <w:rPr>
+          <w:rFonts w:eastAsia="Times New Roman" w:cs="Times New Roman"/>
+          <w:szCs w:val="24"/>
+        </w:rPr>
+        <w:t> </w:t>
+      </w:r>
+      <w:r>
+        <w:rPr>
+          <w:rFonts w:eastAsia="Times New Roman" w:cs="Times New Roman"/>
+          <w:szCs w:val="24"/>
+        </w:rPr>
+        <w:t>2.2.5 IR Protocols for Split ACs .............</w:t>
+      </w:r>
+      <w:r>
+        <w:rPr>
+          <w:rFonts w:eastAsia="Times New Roman" w:cs="Times New Roman"/>
+          <w:szCs w:val="24"/>
+        </w:rPr>
+        <w:t>............................. 6</w:t>
+      </w:r>
+      <w:r>
+        <w:rPr>
+          <w:rFonts w:eastAsia="Times New Roman" w:cs="Times New Roman"/>
+          <w:szCs w:val="24"/>
+        </w:rPr>
+        <w:br/>
+      </w:r>
+      <w:r>
+        <w:rPr>
+          <w:rFonts w:eastAsia="Times New Roman" w:cs="Times New Roman"/>
+          <w:szCs w:val="24"/>
+        </w:rPr>
+        <w:t>2.3</w:t>
+      </w:r>
+      <w:r>
+        <w:rPr>
+          <w:rFonts w:eastAsia="Times New Roman" w:cs="Times New Roman"/>
+          <w:szCs w:val="24"/>
+        </w:rPr>
+        <w:t xml:space="preserve"> Home Assistant Custom Integration</w:t>
+      </w:r>
+      <w:r>
+        <w:rPr>
+          <w:rFonts w:eastAsia="Times New Roman" w:cs="Times New Roman"/>
+          <w:szCs w:val="24"/>
+        </w:rPr>
+        <w:t xml:space="preserve"> ............................ 6</w:t>
       </w:r>
     </w:p>
     <w:p>
@@ -1972,8 +2230,8 @@
           <w:rFonts w:eastAsia="Times New Roman" w:cs="Times New Roman"/>
           <w:szCs w:val="24"/>
         </w:rPr>
-        <w:pict w14:anchorId="7E3063DC">
-          <v:rect id="_x0000_i1026" style="width:0;height:1.5pt" o:hralign="center" o:hrstd="t" o:hr="t" fillcolor="#a0a0a0" stroked="f"/>
+        <w:pict w14:anchorId="2173F6C5">
+          <v:rect id="_x0000_i1027" style="width:0;height:1.5pt" o:hralign="center" o:hrstd="t" o:hr="t" fillcolor="#a0a0a0" stroked="f"/>
         </w:pict>
       </w:r>
     </w:p>
@@ -1992,546 +2250,21 @@
           <w:bCs/>
           <w:szCs w:val="24"/>
         </w:rPr>
-        <w:t>Chapter 2 – Background Literature</w:t>
+        <w:t>References</w:t>
       </w:r>
       <w:r>
         <w:rPr>
           <w:rFonts w:eastAsia="Times New Roman" w:cs="Times New Roman"/>
           <w:szCs w:val="24"/>
         </w:rPr>
-        <w:t xml:space="preserve"> ...</w:t>
+        <w:t xml:space="preserve"> .............................................</w:t>
       </w:r>
       <w:r>
         <w:rPr>
           <w:rFonts w:eastAsia="Times New Roman" w:cs="Times New Roman"/>
           <w:szCs w:val="24"/>
         </w:rPr>
-        <w:t>.............................. 3</w:t>
-      </w:r>
-      <w:r>
-        <w:rPr>
-          <w:rFonts w:eastAsia="Times New Roman" w:cs="Times New Roman"/>
-          <w:szCs w:val="24"/>
-        </w:rPr>
-        <w:br/>
-        <w:t xml:space="preserve">2.1 Types of Conventional Solar </w:t>
-      </w:r>
-      <w:proofErr w:type="spellStart"/>
-      <w:r>
-        <w:rPr>
-          <w:rFonts w:eastAsia="Times New Roman" w:cs="Times New Roman"/>
-          <w:szCs w:val="24"/>
-        </w:rPr>
-        <w:t>Microgri</w:t>
-      </w:r>
-      <w:r>
-        <w:rPr>
-          <w:rFonts w:eastAsia="Times New Roman" w:cs="Times New Roman"/>
-          <w:szCs w:val="24"/>
-        </w:rPr>
-        <w:t>d</w:t>
-      </w:r>
-      <w:proofErr w:type="spellEnd"/>
-      <w:r>
-        <w:rPr>
-          <w:rFonts w:eastAsia="Times New Roman" w:cs="Times New Roman"/>
-          <w:szCs w:val="24"/>
-        </w:rPr>
-        <w:t xml:space="preserve"> </w:t>
-      </w:r>
-      <w:proofErr w:type="gramStart"/>
-      <w:r>
-        <w:rPr>
-          <w:rFonts w:eastAsia="Times New Roman" w:cs="Times New Roman"/>
-          <w:szCs w:val="24"/>
-        </w:rPr>
-        <w:t>Systems ....................</w:t>
-      </w:r>
-      <w:proofErr w:type="gramEnd"/>
-      <w:r>
-        <w:rPr>
-          <w:rFonts w:eastAsia="Times New Roman" w:cs="Times New Roman"/>
-          <w:szCs w:val="24"/>
-        </w:rPr>
-        <w:t xml:space="preserve"> 3</w:t>
-      </w:r>
-      <w:r>
-        <w:rPr>
-          <w:rFonts w:eastAsia="Times New Roman" w:cs="Times New Roman"/>
-          <w:szCs w:val="24"/>
-        </w:rPr>
-        <w:br/>
-      </w:r>
-      <w:r>
-        <w:rPr>
-          <w:rFonts w:eastAsia="Times New Roman" w:cs="Times New Roman"/>
-          <w:szCs w:val="24"/>
-        </w:rPr>
-        <w:t> </w:t>
-      </w:r>
-      <w:r>
-        <w:rPr>
-          <w:rFonts w:eastAsia="Times New Roman" w:cs="Times New Roman"/>
-          <w:szCs w:val="24"/>
-        </w:rPr>
-        <w:t> </w:t>
-      </w:r>
-      <w:r>
-        <w:rPr>
-          <w:rFonts w:eastAsia="Times New Roman" w:cs="Times New Roman"/>
-          <w:szCs w:val="24"/>
-        </w:rPr>
-        <w:t xml:space="preserve">2.1.1 Off-Grid </w:t>
-      </w:r>
-      <w:proofErr w:type="spellStart"/>
-      <w:r>
-        <w:rPr>
-          <w:rFonts w:eastAsia="Times New Roman" w:cs="Times New Roman"/>
-          <w:szCs w:val="24"/>
-        </w:rPr>
-        <w:t>Microgrid</w:t>
-      </w:r>
-      <w:proofErr w:type="spellEnd"/>
-      <w:r>
-        <w:rPr>
-          <w:rFonts w:eastAsia="Times New Roman" w:cs="Times New Roman"/>
-          <w:szCs w:val="24"/>
-        </w:rPr>
-        <w:t xml:space="preserve"> Systems ..........</w:t>
-      </w:r>
-      <w:r>
-        <w:rPr>
-          <w:rFonts w:eastAsia="Times New Roman" w:cs="Times New Roman"/>
-          <w:szCs w:val="24"/>
-        </w:rPr>
-        <w:t>.............................. 3</w:t>
-      </w:r>
-      <w:r>
-        <w:rPr>
-          <w:rFonts w:eastAsia="Times New Roman" w:cs="Times New Roman"/>
-          <w:szCs w:val="24"/>
-        </w:rPr>
-        <w:br/>
-      </w:r>
-      <w:r>
-        <w:rPr>
-          <w:rFonts w:eastAsia="Times New Roman" w:cs="Times New Roman"/>
-          <w:szCs w:val="24"/>
-        </w:rPr>
-        <w:t> </w:t>
-      </w:r>
-      <w:r>
-        <w:rPr>
-          <w:rFonts w:eastAsia="Times New Roman" w:cs="Times New Roman"/>
-          <w:szCs w:val="24"/>
-        </w:rPr>
-        <w:t> </w:t>
-      </w:r>
-      <w:r>
-        <w:rPr>
-          <w:rFonts w:eastAsia="Times New Roman" w:cs="Times New Roman"/>
-          <w:szCs w:val="24"/>
-        </w:rPr>
-        <w:t xml:space="preserve">2.1.2 On-Grid </w:t>
-      </w:r>
-      <w:proofErr w:type="spellStart"/>
-      <w:r>
-        <w:rPr>
-          <w:rFonts w:eastAsia="Times New Roman" w:cs="Times New Roman"/>
-          <w:szCs w:val="24"/>
-        </w:rPr>
-        <w:t>Microgrid</w:t>
-      </w:r>
-      <w:proofErr w:type="spellEnd"/>
-      <w:r>
-        <w:rPr>
-          <w:rFonts w:eastAsia="Times New Roman" w:cs="Times New Roman"/>
-          <w:szCs w:val="24"/>
-        </w:rPr>
-        <w:t xml:space="preserve"> Systems ..........</w:t>
-      </w:r>
-      <w:r>
-        <w:rPr>
-          <w:rFonts w:eastAsia="Times New Roman" w:cs="Times New Roman"/>
-          <w:szCs w:val="24"/>
-        </w:rPr>
-        <w:t>.............................. 3</w:t>
-      </w:r>
-      <w:r>
-        <w:rPr>
-          <w:rFonts w:eastAsia="Times New Roman" w:cs="Times New Roman"/>
-          <w:szCs w:val="24"/>
-        </w:rPr>
-        <w:br/>
-      </w:r>
-      <w:r>
-        <w:rPr>
-          <w:rFonts w:eastAsia="Times New Roman" w:cs="Times New Roman"/>
-          <w:szCs w:val="24"/>
-        </w:rPr>
-        <w:t> </w:t>
-      </w:r>
-      <w:r>
-        <w:rPr>
-          <w:rFonts w:eastAsia="Times New Roman" w:cs="Times New Roman"/>
-          <w:szCs w:val="24"/>
-        </w:rPr>
-        <w:t> </w:t>
-      </w:r>
-      <w:r>
-        <w:rPr>
-          <w:rFonts w:eastAsia="Times New Roman" w:cs="Times New Roman"/>
-          <w:szCs w:val="24"/>
-        </w:rPr>
-        <w:t xml:space="preserve">2.1.3 Hybrid </w:t>
-      </w:r>
-      <w:proofErr w:type="spellStart"/>
-      <w:r>
-        <w:rPr>
-          <w:rFonts w:eastAsia="Times New Roman" w:cs="Times New Roman"/>
-          <w:szCs w:val="24"/>
-        </w:rPr>
-        <w:t>Microgrid</w:t>
-      </w:r>
-      <w:proofErr w:type="spellEnd"/>
-      <w:r>
-        <w:rPr>
-          <w:rFonts w:eastAsia="Times New Roman" w:cs="Times New Roman"/>
-          <w:szCs w:val="24"/>
-        </w:rPr>
-        <w:t xml:space="preserve"> Systems ............</w:t>
-      </w:r>
-      <w:r>
-        <w:rPr>
-          <w:rFonts w:eastAsia="Times New Roman" w:cs="Times New Roman"/>
-          <w:szCs w:val="24"/>
-        </w:rPr>
-        <w:t>.............................. 4</w:t>
-      </w:r>
-      <w:r>
-        <w:rPr>
-          <w:rFonts w:eastAsia="Times New Roman" w:cs="Times New Roman"/>
-          <w:szCs w:val="24"/>
-        </w:rPr>
-        <w:br/>
-        <w:t xml:space="preserve">2.2 Communication Protocols for Solar </w:t>
-      </w:r>
-      <w:proofErr w:type="gramStart"/>
-      <w:r>
-        <w:rPr>
-          <w:rFonts w:eastAsia="Times New Roman" w:cs="Times New Roman"/>
-          <w:szCs w:val="24"/>
-        </w:rPr>
-        <w:t>Invert</w:t>
-      </w:r>
-      <w:r>
-        <w:rPr>
-          <w:rFonts w:eastAsia="Times New Roman" w:cs="Times New Roman"/>
-          <w:szCs w:val="24"/>
-        </w:rPr>
-        <w:t>ers ..........................</w:t>
-      </w:r>
-      <w:proofErr w:type="gramEnd"/>
-      <w:r>
-        <w:rPr>
-          <w:rFonts w:eastAsia="Times New Roman" w:cs="Times New Roman"/>
-          <w:szCs w:val="24"/>
-        </w:rPr>
-        <w:t xml:space="preserve"> 4</w:t>
-      </w:r>
-      <w:r>
-        <w:rPr>
-          <w:rFonts w:eastAsia="Times New Roman" w:cs="Times New Roman"/>
-          <w:szCs w:val="24"/>
-        </w:rPr>
-        <w:br/>
-      </w:r>
-      <w:r>
-        <w:rPr>
-          <w:rFonts w:eastAsia="Times New Roman" w:cs="Times New Roman"/>
-          <w:szCs w:val="24"/>
-        </w:rPr>
-        <w:t> </w:t>
-      </w:r>
-      <w:r>
-        <w:rPr>
-          <w:rFonts w:eastAsia="Times New Roman" w:cs="Times New Roman"/>
-          <w:szCs w:val="24"/>
-        </w:rPr>
-        <w:t> </w:t>
-      </w:r>
-      <w:r>
-        <w:rPr>
-          <w:rFonts w:eastAsia="Times New Roman" w:cs="Times New Roman"/>
-          <w:szCs w:val="24"/>
-        </w:rPr>
-        <w:t xml:space="preserve">2.2.1 Three-Layer Communication </w:t>
-      </w:r>
-      <w:proofErr w:type="gramStart"/>
-      <w:r>
-        <w:rPr>
-          <w:rFonts w:eastAsia="Times New Roman" w:cs="Times New Roman"/>
-          <w:szCs w:val="24"/>
-        </w:rPr>
-        <w:t xml:space="preserve">Model </w:t>
-      </w:r>
-      <w:r>
-        <w:rPr>
-          <w:rFonts w:eastAsia="Times New Roman" w:cs="Times New Roman"/>
-          <w:szCs w:val="24"/>
-        </w:rPr>
-        <w:t>.............................</w:t>
-      </w:r>
-      <w:proofErr w:type="gramEnd"/>
-      <w:r>
-        <w:rPr>
-          <w:rFonts w:eastAsia="Times New Roman" w:cs="Times New Roman"/>
-          <w:szCs w:val="24"/>
-        </w:rPr>
-        <w:t xml:space="preserve"> 4</w:t>
-      </w:r>
-      <w:r>
-        <w:rPr>
-          <w:rFonts w:eastAsia="Times New Roman" w:cs="Times New Roman"/>
-          <w:szCs w:val="24"/>
-        </w:rPr>
-        <w:br/>
-      </w:r>
-      <w:r>
-        <w:rPr>
-          <w:rFonts w:eastAsia="Times New Roman" w:cs="Times New Roman"/>
-          <w:szCs w:val="24"/>
-        </w:rPr>
-        <w:t> </w:t>
-      </w:r>
-      <w:r>
-        <w:rPr>
-          <w:rFonts w:eastAsia="Times New Roman" w:cs="Times New Roman"/>
-          <w:szCs w:val="24"/>
-        </w:rPr>
-        <w:t> </w:t>
-      </w:r>
-      <w:r>
-        <w:rPr>
-          <w:rFonts w:eastAsia="Times New Roman" w:cs="Times New Roman"/>
-          <w:szCs w:val="24"/>
-        </w:rPr>
-        <w:t xml:space="preserve">2.2.2 Common Protocols for Solar </w:t>
-      </w:r>
-      <w:proofErr w:type="gramStart"/>
-      <w:r>
-        <w:rPr>
-          <w:rFonts w:eastAsia="Times New Roman" w:cs="Times New Roman"/>
-          <w:szCs w:val="24"/>
-        </w:rPr>
-        <w:t>Inverte</w:t>
-      </w:r>
-      <w:r>
-        <w:rPr>
-          <w:rFonts w:eastAsia="Times New Roman" w:cs="Times New Roman"/>
-          <w:szCs w:val="24"/>
-        </w:rPr>
-        <w:t>rs ..........................</w:t>
-      </w:r>
-      <w:proofErr w:type="gramEnd"/>
-      <w:r>
-        <w:rPr>
-          <w:rFonts w:eastAsia="Times New Roman" w:cs="Times New Roman"/>
-          <w:szCs w:val="24"/>
-        </w:rPr>
-        <w:t xml:space="preserve"> 5</w:t>
-      </w:r>
-      <w:r>
-        <w:rPr>
-          <w:rFonts w:eastAsia="Times New Roman" w:cs="Times New Roman"/>
-          <w:szCs w:val="24"/>
-        </w:rPr>
-        <w:br/>
-      </w:r>
-      <w:r>
-        <w:rPr>
-          <w:rFonts w:eastAsia="Times New Roman" w:cs="Times New Roman"/>
-          <w:szCs w:val="24"/>
-        </w:rPr>
-        <w:t> </w:t>
-      </w:r>
-      <w:r>
-        <w:rPr>
-          <w:rFonts w:eastAsia="Times New Roman" w:cs="Times New Roman"/>
-          <w:szCs w:val="24"/>
-        </w:rPr>
-        <w:t> </w:t>
-      </w:r>
-      <w:r>
-        <w:rPr>
-          <w:rFonts w:eastAsia="Times New Roman" w:cs="Times New Roman"/>
-          <w:szCs w:val="24"/>
-        </w:rPr>
-        <w:t>2.2.3 Relevance to the Proposed System .</w:t>
-      </w:r>
-      <w:r>
-        <w:rPr>
-          <w:rFonts w:eastAsia="Times New Roman" w:cs="Times New Roman"/>
-          <w:szCs w:val="24"/>
-        </w:rPr>
-        <w:t>............................. 6</w:t>
-      </w:r>
-      <w:r>
-        <w:rPr>
-          <w:rFonts w:eastAsia="Times New Roman" w:cs="Times New Roman"/>
-          <w:szCs w:val="24"/>
-        </w:rPr>
-        <w:br/>
-      </w:r>
-      <w:r>
-        <w:rPr>
-          <w:rFonts w:eastAsia="Times New Roman" w:cs="Times New Roman"/>
-          <w:szCs w:val="24"/>
-        </w:rPr>
-        <w:t> </w:t>
-      </w:r>
-      <w:r>
-        <w:rPr>
-          <w:rFonts w:eastAsia="Times New Roman" w:cs="Times New Roman"/>
-          <w:szCs w:val="24"/>
-        </w:rPr>
-        <w:t> </w:t>
-      </w:r>
-      <w:r>
-        <w:rPr>
-          <w:rFonts w:eastAsia="Times New Roman" w:cs="Times New Roman"/>
-          <w:szCs w:val="24"/>
-        </w:rPr>
-        <w:t>2.2.4 HVAC Communication Protocols .............................</w:t>
-      </w:r>
-      <w:r>
-        <w:rPr>
-          <w:rFonts w:eastAsia="Times New Roman" w:cs="Times New Roman"/>
-          <w:szCs w:val="24"/>
-        </w:rPr>
-        <w:t>..... 6</w:t>
-      </w:r>
-      <w:r>
-        <w:rPr>
-          <w:rFonts w:eastAsia="Times New Roman" w:cs="Times New Roman"/>
-          <w:szCs w:val="24"/>
-        </w:rPr>
-        <w:br/>
-      </w:r>
-      <w:r>
-        <w:rPr>
-          <w:rFonts w:eastAsia="Times New Roman" w:cs="Times New Roman"/>
-          <w:szCs w:val="24"/>
-        </w:rPr>
-        <w:t> </w:t>
-      </w:r>
-      <w:r>
-        <w:rPr>
-          <w:rFonts w:eastAsia="Times New Roman" w:cs="Times New Roman"/>
-          <w:szCs w:val="24"/>
-        </w:rPr>
-        <w:t> </w:t>
-      </w:r>
-      <w:r>
-        <w:rPr>
-          <w:rFonts w:eastAsia="Times New Roman" w:cs="Times New Roman"/>
-          <w:szCs w:val="24"/>
-        </w:rPr>
-        <w:t>2.2.5 IR Protocols for Split ACs .............</w:t>
-      </w:r>
-      <w:r>
-        <w:rPr>
-          <w:rFonts w:eastAsia="Times New Roman" w:cs="Times New Roman"/>
-          <w:szCs w:val="24"/>
-        </w:rPr>
-        <w:t>............................. 6</w:t>
-      </w:r>
-      <w:r>
-        <w:rPr>
-          <w:rFonts w:eastAsia="Times New Roman" w:cs="Times New Roman"/>
-          <w:szCs w:val="24"/>
-        </w:rPr>
-        <w:br/>
-      </w:r>
-      <w:r>
-        <w:rPr>
-          <w:rFonts w:eastAsia="Times New Roman" w:cs="Times New Roman"/>
-          <w:szCs w:val="24"/>
-        </w:rPr>
-        <w:t>2.3</w:t>
-      </w:r>
-      <w:r>
-        <w:rPr>
-          <w:rFonts w:eastAsia="Times New Roman" w:cs="Times New Roman"/>
-          <w:szCs w:val="24"/>
-        </w:rPr>
-        <w:t xml:space="preserve"> Home Assistant Custom Integration</w:t>
-      </w:r>
-      <w:r>
-        <w:rPr>
-          <w:rFonts w:eastAsia="Times New Roman" w:cs="Times New Roman"/>
-          <w:szCs w:val="24"/>
-        </w:rPr>
-        <w:t xml:space="preserve"> ............................ 6</w:t>
-      </w:r>
-    </w:p>
-    <w:p>
-      <w:pPr>
-        <w:spacing w:after="0" w:line="240" w:lineRule="auto"/>
-        <w:rPr>
-          <w:rFonts w:eastAsia="Times New Roman" w:cs="Times New Roman"/>
-          <w:szCs w:val="24"/>
-        </w:rPr>
-      </w:pPr>
-      <w:r>
-        <w:rPr>
-          <w:rFonts w:eastAsia="Times New Roman" w:cs="Times New Roman"/>
-          <w:szCs w:val="24"/>
-        </w:rPr>
-        <w:pict w14:anchorId="2173F6C5">
-          <v:rect id="_x0000_i1027" style="width:0;height:1.5pt" o:hralign="center" o:hrstd="t" o:hr="t" fillcolor="#a0a0a0" stroked="f"/>
-        </w:pict>
-      </w:r>
-    </w:p>
-    <w:p>
-      <w:pPr>
-        <w:spacing w:before="100" w:beforeAutospacing="1" w:after="100" w:afterAutospacing="1" w:line="240" w:lineRule="auto"/>
-        <w:rPr>
-          <w:rFonts w:eastAsia="Times New Roman" w:cs="Times New Roman"/>
-          <w:szCs w:val="24"/>
-        </w:rPr>
-      </w:pPr>
-      <w:proofErr w:type="gramStart"/>
-      <w:r>
-        <w:rPr>
-          <w:rFonts w:eastAsia="Times New Roman" w:cs="Times New Roman"/>
-          <w:b/>
-          <w:bCs/>
-          <w:szCs w:val="24"/>
-        </w:rPr>
-        <w:t>References</w:t>
-      </w:r>
-      <w:r>
-        <w:rPr>
-          <w:rFonts w:eastAsia="Times New Roman" w:cs="Times New Roman"/>
-          <w:szCs w:val="24"/>
-        </w:rPr>
-        <w:t xml:space="preserve"> .............................................</w:t>
-      </w:r>
-      <w:r>
-        <w:rPr>
-          <w:rFonts w:eastAsia="Times New Roman" w:cs="Times New Roman"/>
-          <w:szCs w:val="24"/>
-        </w:rPr>
-        <w:t>....................</w:t>
-      </w:r>
-      <w:proofErr w:type="gramEnd"/>
-      <w:r>
-        <w:rPr>
-          <w:rFonts w:eastAsia="Times New Roman" w:cs="Times New Roman"/>
-          <w:szCs w:val="24"/>
-        </w:rPr>
-        <w:t xml:space="preserve"> 8</w:t>
+        <w:t>.................... 8</w:t>
       </w:r>
     </w:p>
     <w:p>
@@ -2648,241 +2381,123 @@
           <w:bCs/>
           <w:szCs w:val="24"/>
         </w:rPr>
-        <w:t xml:space="preserve">Dr. </w:t>
-      </w:r>
-      <w:proofErr w:type="spellStart"/>
+        <w:t>Dr. Zaki Ud Din</w:t>
+      </w:r>
+      <w:r>
+        <w:rPr>
+          <w:szCs w:val="24"/>
+        </w:rPr>
+        <w:t xml:space="preserve"> (University Supervisor) and </w:t>
+      </w:r>
       <w:r>
         <w:rPr>
           <w:b/>
           <w:bCs/>
           <w:szCs w:val="24"/>
         </w:rPr>
-        <w:t>Zaki</w:t>
-      </w:r>
-      <w:proofErr w:type="spellEnd"/>
+        <w:t>Engr. Mustafa Aziz</w:t>
+      </w:r>
+      <w:r>
+        <w:rPr>
+          <w:szCs w:val="24"/>
+        </w:rPr>
+        <w:t xml:space="preserve"> (Industry Supervisor), for their continuous guidance, encouragement, and valuable supervision throughout the course of this project. Their expert knowledge, constructive feedback, and insightful suggestions were instrumental in helping us overcome challenges and in shaping this work into its present form.</w:t>
+      </w:r>
+    </w:p>
+    <w:p>
+      <w:pPr>
+        <w:spacing w:line="360" w:lineRule="auto"/>
+        <w:jc w:val="both"/>
+        <w:rPr>
+          <w:szCs w:val="24"/>
+        </w:rPr>
+      </w:pPr>
+      <w:r>
+        <w:rPr>
+          <w:szCs w:val="24"/>
+        </w:rPr>
+        <w:t xml:space="preserve">We are also deeply thankful to </w:t>
+      </w:r>
       <w:r>
         <w:rPr>
           <w:b/>
           <w:bCs/>
           <w:szCs w:val="24"/>
         </w:rPr>
-        <w:t xml:space="preserve"> </w:t>
-      </w:r>
-      <w:proofErr w:type="spellStart"/>
+        <w:t>Dr. Zohaib Riaz</w:t>
+      </w:r>
+      <w:r>
+        <w:rPr>
+          <w:szCs w:val="24"/>
+        </w:rPr>
+        <w:t xml:space="preserve"> for his kind support and valuable input, which helped us refine our approach and strengthen the technical aspects of the project.</w:t>
+      </w:r>
+    </w:p>
+    <w:p>
+      <w:pPr>
+        <w:spacing w:line="360" w:lineRule="auto"/>
+        <w:jc w:val="both"/>
+        <w:rPr>
+          <w:szCs w:val="24"/>
+        </w:rPr>
+      </w:pPr>
+      <w:r>
+        <w:rPr>
+          <w:szCs w:val="24"/>
+        </w:rPr>
+        <w:t xml:space="preserve">We would like to acknowledge the facilities and resources provided by the </w:t>
+      </w:r>
       <w:r>
         <w:rPr>
           <w:b/>
           <w:bCs/>
           <w:szCs w:val="24"/>
         </w:rPr>
-        <w:t>Ud</w:t>
-      </w:r>
-      <w:proofErr w:type="spellEnd"/>
+        <w:t>Department of Mechatronics Engineering, College of Electrical and Mechanical Engineering (CEME), National University of Sciences and Technology (NUST)</w:t>
+      </w:r>
+      <w:r>
+        <w:rPr>
+          <w:szCs w:val="24"/>
+        </w:rPr>
+        <w:t>, which allowed us to conduct our research and implement our proposed system effectively.</w:t>
+      </w:r>
+    </w:p>
+    <w:p>
+      <w:pPr>
+        <w:spacing w:line="360" w:lineRule="auto"/>
+        <w:jc w:val="both"/>
+        <w:rPr>
+          <w:szCs w:val="24"/>
+        </w:rPr>
+      </w:pPr>
+      <w:r>
+        <w:rPr>
+          <w:szCs w:val="24"/>
+        </w:rPr>
+        <w:t>Special thanks are due to our families and friends for their continuous encouragement, moral support, and prayers throughout this journey. Their patience and understanding have been a constant source of motivation.</w:t>
+      </w:r>
+    </w:p>
+    <w:p>
+      <w:pPr>
+        <w:spacing w:line="360" w:lineRule="auto"/>
+        <w:jc w:val="both"/>
+        <w:rPr>
+          <w:szCs w:val="24"/>
+        </w:rPr>
+      </w:pPr>
+      <w:r>
+        <w:rPr>
+          <w:szCs w:val="24"/>
+        </w:rPr>
+        <w:t xml:space="preserve">Finally, we gratefully recognize the teamwork, dedication, and commitment of all group members — </w:t>
+      </w:r>
       <w:r>
         <w:rPr>
           <w:b/>
           <w:bCs/>
           <w:szCs w:val="24"/>
         </w:rPr>
-        <w:t xml:space="preserve"> Din</w:t>
-      </w:r>
-      <w:r>
-        <w:rPr>
-          <w:szCs w:val="24"/>
-        </w:rPr>
-        <w:t xml:space="preserve"> (University Supervisor) and </w:t>
-      </w:r>
-      <w:r>
-        <w:rPr>
-          <w:b/>
-          <w:bCs/>
-          <w:szCs w:val="24"/>
-        </w:rPr>
-        <w:t>Engr. Mustafa Aziz</w:t>
-      </w:r>
-      <w:r>
-        <w:rPr>
-          <w:szCs w:val="24"/>
-        </w:rPr>
-        <w:t xml:space="preserve"> (Industry Supervisor), for their continuous guidance, encouragement, and valuable supervision throughout the course of this project. Their expert knowledge, constructive feedback, and insightful suggestions were instrumental in helping us overcome challenges and in shaping this work into its present form.</w:t>
-      </w:r>
-    </w:p>
-    <w:p>
-      <w:pPr>
-        <w:spacing w:line="360" w:lineRule="auto"/>
-        <w:jc w:val="both"/>
-        <w:rPr>
-          <w:szCs w:val="24"/>
-        </w:rPr>
-      </w:pPr>
-      <w:r>
-        <w:rPr>
-          <w:szCs w:val="24"/>
-        </w:rPr>
-        <w:t xml:space="preserve">We are also deeply thankful to </w:t>
-      </w:r>
-      <w:r>
-        <w:rPr>
-          <w:b/>
-          <w:bCs/>
-          <w:szCs w:val="24"/>
-        </w:rPr>
-        <w:t xml:space="preserve">Dr. </w:t>
-      </w:r>
-      <w:proofErr w:type="spellStart"/>
-      <w:r>
-        <w:rPr>
-          <w:b/>
-          <w:bCs/>
-          <w:szCs w:val="24"/>
-        </w:rPr>
-        <w:t>Zohaib</w:t>
-      </w:r>
-      <w:proofErr w:type="spellEnd"/>
-      <w:r>
-        <w:rPr>
-          <w:b/>
-          <w:bCs/>
-          <w:szCs w:val="24"/>
-        </w:rPr>
-        <w:t xml:space="preserve"> </w:t>
-      </w:r>
-      <w:proofErr w:type="spellStart"/>
-      <w:r>
-        <w:rPr>
-          <w:b/>
-          <w:bCs/>
-          <w:szCs w:val="24"/>
-        </w:rPr>
-        <w:t>Riaz</w:t>
-      </w:r>
-      <w:proofErr w:type="spellEnd"/>
-      <w:r>
-        <w:rPr>
-          <w:szCs w:val="24"/>
-        </w:rPr>
-        <w:t xml:space="preserve"> for his kind support and valuable input, which helped us refine our approach and strengthen the technical aspects of the project.</w:t>
-      </w:r>
-    </w:p>
-    <w:p>
-      <w:pPr>
-        <w:spacing w:line="360" w:lineRule="auto"/>
-        <w:jc w:val="both"/>
-        <w:rPr>
-          <w:szCs w:val="24"/>
-        </w:rPr>
-      </w:pPr>
-      <w:r>
-        <w:rPr>
-          <w:szCs w:val="24"/>
-        </w:rPr>
-        <w:t xml:space="preserve">We would like to acknowledge the facilities and resources provided by the </w:t>
-      </w:r>
-      <w:r>
-        <w:rPr>
-          <w:b/>
-          <w:bCs/>
-          <w:szCs w:val="24"/>
-        </w:rPr>
-        <w:t>Department of Mechatronics Engineering, College of Electrical and Mechanical Engineering (CEME), National University of Sciences and Technology (NUST)</w:t>
-      </w:r>
-      <w:r>
-        <w:rPr>
-          <w:szCs w:val="24"/>
-        </w:rPr>
-        <w:t>, which allowed us to conduct our research and implement our proposed system effectively.</w:t>
-      </w:r>
-    </w:p>
-    <w:p>
-      <w:pPr>
-        <w:spacing w:line="360" w:lineRule="auto"/>
-        <w:jc w:val="both"/>
-        <w:rPr>
-          <w:szCs w:val="24"/>
-        </w:rPr>
-      </w:pPr>
-      <w:r>
-        <w:rPr>
-          <w:szCs w:val="24"/>
-        </w:rPr>
-        <w:t>Special thanks are due to our families and friends for their continuous encouragement, moral support, and prayers throughout this journey. Their patience and understanding have been a constant source of motivation.</w:t>
-      </w:r>
-    </w:p>
-    <w:p>
-      <w:pPr>
-        <w:spacing w:line="360" w:lineRule="auto"/>
-        <w:jc w:val="both"/>
-        <w:rPr>
-          <w:szCs w:val="24"/>
-        </w:rPr>
-      </w:pPr>
-      <w:r>
-        <w:rPr>
-          <w:szCs w:val="24"/>
-        </w:rPr>
-        <w:t xml:space="preserve">Finally, we gratefully recognize the teamwork, dedication, and commitment of all group members — </w:t>
-      </w:r>
-      <w:r>
-        <w:rPr>
-          <w:b/>
-          <w:bCs/>
-          <w:szCs w:val="24"/>
-        </w:rPr>
-        <w:t xml:space="preserve">M. Ahmed </w:t>
-      </w:r>
-      <w:proofErr w:type="spellStart"/>
-      <w:r>
-        <w:rPr>
-          <w:b/>
-          <w:bCs/>
-          <w:szCs w:val="24"/>
-        </w:rPr>
-        <w:t>Hussain</w:t>
-      </w:r>
-      <w:proofErr w:type="spellEnd"/>
-      <w:r>
-        <w:rPr>
-          <w:b/>
-          <w:bCs/>
-          <w:szCs w:val="24"/>
-        </w:rPr>
-        <w:t xml:space="preserve"> Babar, Abdul </w:t>
-      </w:r>
-      <w:proofErr w:type="spellStart"/>
-      <w:r>
-        <w:rPr>
-          <w:b/>
-          <w:bCs/>
-          <w:szCs w:val="24"/>
-        </w:rPr>
-        <w:t>Haseeb</w:t>
-      </w:r>
-      <w:proofErr w:type="spellEnd"/>
-      <w:r>
-        <w:rPr>
-          <w:b/>
-          <w:bCs/>
-          <w:szCs w:val="24"/>
-        </w:rPr>
-        <w:t xml:space="preserve"> </w:t>
-      </w:r>
-      <w:proofErr w:type="spellStart"/>
-      <w:r>
-        <w:rPr>
-          <w:b/>
-          <w:bCs/>
-          <w:szCs w:val="24"/>
-        </w:rPr>
-        <w:t>Zahid</w:t>
-      </w:r>
-      <w:proofErr w:type="spellEnd"/>
-      <w:r>
-        <w:rPr>
-          <w:b/>
-          <w:bCs/>
-          <w:szCs w:val="24"/>
-        </w:rPr>
-        <w:t>, and Fatima Hassan</w:t>
+        <w:t>M. Ahmed Hussain Babar, Abdul Haseeb Zahid, and Fatima Hassan</w:t>
       </w:r>
       <w:r>
         <w:rPr>
@@ -2924,18 +2539,10 @@
         <w:t>The increasing reliance on renewable energy sources and the growing demand for efficient energy utilization have emphasized the need for intelligent management of distribu</w:t>
       </w:r>
       <w:r>
-        <w:t xml:space="preserve">ted energy systems. Commercial </w:t>
-      </w:r>
-      <w:proofErr w:type="spellStart"/>
-      <w:r>
-        <w:t>M</w:t>
-      </w:r>
-      <w:r>
-        <w:t>icrogrids</w:t>
-      </w:r>
-      <w:proofErr w:type="spellEnd"/>
-      <w:r>
-        <w:t>, which integrate solar photovoltaic (PV) systems, grid supply, and battery storage, face significant challenges in</w:t>
+        <w:t>ted energy systems. Commercial M</w:t>
+      </w:r>
+      <w:r>
+        <w:t>icrogrids, which integrate solar photovoltaic (PV) systems, grid supply, and battery storage, face significant challenges in</w:t>
       </w:r>
       <w:r>
         <w:t xml:space="preserve"> ensuring optimal load distribution, reducing costs and maintaining reliability.</w:t>
@@ -2958,18 +2565,10 @@
         <w:t>Smart Energy Management and Load Optimization System</w:t>
       </w:r>
       <w:r>
-        <w:t xml:space="preserve"> designed for commercial </w:t>
-      </w:r>
-      <w:proofErr w:type="spellStart"/>
-      <w:r>
-        <w:t>M</w:t>
-      </w:r>
-      <w:r>
-        <w:t>icrogrids</w:t>
-      </w:r>
-      <w:proofErr w:type="spellEnd"/>
-      <w:r>
-        <w:t xml:space="preserve">. The proposed system integrates real-time data acquisition </w:t>
+        <w:t xml:space="preserve"> designed for commercial M</w:t>
+      </w:r>
+      <w:r>
+        <w:t xml:space="preserve">icrogrids. The proposed system integrates real-time data acquisition </w:t>
       </w:r>
       <w:r>
         <w:t>from</w:t>
@@ -3170,6 +2769,12 @@
             <w:noProof/>
             <w:webHidden/>
           </w:rPr>
+        </w:r>
+        <w:r>
+          <w:rPr>
+            <w:noProof/>
+            <w:webHidden/>
+          </w:rPr>
           <w:fldChar w:fldCharType="separate"/>
         </w:r>
         <w:r>
@@ -3347,6 +2952,12 @@
             <w:webHidden/>
           </w:rPr>
           <w:instrText xml:space="preserve"> PAGEREF _Toc209711628 \h </w:instrText>
+        </w:r>
+        <w:r>
+          <w:rPr>
+            <w:noProof/>
+            <w:webHidden/>
+          </w:rPr>
         </w:r>
         <w:r>
           <w:rPr>
@@ -3670,25 +3281,7 @@
           <w:szCs w:val="24"/>
           <w:lang w:bidi="en-US"/>
         </w:rPr>
-        <w:t xml:space="preserve">MG - </w:t>
-      </w:r>
-      <w:proofErr w:type="spellStart"/>
-      <w:r>
-        <w:rPr>
-          <w:rFonts w:eastAsia="Times New Roman" w:cs="Times New Roman"/>
-          <w:szCs w:val="24"/>
-          <w:lang w:bidi="en-US"/>
-        </w:rPr>
-        <w:t>Microgrid</w:t>
-      </w:r>
-      <w:proofErr w:type="spellEnd"/>
-      <w:r>
-        <w:rPr>
-          <w:rFonts w:eastAsia="Times New Roman" w:cs="Times New Roman"/>
-          <w:szCs w:val="24"/>
-          <w:lang w:bidi="en-US"/>
-        </w:rPr>
-        <w:t xml:space="preserve"> </w:t>
+        <w:t xml:space="preserve">MG - Microgrid </w:t>
       </w:r>
       <w:r>
         <w:rPr>
@@ -3796,33 +3389,15 @@
           <w:szCs w:val="24"/>
           <w:lang w:bidi="en-US"/>
         </w:rPr>
-        <w:t xml:space="preserve">HVAC </w:t>
-      </w:r>
-      <w:proofErr w:type="gramStart"/>
+        <w:t xml:space="preserve">HVAC -  </w:t>
+      </w:r>
       <w:r>
         <w:rPr>
           <w:rFonts w:eastAsia="Times New Roman" w:cs="Times New Roman"/>
           <w:szCs w:val="24"/>
           <w:lang w:bidi="en-US"/>
         </w:rPr>
-        <w:t xml:space="preserve">-  </w:t>
-      </w:r>
-      <w:r>
-        <w:rPr>
-          <w:rFonts w:eastAsia="Times New Roman" w:cs="Times New Roman"/>
-          <w:szCs w:val="24"/>
-          <w:lang w:bidi="en-US"/>
-        </w:rPr>
-        <w:t>Heating</w:t>
-      </w:r>
-      <w:proofErr w:type="gramEnd"/>
-      <w:r>
-        <w:rPr>
-          <w:rFonts w:eastAsia="Times New Roman" w:cs="Times New Roman"/>
-          <w:szCs w:val="24"/>
-          <w:lang w:bidi="en-US"/>
-        </w:rPr>
-        <w:t>, ventilation, and air conditioning</w:t>
+        <w:t>Heating, ventilation, and air conditioning</w:t>
       </w:r>
     </w:p>
     <w:p>
@@ -3927,23 +3502,7 @@
           <w:rFonts w:eastAsia="Times New Roman" w:cs="Times New Roman"/>
           <w:szCs w:val="24"/>
         </w:rPr>
-        <w:t xml:space="preserve">from these facilities is fragmented across disparate vendors and applications; for instance, smart switches, solar inverters, and other </w:t>
-      </w:r>
-      <w:proofErr w:type="spellStart"/>
-      <w:r>
-        <w:rPr>
-          <w:rFonts w:eastAsia="Times New Roman" w:cs="Times New Roman"/>
-          <w:szCs w:val="24"/>
-        </w:rPr>
-        <w:t>IoT</w:t>
-      </w:r>
-      <w:proofErr w:type="spellEnd"/>
-      <w:r>
-        <w:rPr>
-          <w:rFonts w:eastAsia="Times New Roman" w:cs="Times New Roman"/>
-          <w:szCs w:val="24"/>
-        </w:rPr>
-        <w:t>-enabled devices each rely on proprietary apps and platforms, hindering holistic monitoring and control. Existing solutions are often either too rigid, lacking user interaction, or too simplistic, ignoring real-time variations in load demand and generation. Moreover, conventional systems frequently underperform due to suboptimal scheduling of resources, resulting in inefficient energy dispatch and missed opportunities for peak shaving or demand response. Consequently, energy is not utilized efficiently, leading to higher operational costs, unnecessary reliance on the grid, and underutilization of renewable resources.</w:t>
+        <w:t>from these facilities is fragmented across disparate vendors and applications; for instance, smart switches, solar inverters, and other IoT-enabled devices each rely on proprietary apps and platforms, hindering holistic monitoring and control. Existing solutions are often either too rigid, lacking user interaction, or too simplistic, ignoring real-time variations in load demand and generation. Moreover, conventional systems frequently underperform due to suboptimal scheduling of resources, resulting in inefficient energy dispatch and missed opportunities for peak shaving or demand response. Consequently, energy is not utilized efficiently, leading to higher operational costs, unnecessary reliance on the grid, and underutilization of renewable resources.</w:t>
       </w:r>
     </w:p>
     <w:p>
@@ -3971,21 +3530,7 @@
         <w:rPr>
           <w:rStyle w:val="Strong"/>
         </w:rPr>
-        <w:t xml:space="preserve">for Commercial </w:t>
-      </w:r>
-      <w:proofErr w:type="spellStart"/>
-      <w:r>
-        <w:rPr>
-          <w:rStyle w:val="Strong"/>
-        </w:rPr>
-        <w:t>Microgrid</w:t>
-      </w:r>
-      <w:proofErr w:type="spellEnd"/>
-      <w:r>
-        <w:rPr>
-          <w:rStyle w:val="Strong"/>
-        </w:rPr>
-        <w:t xml:space="preserve"> System</w:t>
+        <w:t>for Commercial Microgrid System</w:t>
       </w:r>
       <w:r>
         <w:t>. The specific objectives are:</w:t>
@@ -4103,15 +3648,7 @@
         <w:pStyle w:val="NormalWeb"/>
       </w:pPr>
       <w:r>
-        <w:t xml:space="preserve">This project focuses on the design and implementation of a smart energy management system tailored for commercial </w:t>
-      </w:r>
-      <w:proofErr w:type="spellStart"/>
-      <w:r>
-        <w:t>microgrids</w:t>
-      </w:r>
-      <w:proofErr w:type="spellEnd"/>
-      <w:r>
-        <w:t>. The work includes hardware-level integration with solar inverters and load controllers, software-level development of monitoring and control interfaces, and the implementation of decision-making algorithms for load optimization. The scope is limited to small-to-medium commercial setups where HVAC loads form the majority of energy consumption. While the system is designed for commercial applications, the framework is flexible and can be adapted to residential and industrial domains in the future.</w:t>
+        <w:t>This project focuses on the design and implementation of a smart energy management system tailored for commercial microgrids. The work includes hardware-level integration with solar inverters and load controllers, software-level development of monitoring and control interfaces, and the implementation of decision-making algorithms for load optimization. The scope is limited to small-to-medium commercial setups where HVAC loads form the majority of energy consumption. While the system is designed for commercial applications, the framework is flexible and can be adapted to residential and industrial domains in the future.</w:t>
       </w:r>
       <w:r>
         <w:rPr>
@@ -4173,113 +3710,46 @@
           <w:b/>
           <w:bCs/>
         </w:rPr>
-        <w:t xml:space="preserve">2.1 Types of Conventional Solar </w:t>
-      </w:r>
-      <w:proofErr w:type="spellStart"/>
+        <w:t>2.1 Types of Conventional Solar Microgrid Systems</w:t>
+      </w:r>
+    </w:p>
+    <w:p>
+      <w:pPr>
+        <w:pStyle w:val="NormalWeb"/>
+      </w:pPr>
+      <w:r>
+        <w:t xml:space="preserve">Microgrids are localized energy systems that integrate distributed energy resources (DERs), storage technologies, and controllable loads within a defined boundary. Among renewable-based systems, </w:t>
+      </w:r>
+      <w:r>
+        <w:rPr>
+          <w:rStyle w:val="Strong"/>
+        </w:rPr>
+        <w:t>solar PV–based microgrids</w:t>
+      </w:r>
+      <w:r>
+        <w:t xml:space="preserve"> are most common due to their modularity, cost-effectiveness, and wide adoption. Conventionally, they are classified into three categories: </w:t>
+      </w:r>
+      <w:r>
+        <w:rPr>
+          <w:rStyle w:val="Strong"/>
+        </w:rPr>
+        <w:t>off-grid, on-grid, and hybrid systems</w:t>
+      </w:r>
+      <w:r>
+        <w:t>.</w:t>
+      </w:r>
+    </w:p>
+    <w:p>
+      <w:pPr>
+        <w:pStyle w:val="Heading3"/>
+      </w:pPr>
       <w:r>
         <w:rPr>
           <w:rStyle w:val="Strong"/>
           <w:b/>
           <w:bCs/>
         </w:rPr>
-        <w:t>Microgrid</w:t>
-      </w:r>
-      <w:proofErr w:type="spellEnd"/>
-      <w:r>
-        <w:rPr>
-          <w:rStyle w:val="Strong"/>
-          <w:b/>
-          <w:bCs/>
-        </w:rPr>
-        <w:t xml:space="preserve"> Systems</w:t>
-      </w:r>
-    </w:p>
-    <w:p>
-      <w:pPr>
-        <w:pStyle w:val="NormalWeb"/>
-      </w:pPr>
-      <w:proofErr w:type="spellStart"/>
-      <w:r>
-        <w:t>Microgrids</w:t>
-      </w:r>
-      <w:proofErr w:type="spellEnd"/>
-      <w:r>
-        <w:t xml:space="preserve"> are localized energy systems that integrate distributed energy resources (DERs), storage technologies, and controllable loads within a defined boundary. Among renewable-based systems, </w:t>
-      </w:r>
-      <w:r>
-        <w:rPr>
-          <w:rStyle w:val="Strong"/>
-        </w:rPr>
-        <w:t xml:space="preserve">solar PV–based </w:t>
-      </w:r>
-      <w:proofErr w:type="spellStart"/>
-      <w:r>
-        <w:rPr>
-          <w:rStyle w:val="Strong"/>
-        </w:rPr>
-        <w:t>microgrids</w:t>
-      </w:r>
-      <w:proofErr w:type="spellEnd"/>
-      <w:r>
-        <w:t xml:space="preserve"> are most common due to their modularity, cost-effectiveness, and wide adoption. Conventionally, they are classified into three categories: </w:t>
-      </w:r>
-      <w:r>
-        <w:rPr>
-          <w:rStyle w:val="Strong"/>
-        </w:rPr>
-        <w:t>off-grid, on-grid, and hybrid systems</w:t>
-      </w:r>
-      <w:r>
-        <w:t>.</w:t>
-      </w:r>
-    </w:p>
-    <w:p>
-      <w:pPr>
-        <w:pStyle w:val="Heading3"/>
-      </w:pPr>
-      <w:r>
-        <w:rPr>
-          <w:rStyle w:val="Strong"/>
-          <w:b/>
-          <w:bCs/>
-        </w:rPr>
-        <w:t xml:space="preserve">2.1.1 </w:t>
-      </w:r>
-      <w:proofErr w:type="gramStart"/>
-      <w:r>
-        <w:rPr>
-          <w:rStyle w:val="Strong"/>
-          <w:b/>
-          <w:bCs/>
-        </w:rPr>
-        <w:t>Off-</w:t>
-      </w:r>
-      <w:proofErr w:type="gramEnd"/>
-      <w:r>
-        <w:rPr>
-          <w:rStyle w:val="Strong"/>
-          <w:b/>
-          <w:bCs/>
-        </w:rPr>
-        <w:t xml:space="preserve">Grid </w:t>
-      </w:r>
-      <w:proofErr w:type="spellStart"/>
-      <w:r>
-        <w:rPr>
-          <w:rStyle w:val="Strong"/>
-          <w:b/>
-          <w:bCs/>
-        </w:rPr>
-        <w:t>Microgrid</w:t>
-      </w:r>
-      <w:proofErr w:type="spellEnd"/>
-      <w:r>
-        <w:rPr>
-          <w:rStyle w:val="Strong"/>
-          <w:b/>
-          <w:bCs/>
-        </w:rPr>
-        <w:t xml:space="preserve"> Systems</w:t>
+        <w:t>2.1.1 Off-Grid Microgrid Systems</w:t>
       </w:r>
     </w:p>
     <w:p>
@@ -4350,21 +3820,7 @@
         <w:rPr>
           <w:rStyle w:val="Strong"/>
         </w:rPr>
-        <w:t>Feed-in Tariff (</w:t>
-      </w:r>
-      <w:proofErr w:type="spellStart"/>
-      <w:r>
-        <w:rPr>
-          <w:rStyle w:val="Strong"/>
-        </w:rPr>
-        <w:t>FiT</w:t>
-      </w:r>
-      <w:proofErr w:type="spellEnd"/>
-      <w:r>
-        <w:rPr>
-          <w:rStyle w:val="Strong"/>
-        </w:rPr>
-        <w:t>):</w:t>
+        <w:t>Feed-in Tariff (FiT):</w:t>
       </w:r>
       <w:r>
         <w:t xml:space="preserve"> Not applicable, since no grid connection exists.</w:t>
@@ -4418,43 +3874,7 @@
           <w:b/>
           <w:bCs/>
         </w:rPr>
-        <w:t xml:space="preserve">2.1.2 </w:t>
-      </w:r>
-      <w:proofErr w:type="gramStart"/>
-      <w:r>
-        <w:rPr>
-          <w:rStyle w:val="Strong"/>
-          <w:b/>
-          <w:bCs/>
-        </w:rPr>
-        <w:t>On-</w:t>
-      </w:r>
-      <w:proofErr w:type="gramEnd"/>
-      <w:r>
-        <w:rPr>
-          <w:rStyle w:val="Strong"/>
-          <w:b/>
-          <w:bCs/>
-        </w:rPr>
-        <w:t xml:space="preserve">Grid </w:t>
-      </w:r>
-      <w:proofErr w:type="spellStart"/>
-      <w:r>
-        <w:rPr>
-          <w:rStyle w:val="Strong"/>
-          <w:b/>
-          <w:bCs/>
-        </w:rPr>
-        <w:t>Microgrid</w:t>
-      </w:r>
-      <w:proofErr w:type="spellEnd"/>
-      <w:r>
-        <w:rPr>
-          <w:rStyle w:val="Strong"/>
-          <w:b/>
-          <w:bCs/>
-        </w:rPr>
-        <w:t xml:space="preserve"> Systems</w:t>
+        <w:t>2.1.2 On-Grid Microgrid Systems</w:t>
       </w:r>
     </w:p>
     <w:p>
@@ -4534,32 +3954,10 @@
         <w:rPr>
           <w:rStyle w:val="Strong"/>
         </w:rPr>
-        <w:t>Feed-in Tariff (</w:t>
-      </w:r>
-      <w:proofErr w:type="spellStart"/>
-      <w:r>
-        <w:rPr>
-          <w:rStyle w:val="Strong"/>
-        </w:rPr>
-        <w:t>FiT</w:t>
-      </w:r>
-      <w:proofErr w:type="spellEnd"/>
-      <w:r>
-        <w:rPr>
-          <w:rStyle w:val="Strong"/>
-        </w:rPr>
-        <w:t>):</w:t>
-      </w:r>
-      <w:r>
-        <w:t xml:space="preserve"> Supported — excess energy can be exported to the grid under </w:t>
-      </w:r>
-      <w:proofErr w:type="spellStart"/>
-      <w:r>
-        <w:t>FiT</w:t>
-      </w:r>
-      <w:proofErr w:type="spellEnd"/>
-      <w:r>
-        <w:t xml:space="preserve"> or net metering policies.</w:t>
+        <w:t>Feed-in Tariff (FiT):</w:t>
+      </w:r>
+      <w:r>
+        <w:t xml:space="preserve"> Supported — excess energy can be exported to the grid under FiT or net metering policies.</w:t>
       </w:r>
     </w:p>
     <w:p>
@@ -4578,15 +3976,7 @@
         <w:t>Advantages:</w:t>
       </w:r>
       <w:r>
-        <w:t xml:space="preserve"> Lower cost (no storage requirement), simple architecture, economic benefit from </w:t>
-      </w:r>
-      <w:proofErr w:type="spellStart"/>
-      <w:r>
-        <w:t>FiT</w:t>
-      </w:r>
-      <w:proofErr w:type="spellEnd"/>
-      <w:r>
-        <w:t xml:space="preserve"> or net metering.</w:t>
+        <w:t xml:space="preserve"> Lower cost (no storage requirement), simple architecture, economic benefit from FiT or net metering.</w:t>
       </w:r>
     </w:p>
     <w:p>
@@ -4619,25 +4009,7 @@
           <w:bCs/>
         </w:rPr>
         <w:lastRenderedPageBreak/>
-        <w:t xml:space="preserve">2.1.3 Hybrid </w:t>
-      </w:r>
-      <w:proofErr w:type="spellStart"/>
-      <w:r>
-        <w:rPr>
-          <w:rStyle w:val="Strong"/>
-          <w:b/>
-          <w:bCs/>
-        </w:rPr>
-        <w:t>Microgrid</w:t>
-      </w:r>
-      <w:proofErr w:type="spellEnd"/>
-      <w:r>
-        <w:rPr>
-          <w:rStyle w:val="Strong"/>
-          <w:b/>
-          <w:bCs/>
-        </w:rPr>
-        <w:t xml:space="preserve"> Systems</w:t>
+        <w:t>2.1.3 Hybrid Microgrid Systems</w:t>
       </w:r>
     </w:p>
     <w:p>
@@ -4708,21 +4080,7 @@
         <w:rPr>
           <w:rStyle w:val="Strong"/>
         </w:rPr>
-        <w:t>Feed-in Tariff (</w:t>
-      </w:r>
-      <w:proofErr w:type="spellStart"/>
-      <w:r>
-        <w:rPr>
-          <w:rStyle w:val="Strong"/>
-        </w:rPr>
-        <w:t>FiT</w:t>
-      </w:r>
-      <w:proofErr w:type="spellEnd"/>
-      <w:r>
-        <w:rPr>
-          <w:rStyle w:val="Strong"/>
-        </w:rPr>
-        <w:t>):</w:t>
+        <w:t>Feed-in Tariff (FiT):</w:t>
       </w:r>
       <w:r>
         <w:t xml:space="preserve"> Supported — surplus solar energy can be exported to the grid for monetary benefits.</w:t>
@@ -4744,15 +4102,7 @@
         <w:t>Advantages:</w:t>
       </w:r>
       <w:r>
-        <w:t xml:space="preserve"> Higher reliability, resilience against outages, full flexibility, and economic benefits from </w:t>
-      </w:r>
-      <w:proofErr w:type="spellStart"/>
-      <w:r>
-        <w:t>FiT</w:t>
-      </w:r>
-      <w:proofErr w:type="spellEnd"/>
-      <w:r>
-        <w:t>.</w:t>
+        <w:t xml:space="preserve"> Higher reliability, resilience against outages, full flexibility, and economic benefits from FiT.</w:t>
       </w:r>
     </w:p>
     <w:p>
@@ -4796,15 +4146,7 @@
         <w:pStyle w:val="NormalWeb"/>
       </w:pPr>
       <w:r>
-        <w:t xml:space="preserve">Effective communication between solar inverters, monitoring devices, and control systems is fundamental to the operation of smart </w:t>
-      </w:r>
-      <w:proofErr w:type="spellStart"/>
-      <w:r>
-        <w:t>microgrids</w:t>
-      </w:r>
-      <w:proofErr w:type="spellEnd"/>
-      <w:r>
-        <w:t xml:space="preserve">. Communication protocols define how information is exchanged, ensuring interoperability, real-time monitoring, and reliable control. These protocols can be categorized into three layers, ranging from the </w:t>
+        <w:t xml:space="preserve">Effective communication between solar inverters, monitoring devices, and control systems is fundamental to the operation of smart microgrids. Communication protocols define how information is exchanged, ensuring interoperability, real-time monitoring, and reliable control. These protocols can be categorized into three layers, ranging from the </w:t>
       </w:r>
       <w:r>
         <w:rPr>
@@ -5288,15 +4630,7 @@
         <w:spacing w:before="100" w:beforeAutospacing="1" w:after="100" w:afterAutospacing="1" w:line="240" w:lineRule="auto"/>
       </w:pPr>
       <w:r>
-        <w:t xml:space="preserve">Advantages: Open standard, widely supported, easy to integrate with Home Assistant and EMS systems; </w:t>
-      </w:r>
-      <w:proofErr w:type="spellStart"/>
-      <w:r>
-        <w:t>SunSpec</w:t>
-      </w:r>
-      <w:proofErr w:type="spellEnd"/>
-      <w:r>
-        <w:t xml:space="preserve"> models often build on Modbus for standardized inverter data mapping.</w:t>
+        <w:t>Advantages: Open standard, widely supported, easy to integrate with Home Assistant and EMS systems; SunSpec models often build on Modbus for standardized inverter data mapping.</w:t>
       </w:r>
     </w:p>
     <w:p>
@@ -5376,15 +4710,7 @@
         <w:rPr>
           <w:rStyle w:val="Strong"/>
         </w:rPr>
-        <w:t>RS23</w:t>
-      </w:r>
-      <w:bookmarkStart w:id="9" w:name="_GoBack"/>
-      <w:bookmarkEnd w:id="9"/>
-      <w:r>
-        <w:rPr>
-          <w:rStyle w:val="Strong"/>
-        </w:rPr>
-        <w:t>2/</w:t>
+        <w:t>RS232/</w:t>
       </w:r>
       <w:r>
         <w:rPr>
@@ -5489,16 +4815,8 @@
         <w:rPr>
           <w:rStyle w:val="Strong"/>
         </w:rPr>
-        <w:t xml:space="preserve">Daikin, Mitsubishi, </w:t>
-      </w:r>
-      <w:proofErr w:type="gramStart"/>
-      <w:r>
-        <w:rPr>
-          <w:rStyle w:val="Strong"/>
-        </w:rPr>
-        <w:t>LG</w:t>
-      </w:r>
-      <w:proofErr w:type="gramEnd"/>
+        <w:t>Daikin, Mitsubishi, LG</w:t>
+      </w:r>
       <w:r>
         <w:t xml:space="preserve"> implement custom communication standards (e.g., Daikin’s P1/P2 bus) for advanced HVAC functions. These are usually closed systems, requiring vendor-specific interfaces for integration.</w:t>
       </w:r>
@@ -5595,15 +4913,7 @@
         <w:t>Application Layer:</w:t>
       </w:r>
       <w:r>
-        <w:t xml:space="preserve"> Proprietary command sets (e.g., ON/OFF, mode, fan speed, temperature). Each brand (Daikin, </w:t>
-      </w:r>
-      <w:proofErr w:type="spellStart"/>
-      <w:r>
-        <w:t>Gree</w:t>
-      </w:r>
-      <w:proofErr w:type="spellEnd"/>
-      <w:r>
-        <w:t>, Haier, etc.) implements its own unique IR codes.</w:t>
+        <w:t xml:space="preserve"> Proprietary command sets (e.g., ON/OFF, mode, fan speed, temperature). Each brand (Daikin, Gree, Haier, etc.) implements its own unique IR codes.</w:t>
       </w:r>
     </w:p>
     <w:p>
@@ -5639,7 +4949,7 @@
         </w:rPr>
         <w:t xml:space="preserve"> Home Assistant Custom Integration</w:t>
       </w:r>
-      <w:bookmarkStart w:id="10" w:name="_Toc209711651"/>
+      <w:bookmarkStart w:id="9" w:name="_Toc209711651"/>
     </w:p>
     <w:p>
       <w:r>
@@ -5647,23 +4957,7 @@
       </w:r>
       <w:r>
         <w:lastRenderedPageBreak/>
-        <w:t xml:space="preserve">explicitly configured. Its key features include support for over 1,000 brands and devices through integrations (e.g., </w:t>
-      </w:r>
-      <w:proofErr w:type="spellStart"/>
-      <w:r>
-        <w:t>Zigbee</w:t>
-      </w:r>
-      <w:proofErr w:type="spellEnd"/>
-      <w:r>
-        <w:t xml:space="preserve">, Z-Wave, Thread, </w:t>
-      </w:r>
-      <w:proofErr w:type="gramStart"/>
-      <w:r>
-        <w:t>Matter</w:t>
-      </w:r>
-      <w:proofErr w:type="gramEnd"/>
-      <w:r>
-        <w:t>), automatic network scanning for setup, customizable dashboards with drag-and-drop interfaces for monitoring and control, and a voice assistant called Assist that processes commands locally using natural language.</w:t>
+        <w:t>explicitly configured. Its key features include support for over 1,000 brands and devices through integrations (e.g., Zigbee, Z-Wave, Thread, Matter), automatic network scanning for setup, customizable dashboards with drag-and-drop interfaces for monitoring and control, and a voice assistant called Assist that processes commands locally using natural language.</w:t>
       </w:r>
     </w:p>
     <w:p/>
@@ -5679,57 +4973,17 @@
     <w:p/>
     <w:p>
       <w:r>
-        <w:t xml:space="preserve">Energy management and load optimization in </w:t>
-      </w:r>
-      <w:proofErr w:type="spellStart"/>
-      <w:r>
-        <w:t>microgrids</w:t>
-      </w:r>
-      <w:proofErr w:type="spellEnd"/>
-      <w:r>
-        <w:t xml:space="preserve"> have received significant attention due to the integration of renewables, battery storage, and variable loads in commercial and building environments. Existing approaches generally fall into simulation-based optimization, forecasting-driven demand management, and scheduling algorithms.</w:t>
+        <w:t>Energy management and load optimization in microgrids have received significant attention due to the integration of renewables, battery storage, and variable loads in commercial and building environments. Existing approaches generally fall into simulation-based optimization, forecasting-driven demand management, and scheduling algorithms.</w:t>
       </w:r>
     </w:p>
     <w:p>
       <w:r>
-        <w:t xml:space="preserve">Several studies focus on algorithmic optimization for power dispatch and load management. For instance, an improved adaptive genetic algorithm has been proposed for multi-objective power system load optimization dispatch, aiming to balance cost, emissions, and reliability while handling discrete decision variables [1]. Similarly, commercial tools such as the ABB Energy Simulator provide user-friendly web-based platforms for </w:t>
-      </w:r>
-      <w:proofErr w:type="spellStart"/>
-      <w:r>
-        <w:t>microgrid</w:t>
-      </w:r>
-      <w:proofErr w:type="spellEnd"/>
-      <w:r>
-        <w:t xml:space="preserve"> planning, allowing simulation of solar, battery, and demand scenarios to estimate ROI and environmental benefits [2].</w:t>
+        <w:t>Several studies focus on algorithmic optimization for power dispatch and load management. For instance, an improved adaptive genetic algorithm has been proposed for multi-objective power system load optimization dispatch, aiming to balance cost, emissions, and reliability while handling discrete decision variables [1]. Similarly, commercial tools such as the ABB Energy Simulator provide user-friendly web-based platforms for microgrid planning, allowing simulation of solar, battery, and demand scenarios to estimate ROI and environmental benefits [2].</w:t>
       </w:r>
     </w:p>
     <w:p>
       <w:r>
-        <w:t xml:space="preserve">Advanced AI-driven frameworks have also emerged for smart building </w:t>
-      </w:r>
-      <w:proofErr w:type="spellStart"/>
-      <w:r>
-        <w:t>microgrids</w:t>
-      </w:r>
-      <w:proofErr w:type="spellEnd"/>
-      <w:r>
-        <w:t xml:space="preserve"> (SBMGs). A notable example is the </w:t>
-      </w:r>
-      <w:proofErr w:type="spellStart"/>
-      <w:r>
-        <w:t>Greylag</w:t>
-      </w:r>
-      <w:proofErr w:type="spellEnd"/>
-      <w:r>
-        <w:t xml:space="preserve"> Goose Optimization (GGO) combined with Relational Bi-Level Aggregation Graph Convolutional Network (RBAGCN), enhanced by Fast Resampled Iterative Filtering (FRIF) preprocessing and Prairie Dog Optimization (PDO) feature selection [3]. This hybrid model achieves high simulation accuracy (98.3%) in load forecasting and battery-conscious demand management by capturing interrelations among energy variables (e.g., solar voltage, battery discharge power, temperature). Another residential-focused approach uses bio-inspired optimization algorithms (BOSA, SSA, CSO) for demand-side management in smart grids, scheduling </w:t>
-      </w:r>
-      <w:proofErr w:type="spellStart"/>
-      <w:r>
-        <w:t>shiftable</w:t>
-      </w:r>
-      <w:proofErr w:type="spellEnd"/>
-      <w:r>
-        <w:t xml:space="preserve"> loads (e.g., air conditioners, washing machines, dishwashers) to reduce peak demand and electricity costs by up to 16% while integrating solar resources [4].</w:t>
+        <w:t>Advanced AI-driven frameworks have also emerged for smart building microgrids (SBMGs). A notable example is the Greylag Goose Optimization (GGO) combined with Relational Bi-Level Aggregation Graph Convolutional Network (RBAGCN), enhanced by Fast Resampled Iterative Filtering (FRIF) preprocessing and Prairie Dog Optimization (PDO) feature selection [3]. This hybrid model achieves high simulation accuracy (98.3%) in load forecasting and battery-conscious demand management by capturing interrelations among energy variables (e.g., solar voltage, battery discharge power, temperature). Another residential-focused approach uses bio-inspired optimization algorithms (BOSA, SSA, CSO) for demand-side management in smart grids, scheduling shiftable loads (e.g., air conditioners, washing machines, dishwashers) to reduce peak demand and electricity costs by up to 16% while integrating solar resources [4].</w:t>
       </w:r>
     </w:p>
     <w:p>
@@ -5744,57 +4998,17 @@
     <w:p>
       <w:r>
         <w:lastRenderedPageBreak/>
-        <w:t xml:space="preserve">Despite their contributions, these works have notable limitations. Most are heavily simulation-oriented (MATLAB-based) with no real hardware validation, ignoring practical issues such as sensor noise, communication delays, device failures, or real-time execution constraints [1][3]. They typically assume the availability of sophisticated, high-resolution data and inherently smart infrastructure, which is rarely the case in legacy commercial setups where inverters and HVAC systems lack native </w:t>
-      </w:r>
-      <w:proofErr w:type="spellStart"/>
-      <w:r>
-        <w:t>IoT</w:t>
-      </w:r>
-      <w:proofErr w:type="spellEnd"/>
-      <w:r>
-        <w:t xml:space="preserve"> connectivity or standardized APIs [3</w:t>
-      </w:r>
-      <w:proofErr w:type="gramStart"/>
-      <w:r>
-        <w:t>][</w:t>
-      </w:r>
-      <w:proofErr w:type="gramEnd"/>
-      <w:r>
-        <w:t>4].</w:t>
+        <w:t>Despite their contributions, these works have notable limitations. Most are heavily simulation-oriented (MATLAB-based) with no real hardware validation, ignoring practical issues such as sensor noise, communication delays, device failures, or real-time execution constraints [1][3]. They typically assume the availability of sophisticated, high-resolution data and inherently smart infrastructure, which is rarely the case in legacy commercial setups where inverters and HVAC systems lack native IoT connectivity or standardized APIs [3][4].</w:t>
       </w:r>
     </w:p>
     <w:p>
       <w:r>
-        <w:t>Computational complexity is another major drawback. Hybrid graph-based models (RBAGCN + GGO) and multi-stage pipelines (FRIF + PDO + optimization) demand significant resources, making them unsuitable for edge deployment or small-to-medium commercial buildings [3]. Optimization tools like the ABB simulator or genetic algorithms treat loads in highly generalized terms (total demand or aggregate power), without addressing specific controllable devices such as HVAC units or split ACs that dominate commercial energy consumption [1</w:t>
-      </w:r>
-      <w:proofErr w:type="gramStart"/>
-      <w:r>
-        <w:t>][</w:t>
-      </w:r>
-      <w:proofErr w:type="gramEnd"/>
-      <w:r>
-        <w:t>2].</w:t>
+        <w:t>Computational complexity is another major drawback. Hybrid graph-based models (RBAGCN + GGO) and multi-stage pipelines (FRIF + PDO + optimization) demand significant resources, making them unsuitable for edge deployment or small-to-medium commercial buildings [3]. Optimization tools like the ABB simulator or genetic algorithms treat loads in highly generalized terms (total demand or aggregate power), without addressing specific controllable devices such as HVAC units or split ACs that dominate commercial energy consumption [1][2].</w:t>
       </w:r>
     </w:p>
     <w:p>
       <w:r>
-        <w:t>Furthermore, most solutions lack support for retrofitting non-smart devices. There is minimal emphasis on practical communication protocols (e.g., Modbus RTU over RS485 for inverters or IR/wired interfaces for HVAC) or integration with accessible platforms for monitoring and control [3</w:t>
-      </w:r>
-      <w:proofErr w:type="gramStart"/>
-      <w:r>
-        <w:t>][</w:t>
-      </w:r>
-      <w:proofErr w:type="gramEnd"/>
-      <w:r>
-        <w:t>4]. User interaction, remote/cloud-based overrides, and occupant comfort considerations are often absent, resulting in rigid, centralized systems that prioritize algorithmic performance over real-world usability and flexibility [2</w:t>
-      </w:r>
-      <w:proofErr w:type="gramStart"/>
-      <w:r>
-        <w:t>][</w:t>
-      </w:r>
-      <w:proofErr w:type="gramEnd"/>
-      <w:r>
-        <w:t>4].</w:t>
+        <w:t>Furthermore, most solutions lack support for retrofitting non-smart devices. There is minimal emphasis on practical communication protocols (e.g., Modbus RTU over RS485 for inverters or IR/wired interfaces for HVAC) or integration with accessible platforms for monitoring and control [3][4]. User interaction, remote/cloud-based overrides, and occupant comfort considerations are often absent, resulting in rigid, centralized systems that prioritize algorithmic performance over real-world usability and flexibility [2][4].</w:t>
       </w:r>
       <w:r>
         <w:br/>
@@ -5819,15 +5033,7 @@
         <w:t>simulations</w:t>
       </w:r>
       <w:r>
-        <w:t xml:space="preserve"> (MATLAB or theoretical models) without real-world hardware deployment, risking poor translation due to unaccounted factors like sensor noise, communication delays, or device failures [1</w:t>
-      </w:r>
-      <w:proofErr w:type="gramStart"/>
-      <w:r>
-        <w:t>,2,4</w:t>
-      </w:r>
-      <w:proofErr w:type="gramEnd"/>
-      <w:r>
-        <w:t xml:space="preserve">]. They often treat loads in </w:t>
+        <w:t xml:space="preserve"> (MATLAB or theoretical models) without real-world hardware deployment, risking poor translation due to unaccounted factors like sensor noise, communication delays, or device failures [1,2,4]. They often treat loads in </w:t>
       </w:r>
       <w:r>
         <w:rPr>
@@ -5837,15 +5043,7 @@
         <w:t>general terms</w:t>
       </w:r>
       <w:r>
-        <w:t xml:space="preserve"> (total demand or aggregated power) or focus on residential </w:t>
-      </w:r>
-      <w:proofErr w:type="spellStart"/>
-      <w:r>
-        <w:t>shiftable</w:t>
-      </w:r>
-      <w:proofErr w:type="spellEnd"/>
-      <w:r>
-        <w:t xml:space="preserve"> appliances, lacking emphasis on </w:t>
+        <w:t xml:space="preserve"> (total demand or aggregated power) or focus on residential shiftable appliances, lacking emphasis on </w:t>
       </w:r>
       <w:r>
         <w:rPr>
@@ -5867,169 +5065,131 @@
           <w:b/>
           <w:bCs/>
         </w:rPr>
-        <w:t xml:space="preserve">smart or </w:t>
-      </w:r>
-      <w:proofErr w:type="spellStart"/>
+        <w:t>smart or IoT-enabled devices</w:t>
+      </w:r>
+      <w:r>
+        <w:t xml:space="preserve"> with native connectivity and detailed data streams, ignoring the need to retrofit </w:t>
+      </w:r>
       <w:r>
         <w:rPr>
           <w:b/>
           <w:bCs/>
         </w:rPr>
-        <w:t>IoT</w:t>
-      </w:r>
-      <w:proofErr w:type="spellEnd"/>
+        <w:t>non-smart inverters, HVAC controllers, and IR-based split ACs</w:t>
+      </w:r>
+      <w:r>
+        <w:t xml:space="preserve"> common in legacy commercial setups [2,4]. High computational complexity (e.g., graph convolutions, multi-stage optimization, swarm algorithms) limits real-time edge deployment and scalability in resource-constrained environments [1,4]. Few provide </w:t>
+      </w:r>
       <w:r>
         <w:rPr>
           <w:b/>
           <w:bCs/>
         </w:rPr>
-        <w:t>-enabled devices</w:t>
-      </w:r>
-      <w:r>
-        <w:t xml:space="preserve"> with native connectivity and detailed data streams, ignoring the need to retrofit </w:t>
+        <w:t>user-friendly interfaces</w:t>
+      </w:r>
+      <w:r>
+        <w:t xml:space="preserve"> for monitoring, remote/cloud control, or manual overrides, reducing practicality and occupant comfort [3]. Finally, the focus is often on full forecasting-heavy EMS or planning simulators rather than targeted </w:t>
       </w:r>
       <w:r>
         <w:rPr>
           <w:b/>
           <w:bCs/>
         </w:rPr>
-        <w:t>non-smart inverters, HVAC controllers, and IR-based split ACs</w:t>
-      </w:r>
-      <w:r>
-        <w:t xml:space="preserve"> common in legacy commercial setups [2</w:t>
-      </w:r>
-      <w:proofErr w:type="gramStart"/>
-      <w:r>
-        <w:t>,4</w:t>
-      </w:r>
-      <w:proofErr w:type="gramEnd"/>
-      <w:r>
-        <w:t>]. High computational complexity (e.g., graph convolutions, multi-stage optimization, swarm algorithms) limits real-time edge deployment and scalability in resource-constrained environments [1</w:t>
-      </w:r>
-      <w:proofErr w:type="gramStart"/>
-      <w:r>
-        <w:t>,4</w:t>
-      </w:r>
-      <w:proofErr w:type="gramEnd"/>
-      <w:r>
-        <w:t xml:space="preserve">]. Few provide </w:t>
-      </w:r>
+        <w:t>load optimization</w:t>
+      </w:r>
+      <w:r>
+        <w:t xml:space="preserve"> with prioritization and automation of specific high-consumption loads like HVAC.</w:t>
+      </w:r>
+    </w:p>
+    <w:p>
       <w:r>
         <w:rPr>
           <w:b/>
           <w:bCs/>
         </w:rPr>
-        <w:t>user-friendly interfaces</w:t>
-      </w:r>
-      <w:r>
-        <w:t xml:space="preserve"> for monitoring, remote/cloud control, or manual overrides, reducing practicality and occupant comfort [3]. Finally, the focus is often on full forecasting-heavy EMS or planning simulators rather than targeted </w:t>
+        <w:lastRenderedPageBreak/>
+        <w:t>Value Proposition of the Proposed Work</w:t>
+      </w:r>
+    </w:p>
+    <w:p>
+      <w:r>
+        <w:t xml:space="preserve">In contrast, the proposed system delivers a practical, deployable </w:t>
       </w:r>
       <w:r>
         <w:rPr>
           <w:b/>
           <w:bCs/>
         </w:rPr>
-        <w:t>load optimization</w:t>
-      </w:r>
-      <w:r>
-        <w:t xml:space="preserve"> with prioritization and automation of specific high-consumption loads like HVAC.</w:t>
+        <w:t>load optimization-based energy management framework</w:t>
+      </w:r>
+      <w:r>
+        <w:t xml:space="preserve"> for commercial hybrid solar microgrids that directly addresses these gaps. It retrofits </w:t>
+      </w:r>
+      <w:r>
+        <w:rPr>
+          <w:b/>
+          <w:bCs/>
+        </w:rPr>
+        <w:t>non-smart inverters</w:t>
+      </w:r>
+      <w:r>
+        <w:t xml:space="preserve"> via RS485/Modbus RTU for real-time data acquisition (PV generation, battery SOC, grid import/export) and integrates with </w:t>
+      </w:r>
+      <w:r>
+        <w:rPr>
+          <w:b/>
+          <w:bCs/>
+        </w:rPr>
+        <w:t>HVAC and split AC units</w:t>
+      </w:r>
+      <w:r>
+        <w:t xml:space="preserve"> through wired controllers and IR protocols for actual remote control — making legacy devices "smart" without requiring replacements.</w:t>
       </w:r>
     </w:p>
     <w:p>
       <w:r>
+        <w:t xml:space="preserve">By leveraging a custom </w:t>
+      </w:r>
+      <w:r>
         <w:rPr>
           <w:b/>
           <w:bCs/>
         </w:rPr>
-        <w:lastRenderedPageBreak/>
-        <w:t>Value Proposition of the Proposed Work</w:t>
+        <w:t>Home Assistant integration</w:t>
+      </w:r>
+      <w:r>
+        <w:t xml:space="preserve">, the system enables seamless monitoring, intelligent prioritization/automation of specific high-energy loads (primarily HVAC/ACs), user overrides, and cloud-based remote access. This emphasizes </w:t>
+      </w:r>
+      <w:r>
+        <w:rPr>
+          <w:b/>
+          <w:bCs/>
+        </w:rPr>
+        <w:t>load optimization</w:t>
+      </w:r>
+      <w:r>
+        <w:t xml:space="preserve"> over pure forecasting, prioritizing renewables, minimizing grid dependency and costs, while maintaining comfort in small-to-medium commercial setups. The approach is hardware-validated in a real commercial environment, offering lower complexity, higher deployability, and greater relevance to industry compared to simulation-centric or residential-focused existing solutions.</w:t>
       </w:r>
     </w:p>
     <w:p>
-      <w:r>
-        <w:t xml:space="preserve">In contrast, the proposed system delivers a practical, deployable </w:t>
-      </w:r>
-      <w:r>
-        <w:rPr>
+      <w:pPr>
+        <w:spacing w:before="100" w:beforeAutospacing="1" w:after="100" w:afterAutospacing="1" w:line="240" w:lineRule="auto"/>
+        <w:rPr>
+          <w:rFonts w:eastAsia="Times New Roman" w:cs="Times New Roman"/>
           <w:b/>
-          <w:bCs/>
-        </w:rPr>
-        <w:t>load optimization-based energy management framework</w:t>
-      </w:r>
-      <w:r>
-        <w:t xml:space="preserve"> for commercial hybrid solar </w:t>
-      </w:r>
-      <w:proofErr w:type="spellStart"/>
-      <w:r>
-        <w:t>microgrids</w:t>
-      </w:r>
-      <w:proofErr w:type="spellEnd"/>
-      <w:r>
-        <w:t xml:space="preserve"> that directly addresses these gaps. It retrofits </w:t>
-      </w:r>
-      <w:r>
-        <w:rPr>
+          <w:szCs w:val="24"/>
+        </w:rPr>
+      </w:pPr>
+      <w:r>
+        <w:rPr>
+          <w:rFonts w:eastAsia="Times New Roman" w:cs="Times New Roman"/>
           <w:b/>
-          <w:bCs/>
-        </w:rPr>
-        <w:t>non-smart inverters</w:t>
-      </w:r>
-      <w:r>
-        <w:t xml:space="preserve"> via RS485/Modbus RTU for real-time data acquisition (PV generation, battery SOC, </w:t>
-      </w:r>
-      <w:proofErr w:type="gramStart"/>
-      <w:r>
-        <w:t>grid</w:t>
-      </w:r>
-      <w:proofErr w:type="gramEnd"/>
-      <w:r>
-        <w:t xml:space="preserve"> import/export) and integrates with </w:t>
-      </w:r>
-      <w:r>
-        <w:rPr>
-          <w:b/>
-          <w:bCs/>
-        </w:rPr>
-        <w:t>HVAC and split AC units</w:t>
-      </w:r>
-      <w:r>
-        <w:t xml:space="preserve"> through wired controllers and IR protocols for actual remote control — making legacy devices "smart" without requiring replacements.</w:t>
+          <w:szCs w:val="24"/>
+        </w:rPr>
+        <w:t xml:space="preserve">System Design/Methodology </w:t>
       </w:r>
     </w:p>
     <w:p>
-      <w:r>
-        <w:t xml:space="preserve">By leveraging a custom </w:t>
-      </w:r>
-      <w:r>
-        <w:rPr>
-          <w:b/>
-          <w:bCs/>
-        </w:rPr>
-        <w:t>Home Assistant integration</w:t>
-      </w:r>
-      <w:r>
-        <w:t xml:space="preserve">, the system enables seamless monitoring, intelligent prioritization/automation of specific high-energy loads (primarily HVAC/ACs), user overrides, and cloud-based remote access. This emphasizes </w:t>
-      </w:r>
-      <w:r>
-        <w:rPr>
-          <w:b/>
-          <w:bCs/>
-        </w:rPr>
-        <w:t>load optimization</w:t>
-      </w:r>
-      <w:r>
-        <w:t xml:space="preserve"> over pure forecasting, prioritizing renewables, minimizing grid dependency and costs, while maintaining comfort in small-to-medium commercial setups. The approach is hardware-validated in a real commercial environment, offering lower complexity, higher </w:t>
-      </w:r>
-      <w:proofErr w:type="spellStart"/>
-      <w:r>
-        <w:t>deployability</w:t>
-      </w:r>
-      <w:proofErr w:type="spellEnd"/>
-      <w:r>
-        <w:t>, and greater relevance to industry compared to simulation-centric or residential-focused existing solutions.</w:t>
-      </w:r>
-    </w:p>
-    <w:p>
       <w:pPr>
         <w:spacing w:before="100" w:beforeAutospacing="1" w:after="100" w:afterAutospacing="1" w:line="240" w:lineRule="auto"/>
         <w:rPr>
@@ -6044,44 +5204,16 @@
           <w:b/>
           <w:szCs w:val="24"/>
         </w:rPr>
-        <w:t xml:space="preserve">System Design/Methodology </w:t>
-      </w:r>
-    </w:p>
-    <w:p>
-      <w:pPr>
-        <w:spacing w:before="100" w:beforeAutospacing="1" w:after="100" w:afterAutospacing="1" w:line="240" w:lineRule="auto"/>
+        <w:t xml:space="preserve">1. </w:t>
+      </w:r>
+      <w:r>
         <w:rPr>
           <w:rFonts w:eastAsia="Times New Roman" w:cs="Times New Roman"/>
           <w:b/>
           <w:szCs w:val="24"/>
         </w:rPr>
-      </w:pPr>
-      <w:r>
-        <w:rPr>
-          <w:rFonts w:eastAsia="Times New Roman" w:cs="Times New Roman"/>
-          <w:b/>
-          <w:szCs w:val="24"/>
-        </w:rPr>
-        <w:t xml:space="preserve">1. </w:t>
-      </w:r>
-      <w:r>
-        <w:rPr>
-          <w:rFonts w:eastAsia="Times New Roman" w:cs="Times New Roman"/>
-          <w:b/>
-          <w:szCs w:val="24"/>
-        </w:rPr>
-        <w:t xml:space="preserve">System </w:t>
-      </w:r>
-      <w:proofErr w:type="spellStart"/>
-      <w:r>
-        <w:rPr>
-          <w:rFonts w:eastAsia="Times New Roman" w:cs="Times New Roman"/>
-          <w:b/>
-          <w:szCs w:val="24"/>
-        </w:rPr>
-        <w:t>archtecture</w:t>
-      </w:r>
-      <w:proofErr w:type="spellEnd"/>
+        <w:t>System archtecture</w:t>
+      </w:r>
     </w:p>
     <w:p>
       <w:pPr>
@@ -6100,23 +5232,7 @@
           <w:rFonts w:eastAsia="Times New Roman" w:cs="Times New Roman"/>
           <w:szCs w:val="24"/>
         </w:rPr>
-        <w:t xml:space="preserve">Data </w:t>
-      </w:r>
-      <w:proofErr w:type="spellStart"/>
-      <w:r>
-        <w:rPr>
-          <w:rFonts w:eastAsia="Times New Roman" w:cs="Times New Roman"/>
-          <w:szCs w:val="24"/>
-        </w:rPr>
-        <w:t>Acquisiton</w:t>
-      </w:r>
-      <w:proofErr w:type="spellEnd"/>
-      <w:r>
-        <w:rPr>
-          <w:rFonts w:eastAsia="Times New Roman" w:cs="Times New Roman"/>
-          <w:szCs w:val="24"/>
-        </w:rPr>
-        <w:t xml:space="preserve"> from Solar Inverter </w:t>
+        <w:t xml:space="preserve">Data Acquisiton from Solar Inverter </w:t>
       </w:r>
       <w:r>
         <w:rPr>
@@ -6152,21 +5268,12 @@
         </w:rPr>
         <w:t xml:space="preserve">Data Monitoring and </w:t>
       </w:r>
-      <w:proofErr w:type="spellStart"/>
       <w:r>
         <w:rPr>
           <w:rFonts w:eastAsia="Times New Roman" w:cs="Times New Roman"/>
           <w:szCs w:val="24"/>
         </w:rPr>
-        <w:t>Implimentation</w:t>
-      </w:r>
-      <w:proofErr w:type="spellEnd"/>
-      <w:r>
-        <w:rPr>
-          <w:rFonts w:eastAsia="Times New Roman" w:cs="Times New Roman"/>
-          <w:szCs w:val="24"/>
-        </w:rPr>
-        <w:t xml:space="preserve"> of AI Based Decision making </w:t>
+        <w:t xml:space="preserve">Implimentation of AI Based Decision making </w:t>
       </w:r>
       <w:r>
         <w:rPr>
@@ -6194,71 +5301,7 @@
           <w:rFonts w:eastAsia="Times New Roman" w:cs="Times New Roman"/>
           <w:szCs w:val="24"/>
         </w:rPr>
-        <w:t xml:space="preserve">full </w:t>
-      </w:r>
-      <w:proofErr w:type="spellStart"/>
-      <w:r>
-        <w:rPr>
-          <w:rFonts w:eastAsia="Times New Roman" w:cs="Times New Roman"/>
-          <w:szCs w:val="24"/>
-        </w:rPr>
-        <w:t>implimentation</w:t>
-      </w:r>
-      <w:proofErr w:type="spellEnd"/>
-      <w:r>
-        <w:rPr>
-          <w:rFonts w:eastAsia="Times New Roman" w:cs="Times New Roman"/>
-          <w:szCs w:val="24"/>
-        </w:rPr>
-        <w:t xml:space="preserve"> of the optimization (controlling the loads setting </w:t>
-      </w:r>
-      <w:proofErr w:type="spellStart"/>
-      <w:r>
-        <w:rPr>
-          <w:rFonts w:eastAsia="Times New Roman" w:cs="Times New Roman"/>
-          <w:szCs w:val="24"/>
-        </w:rPr>
-        <w:t>hvac</w:t>
-      </w:r>
-      <w:proofErr w:type="spellEnd"/>
-      <w:r>
-        <w:rPr>
-          <w:rFonts w:eastAsia="Times New Roman" w:cs="Times New Roman"/>
-          <w:szCs w:val="24"/>
-        </w:rPr>
-        <w:t xml:space="preserve"> </w:t>
-      </w:r>
-      <w:proofErr w:type="spellStart"/>
-      <w:r>
-        <w:rPr>
-          <w:rFonts w:eastAsia="Times New Roman" w:cs="Times New Roman"/>
-          <w:szCs w:val="24"/>
-        </w:rPr>
-        <w:t>tempratures,modes</w:t>
-      </w:r>
-      <w:proofErr w:type="spellEnd"/>
-      <w:r>
-        <w:rPr>
-          <w:rFonts w:eastAsia="Times New Roman" w:cs="Times New Roman"/>
-          <w:szCs w:val="24"/>
-        </w:rPr>
-        <w:t xml:space="preserve">, turning them on/off, controlling smart switches </w:t>
-      </w:r>
-      <w:proofErr w:type="spellStart"/>
-      <w:r>
-        <w:rPr>
-          <w:rFonts w:eastAsia="Times New Roman" w:cs="Times New Roman"/>
-          <w:szCs w:val="24"/>
-        </w:rPr>
-        <w:t>etc</w:t>
-      </w:r>
-      <w:proofErr w:type="spellEnd"/>
-      <w:r>
-        <w:rPr>
-          <w:rFonts w:eastAsia="Times New Roman" w:cs="Times New Roman"/>
-          <w:szCs w:val="24"/>
-        </w:rPr>
-        <w:t>)</w:t>
+        <w:t>full implimentation of the optimization (controlling the loads setting hvac tempratures,modes, turning them on/off, controlling smart switches etc)</w:t>
       </w:r>
       <w:r>
         <w:rPr>
@@ -6320,23 +5363,7 @@
           <w:rFonts w:eastAsia="Times New Roman" w:cs="Times New Roman"/>
           <w:szCs w:val="24"/>
         </w:rPr>
-        <w:t xml:space="preserve">1. data </w:t>
-      </w:r>
-      <w:proofErr w:type="spellStart"/>
-      <w:r>
-        <w:rPr>
-          <w:rFonts w:eastAsia="Times New Roman" w:cs="Times New Roman"/>
-          <w:szCs w:val="24"/>
-        </w:rPr>
-        <w:t>acquistion</w:t>
-      </w:r>
-      <w:proofErr w:type="spellEnd"/>
-      <w:r>
-        <w:rPr>
-          <w:rFonts w:eastAsia="Times New Roman" w:cs="Times New Roman"/>
-          <w:szCs w:val="24"/>
-        </w:rPr>
-        <w:t xml:space="preserve"> from inverters:</w:t>
+        <w:t>1. data acquistion from inverters:</w:t>
       </w:r>
       <w:r>
         <w:rPr>
@@ -6358,162 +5385,80 @@
           <w:rFonts w:eastAsia="Times New Roman" w:cs="Times New Roman"/>
           <w:szCs w:val="24"/>
         </w:rPr>
+        <w:t xml:space="preserve"> esp 32</w:t>
+      </w:r>
+      <w:r>
+        <w:rPr>
+          <w:rFonts w:eastAsia="Times New Roman" w:cs="Times New Roman"/>
+          <w:szCs w:val="24"/>
+        </w:rPr>
+        <w:t>,</w:t>
+      </w:r>
+      <w:r>
+        <w:rPr>
+          <w:rFonts w:eastAsia="Times New Roman" w:cs="Times New Roman"/>
+          <w:szCs w:val="24"/>
+        </w:rPr>
         <w:t xml:space="preserve"> </w:t>
       </w:r>
-      <w:proofErr w:type="spellStart"/>
       <w:r>
         <w:rPr>
           <w:rFonts w:eastAsia="Times New Roman" w:cs="Times New Roman"/>
           <w:szCs w:val="24"/>
         </w:rPr>
-        <w:t>esp</w:t>
-      </w:r>
-      <w:proofErr w:type="spellEnd"/>
+        <w:t xml:space="preserve">custom cable consisting of  RS485(RJ45 cable) and RS232 (DB9 cable), and a 232/485 to UART converter </w:t>
+      </w:r>
       <w:r>
         <w:rPr>
           <w:rFonts w:eastAsia="Times New Roman" w:cs="Times New Roman"/>
           <w:szCs w:val="24"/>
         </w:rPr>
-        <w:t xml:space="preserve"> 32</w:t>
+        <w:br/>
+        <w:t>this device gets attached with the inverter and serves as a data logger and also sends this data to Home Assistant over WiFi. This device is discoverable from the home assistant and can be configured from there wirelessly.</w:t>
       </w:r>
       <w:r>
         <w:rPr>
           <w:rFonts w:eastAsia="Times New Roman" w:cs="Times New Roman"/>
           <w:szCs w:val="24"/>
         </w:rPr>
-        <w:t>,</w:t>
+        <w:br/>
       </w:r>
       <w:r>
         <w:rPr>
           <w:rFonts w:eastAsia="Times New Roman" w:cs="Times New Roman"/>
           <w:szCs w:val="24"/>
         </w:rPr>
-        <w:t xml:space="preserve"> </w:t>
+        <w:br/>
+        <w:t>2 Making Smart Controllers for Heavy Loads (HVACs and ACs)</w:t>
       </w:r>
       <w:r>
         <w:rPr>
           <w:rFonts w:eastAsia="Times New Roman" w:cs="Times New Roman"/>
           <w:szCs w:val="24"/>
         </w:rPr>
-        <w:t xml:space="preserve">custom cable consisting of  RS485(RJ45 cable) and RS232 (DB9 cable), and a 232/485 to UART converter </w:t>
+        <w:br/>
       </w:r>
       <w:r>
         <w:rPr>
           <w:rFonts w:eastAsia="Times New Roman" w:cs="Times New Roman"/>
           <w:szCs w:val="24"/>
         </w:rPr>
+        <w:t xml:space="preserve">i) </w:t>
+      </w:r>
+      <w:r>
+        <w:rPr>
+          <w:rFonts w:eastAsia="Times New Roman" w:cs="Times New Roman"/>
+          <w:szCs w:val="24"/>
+        </w:rPr>
+        <w:t xml:space="preserve">HVACs: </w:t>
+      </w:r>
+      <w:r>
+        <w:rPr>
+          <w:rFonts w:eastAsia="Times New Roman" w:cs="Times New Roman"/>
+          <w:szCs w:val="24"/>
+        </w:rPr>
         <w:br/>
-        <w:t xml:space="preserve">this device gets attached with the inverter and serves as a data logger and also sends this data to Home Assistant over </w:t>
-      </w:r>
-      <w:proofErr w:type="spellStart"/>
-      <w:r>
-        <w:rPr>
-          <w:rFonts w:eastAsia="Times New Roman" w:cs="Times New Roman"/>
-          <w:szCs w:val="24"/>
-        </w:rPr>
-        <w:t>WiFi</w:t>
-      </w:r>
-      <w:proofErr w:type="spellEnd"/>
-      <w:r>
-        <w:rPr>
-          <w:rFonts w:eastAsia="Times New Roman" w:cs="Times New Roman"/>
-          <w:szCs w:val="24"/>
-        </w:rPr>
-        <w:t>. This device is discoverable from the home assistant and can be configured from there wirelessly.</w:t>
-      </w:r>
-      <w:r>
-        <w:rPr>
-          <w:rFonts w:eastAsia="Times New Roman" w:cs="Times New Roman"/>
-          <w:szCs w:val="24"/>
-        </w:rPr>
-        <w:br/>
-      </w:r>
-      <w:r>
-        <w:rPr>
-          <w:rFonts w:eastAsia="Times New Roman" w:cs="Times New Roman"/>
-          <w:szCs w:val="24"/>
-        </w:rPr>
-        <w:br/>
-        <w:t>2 Making Smart Controllers for Heavy Loads (HVACs and ACs</w:t>
-      </w:r>
-      <w:proofErr w:type="gramStart"/>
-      <w:r>
-        <w:rPr>
-          <w:rFonts w:eastAsia="Times New Roman" w:cs="Times New Roman"/>
-          <w:szCs w:val="24"/>
-        </w:rPr>
-        <w:t>)</w:t>
-      </w:r>
-      <w:proofErr w:type="gramEnd"/>
-      <w:r>
-        <w:rPr>
-          <w:rFonts w:eastAsia="Times New Roman" w:cs="Times New Roman"/>
-          <w:szCs w:val="24"/>
-        </w:rPr>
-        <w:br/>
-      </w:r>
-      <w:proofErr w:type="spellStart"/>
-      <w:r>
-        <w:rPr>
-          <w:rFonts w:eastAsia="Times New Roman" w:cs="Times New Roman"/>
-          <w:szCs w:val="24"/>
-        </w:rPr>
-        <w:t>i</w:t>
-      </w:r>
-      <w:proofErr w:type="spellEnd"/>
-      <w:r>
-        <w:rPr>
-          <w:rFonts w:eastAsia="Times New Roman" w:cs="Times New Roman"/>
-          <w:szCs w:val="24"/>
-        </w:rPr>
-        <w:t xml:space="preserve">) </w:t>
-      </w:r>
-      <w:r>
-        <w:rPr>
-          <w:rFonts w:eastAsia="Times New Roman" w:cs="Times New Roman"/>
-          <w:szCs w:val="24"/>
-        </w:rPr>
-        <w:t xml:space="preserve">HVACs: </w:t>
-      </w:r>
-      <w:r>
-        <w:rPr>
-          <w:rFonts w:eastAsia="Times New Roman" w:cs="Times New Roman"/>
-          <w:szCs w:val="24"/>
-        </w:rPr>
-        <w:br/>
-        <w:t xml:space="preserve">Different </w:t>
-      </w:r>
-      <w:proofErr w:type="spellStart"/>
-      <w:r>
-        <w:rPr>
-          <w:rFonts w:eastAsia="Times New Roman" w:cs="Times New Roman"/>
-          <w:szCs w:val="24"/>
-        </w:rPr>
-        <w:t>Hvac</w:t>
-      </w:r>
-      <w:proofErr w:type="spellEnd"/>
-      <w:r>
-        <w:rPr>
-          <w:rFonts w:eastAsia="Times New Roman" w:cs="Times New Roman"/>
-          <w:szCs w:val="24"/>
-        </w:rPr>
-        <w:t xml:space="preserve"> wired controllers were reverse engineered and decoded to understand their communication protocols in order to make a custom hardware which can control the </w:t>
-      </w:r>
-      <w:proofErr w:type="spellStart"/>
-      <w:r>
-        <w:rPr>
-          <w:rFonts w:eastAsia="Times New Roman" w:cs="Times New Roman"/>
-          <w:szCs w:val="24"/>
-        </w:rPr>
-        <w:t>hvacs</w:t>
-      </w:r>
-      <w:proofErr w:type="spellEnd"/>
-      <w:r>
-        <w:rPr>
-          <w:rFonts w:eastAsia="Times New Roman" w:cs="Times New Roman"/>
-          <w:szCs w:val="24"/>
-        </w:rPr>
-        <w:t xml:space="preserve"> and make them smart that is they are now also discoverable and controllable from </w:t>
+        <w:t xml:space="preserve">Different Hvac wired controllers were reverse engineered and decoded to understand their communication protocols in order to make a custom hardware which can control the hvacs and make them smart that is they are now also discoverable and controllable from </w:t>
       </w:r>
       <w:r>
         <w:rPr>
@@ -6532,7 +5477,6 @@
           <w:szCs w:val="24"/>
         </w:rPr>
       </w:pPr>
-      <w:proofErr w:type="gramStart"/>
       <w:r>
         <w:rPr>
           <w:rFonts w:eastAsia="Times New Roman" w:cs="Times New Roman"/>
@@ -6540,7 +5484,6 @@
         </w:rPr>
         <w:t>ii)</w:t>
       </w:r>
-      <w:proofErr w:type="gramEnd"/>
       <w:r>
         <w:rPr>
           <w:rFonts w:eastAsia="Times New Roman" w:cs="Times New Roman"/>
@@ -6554,128 +5497,50 @@
           <w:szCs w:val="24"/>
         </w:rPr>
         <w:br/>
-        <w:t xml:space="preserve">Almost all </w:t>
-      </w:r>
-      <w:proofErr w:type="spellStart"/>
+        <w:t xml:space="preserve">Almost all acs are controlled using ir remotes. A custom hardware was made consisiting of a few IR transmitters and esp32 like an IR blaster. This </w:t>
+      </w:r>
       <w:r>
         <w:rPr>
           <w:rFonts w:eastAsia="Times New Roman" w:cs="Times New Roman"/>
           <w:szCs w:val="24"/>
         </w:rPr>
-        <w:t>acs</w:t>
-      </w:r>
-      <w:proofErr w:type="spellEnd"/>
+        <w:t>will be installed in any room which contains those ACs (to be controlled) and it will be able to control them wirelessly through home assistant</w:t>
+      </w:r>
       <w:r>
         <w:rPr>
           <w:rFonts w:eastAsia="Times New Roman" w:cs="Times New Roman"/>
           <w:szCs w:val="24"/>
         </w:rPr>
-        <w:t xml:space="preserve"> are controlled using </w:t>
-      </w:r>
-      <w:proofErr w:type="spellStart"/>
+        <w:t>.</w:t>
+      </w:r>
       <w:r>
         <w:rPr>
           <w:rFonts w:eastAsia="Times New Roman" w:cs="Times New Roman"/>
           <w:szCs w:val="24"/>
         </w:rPr>
-        <w:t>ir</w:t>
-      </w:r>
-      <w:proofErr w:type="spellEnd"/>
+        <w:br/>
+      </w:r>
       <w:r>
         <w:rPr>
           <w:rFonts w:eastAsia="Times New Roman" w:cs="Times New Roman"/>
           <w:szCs w:val="24"/>
         </w:rPr>
-        <w:t xml:space="preserve"> remotes. A custom hardware was made </w:t>
-      </w:r>
-      <w:proofErr w:type="spellStart"/>
+        <w:br/>
+      </w:r>
       <w:r>
         <w:rPr>
           <w:rFonts w:eastAsia="Times New Roman" w:cs="Times New Roman"/>
           <w:szCs w:val="24"/>
         </w:rPr>
-        <w:t>consisiting</w:t>
-      </w:r>
-      <w:proofErr w:type="spellEnd"/>
+        <w:t xml:space="preserve">iii) </w:t>
+      </w:r>
       <w:r>
         <w:rPr>
           <w:rFonts w:eastAsia="Times New Roman" w:cs="Times New Roman"/>
           <w:szCs w:val="24"/>
         </w:rPr>
-        <w:t xml:space="preserve"> of a few IR transmitters and esp32 like an IR blaster. This </w:t>
-      </w:r>
-      <w:r>
-        <w:rPr>
-          <w:rFonts w:eastAsia="Times New Roman" w:cs="Times New Roman"/>
-          <w:szCs w:val="24"/>
-        </w:rPr>
-        <w:t>will be installed in any room which contains those ACs (to be controlled) and it will be able to control them wirelessly through home assistant</w:t>
-      </w:r>
-      <w:r>
-        <w:rPr>
-          <w:rFonts w:eastAsia="Times New Roman" w:cs="Times New Roman"/>
-          <w:szCs w:val="24"/>
-        </w:rPr>
-        <w:t>.</w:t>
-      </w:r>
-      <w:r>
-        <w:rPr>
-          <w:rFonts w:eastAsia="Times New Roman" w:cs="Times New Roman"/>
-          <w:szCs w:val="24"/>
-        </w:rPr>
-        <w:br/>
-      </w:r>
-      <w:r>
-        <w:rPr>
-          <w:rFonts w:eastAsia="Times New Roman" w:cs="Times New Roman"/>
-          <w:szCs w:val="24"/>
-        </w:rPr>
-        <w:br/>
-      </w:r>
-      <w:r>
-        <w:rPr>
-          <w:rFonts w:eastAsia="Times New Roman" w:cs="Times New Roman"/>
-          <w:szCs w:val="24"/>
-        </w:rPr>
-        <w:t>ii</w:t>
-      </w:r>
-      <w:r>
-        <w:rPr>
-          <w:rFonts w:eastAsia="Times New Roman" w:cs="Times New Roman"/>
-          <w:szCs w:val="24"/>
-        </w:rPr>
-        <w:t>i</w:t>
-      </w:r>
-      <w:r>
-        <w:rPr>
-          <w:rFonts w:eastAsia="Times New Roman" w:cs="Times New Roman"/>
-          <w:szCs w:val="24"/>
-        </w:rPr>
-        <w:t>)</w:t>
-      </w:r>
-      <w:r>
-        <w:rPr>
-          <w:rFonts w:eastAsia="Times New Roman" w:cs="Times New Roman"/>
-          <w:szCs w:val="24"/>
-        </w:rPr>
-        <w:t xml:space="preserve"> </w:t>
-      </w:r>
-      <w:r>
-        <w:rPr>
-          <w:rFonts w:eastAsia="Times New Roman" w:cs="Times New Roman"/>
-          <w:szCs w:val="24"/>
-        </w:rPr>
-        <w:t>Smart Switches</w:t>
-      </w:r>
-      <w:proofErr w:type="gramStart"/>
-      <w:r>
-        <w:rPr>
-          <w:rFonts w:eastAsia="Times New Roman" w:cs="Times New Roman"/>
-          <w:szCs w:val="24"/>
-        </w:rPr>
-        <w:t>:</w:t>
-      </w:r>
-      <w:proofErr w:type="gramEnd"/>
+        <w:t>Smart Switches:</w:t>
+      </w:r>
       <w:r>
         <w:rPr>
           <w:rFonts w:eastAsia="Times New Roman" w:cs="Times New Roman"/>
@@ -6705,23 +5570,7 @@
           <w:szCs w:val="24"/>
         </w:rPr>
         <w:br/>
-        <w:t xml:space="preserve">3.  </w:t>
-      </w:r>
-      <w:proofErr w:type="spellStart"/>
-      <w:r>
-        <w:rPr>
-          <w:rFonts w:eastAsia="Times New Roman" w:cs="Times New Roman"/>
-          <w:szCs w:val="24"/>
-        </w:rPr>
-        <w:t>Implimentation</w:t>
-      </w:r>
-      <w:proofErr w:type="spellEnd"/>
-      <w:r>
-        <w:rPr>
-          <w:rFonts w:eastAsia="Times New Roman" w:cs="Times New Roman"/>
-          <w:szCs w:val="24"/>
-        </w:rPr>
-        <w:t xml:space="preserve"> of AI Based Decision making using RAG</w:t>
+        <w:t>3.  Implimentation of AI Based Decision making using RAG</w:t>
       </w:r>
     </w:p>
     <w:p>
@@ -6732,37 +5581,12 @@
           <w:szCs w:val="24"/>
         </w:rPr>
       </w:pPr>
-      <w:proofErr w:type="spellStart"/>
       <w:r>
         <w:rPr>
           <w:rFonts w:eastAsia="Times New Roman" w:cs="Times New Roman"/>
           <w:szCs w:val="24"/>
         </w:rPr>
-        <w:t>i</w:t>
-      </w:r>
-      <w:proofErr w:type="spellEnd"/>
-      <w:r>
-        <w:rPr>
-          <w:rFonts w:eastAsia="Times New Roman" w:cs="Times New Roman"/>
-          <w:szCs w:val="24"/>
-        </w:rPr>
-        <w:t>)_</w:t>
-      </w:r>
-      <w:proofErr w:type="spellStart"/>
-      <w:r>
-        <w:rPr>
-          <w:rFonts w:eastAsia="Times New Roman" w:cs="Times New Roman"/>
-          <w:szCs w:val="24"/>
-        </w:rPr>
-        <w:t>propriteary</w:t>
-      </w:r>
-      <w:proofErr w:type="spellEnd"/>
-      <w:r>
-        <w:rPr>
-          <w:rFonts w:eastAsia="Times New Roman" w:cs="Times New Roman"/>
-          <w:szCs w:val="24"/>
-        </w:rPr>
-        <w:t xml:space="preserve"> database (which will be converted to vector database using vector embedding)</w:t>
+        <w:t>i)_propriteary database (which will be converted to vector database using vector embedding)</w:t>
       </w:r>
       <w:r>
         <w:rPr>
@@ -6793,41 +5617,7 @@
           <w:rFonts w:eastAsia="Times New Roman" w:cs="Times New Roman"/>
           <w:szCs w:val="24"/>
         </w:rPr>
-        <w:t xml:space="preserve">iii) </w:t>
-      </w:r>
-      <w:proofErr w:type="spellStart"/>
-      <w:proofErr w:type="gramStart"/>
-      <w:r>
-        <w:rPr>
-          <w:rFonts w:eastAsia="Times New Roman" w:cs="Times New Roman"/>
-          <w:szCs w:val="24"/>
-        </w:rPr>
-        <w:t>implimetation</w:t>
-      </w:r>
-      <w:proofErr w:type="spellEnd"/>
-      <w:proofErr w:type="gramEnd"/>
-      <w:r>
-        <w:rPr>
-          <w:rFonts w:eastAsia="Times New Roman" w:cs="Times New Roman"/>
-          <w:szCs w:val="24"/>
-        </w:rPr>
-        <w:t xml:space="preserve"> of  local </w:t>
-      </w:r>
-      <w:proofErr w:type="spellStart"/>
-      <w:r>
-        <w:rPr>
-          <w:rFonts w:eastAsia="Times New Roman" w:cs="Times New Roman"/>
-          <w:szCs w:val="24"/>
-        </w:rPr>
-        <w:t>llm</w:t>
-      </w:r>
-      <w:proofErr w:type="spellEnd"/>
-      <w:r>
-        <w:rPr>
-          <w:rFonts w:eastAsia="Times New Roman" w:cs="Times New Roman"/>
-          <w:szCs w:val="24"/>
-        </w:rPr>
-        <w:t xml:space="preserve"> :</w:t>
+        <w:t>iii) implimetation of  local llm :</w:t>
       </w:r>
     </w:p>
     <w:p>
@@ -6843,23 +5633,7 @@
           <w:rFonts w:eastAsia="Times New Roman" w:cs="Times New Roman"/>
           <w:szCs w:val="24"/>
         </w:rPr>
-        <w:t xml:space="preserve">It will run on the same machine as HA the context and the query (real time data) will be passed to the </w:t>
-      </w:r>
-      <w:proofErr w:type="spellStart"/>
-      <w:r>
-        <w:rPr>
-          <w:rFonts w:eastAsia="Times New Roman" w:cs="Times New Roman"/>
-          <w:szCs w:val="24"/>
-        </w:rPr>
-        <w:t>llm</w:t>
-      </w:r>
-      <w:proofErr w:type="spellEnd"/>
-      <w:r>
-        <w:rPr>
-          <w:rFonts w:eastAsia="Times New Roman" w:cs="Times New Roman"/>
-          <w:szCs w:val="24"/>
-        </w:rPr>
-        <w:t xml:space="preserve"> (augmentation). The LLM will output two things: a summary based on the real time data and recommended actions (generation) this action will be implementable from HA by pressing a single </w:t>
+        <w:t xml:space="preserve">It will run on the same machine as HA the context and the query (real time data) will be passed to the llm (augmentation). The LLM will output two things: a summary based on the real time data and recommended actions (generation) this action will be implementable from HA by pressing a single </w:t>
       </w:r>
       <w:r>
         <w:rPr>
@@ -6890,45 +5664,15 @@
         </w:rPr>
         <w:t xml:space="preserve"> </w:t>
       </w:r>
-      <w:proofErr w:type="spellStart"/>
+      <w:bookmarkStart w:id="10" w:name="_GoBack"/>
+      <w:bookmarkEnd w:id="10"/>
       <w:r>
         <w:rPr>
           <w:rFonts w:eastAsia="Times New Roman" w:cs="Times New Roman"/>
           <w:szCs w:val="24"/>
         </w:rPr>
-        <w:t>wrte</w:t>
-      </w:r>
-      <w:proofErr w:type="spellEnd"/>
-      <w:r>
-        <w:rPr>
-          <w:rFonts w:eastAsia="Times New Roman" w:cs="Times New Roman"/>
-          <w:szCs w:val="24"/>
-        </w:rPr>
-        <w:t xml:space="preserve"> at your own</w:t>
-      </w:r>
-      <w:r>
-        <w:rPr>
-          <w:rFonts w:eastAsia="Times New Roman" w:cs="Times New Roman"/>
-          <w:szCs w:val="24"/>
-        </w:rPr>
         <w:br/>
-        <w:t xml:space="preserve">Discussions: we have commercial solution for now in which only 3 major Loads (HVAC, ACs and smart switches future road map we can give a customized solution for the client all desired loads can be made </w:t>
-      </w:r>
-      <w:proofErr w:type="spellStart"/>
-      <w:r>
-        <w:rPr>
-          <w:rFonts w:eastAsia="Times New Roman" w:cs="Times New Roman"/>
-          <w:szCs w:val="24"/>
-        </w:rPr>
-        <w:t>smart.this</w:t>
-      </w:r>
-      <w:proofErr w:type="spellEnd"/>
-      <w:r>
-        <w:rPr>
-          <w:rFonts w:eastAsia="Times New Roman" w:cs="Times New Roman"/>
-          <w:szCs w:val="24"/>
-        </w:rPr>
-        <w:t xml:space="preserve"> will also include the addition of a smart plug and occupancy sensor both of which have ha integration</w:t>
+        <w:t>Discussions: we have commercial solution for now in which only 3 major Loads (HVAC, ACs and smart switches future road map we can give a customized solution for the client all desired loads can be made smart.this will also include the addition of a smart plug and occupancy sensor both of which have ha integration</w:t>
       </w:r>
       <w:r>
         <w:rPr>
@@ -7007,7 +5751,7 @@
         </w:rPr>
         <w:t>REFERENCES</w:t>
       </w:r>
-      <w:bookmarkEnd w:id="10"/>
+      <w:bookmarkEnd w:id="9"/>
     </w:p>
     <w:p>
       <w:pPr>
@@ -7028,45 +5772,8 @@
           <w:szCs w:val="24"/>
         </w:rPr>
       </w:pPr>
-      <w:proofErr w:type="spellStart"/>
-      <w:r>
-        <w:t>Marzal-Romeu</w:t>
-      </w:r>
-      <w:proofErr w:type="spellEnd"/>
-      <w:r>
-        <w:t xml:space="preserve">, S.; Salas-Puente, RA.; González Medina, R.; </w:t>
-      </w:r>
-      <w:proofErr w:type="spellStart"/>
-      <w:r>
-        <w:t>Garcerá</w:t>
-      </w:r>
-      <w:proofErr w:type="spellEnd"/>
-      <w:r>
-        <w:t xml:space="preserve">, G.; </w:t>
-      </w:r>
-      <w:proofErr w:type="spellStart"/>
-      <w:r>
-        <w:t>Figueres</w:t>
-      </w:r>
-      <w:proofErr w:type="spellEnd"/>
-      <w:r>
-        <w:t xml:space="preserve"> </w:t>
-      </w:r>
-      <w:proofErr w:type="spellStart"/>
-      <w:r>
-        <w:t>Amorós</w:t>
-      </w:r>
-      <w:proofErr w:type="spellEnd"/>
-      <w:r>
-        <w:t xml:space="preserve">, E. (2018). Current challenges and future trends in the field of communication architectures for </w:t>
-      </w:r>
-      <w:proofErr w:type="spellStart"/>
-      <w:r>
-        <w:t>microgrids</w:t>
-      </w:r>
-      <w:proofErr w:type="spellEnd"/>
-      <w:r>
-        <w:t>. Renewable and Sustainable Energy Reviews. 82(2):3610-3622. doi:10.1016/j.rser.2017.10.101</w:t>
+      <w:r>
+        <w:t>Marzal-Romeu, S.; Salas-Puente, RA.; González Medina, R.; Garcerá, G.; Figueres Amorós, E. (2018). Current challenges and future trends in the field of communication architectures for microgrids. Renewable and Sustainable Energy Reviews. 82(2):3610-3622. doi:10.1016/j.rser.2017.10.101</w:t>
       </w:r>
     </w:p>
     <w:p>
@@ -7082,33 +5789,11 @@
           <w:szCs w:val="24"/>
         </w:rPr>
       </w:pPr>
-      <w:proofErr w:type="spellStart"/>
-      <w:r>
-        <w:rPr>
-          <w:szCs w:val="24"/>
-        </w:rPr>
-        <w:t>Chahal</w:t>
-      </w:r>
-      <w:proofErr w:type="spellEnd"/>
-      <w:r>
-        <w:rPr>
-          <w:szCs w:val="24"/>
-        </w:rPr>
-        <w:t xml:space="preserve">, M., &amp; Saini, S. (2023). Trends in </w:t>
-      </w:r>
-      <w:proofErr w:type="spellStart"/>
-      <w:r>
-        <w:rPr>
-          <w:szCs w:val="24"/>
-        </w:rPr>
-        <w:t>microgrid</w:t>
-      </w:r>
-      <w:proofErr w:type="spellEnd"/>
-      <w:r>
-        <w:rPr>
-          <w:szCs w:val="24"/>
-        </w:rPr>
-        <w:t xml:space="preserve"> technology: A comprehensive review. Journal of Engineering Science and Technology Review, 16(3), 149–164. </w:t>
+      <w:r>
+        <w:rPr>
+          <w:szCs w:val="24"/>
+        </w:rPr>
+        <w:t xml:space="preserve">Chahal, M., &amp; Saini, S. (2023). Trends in microgrid technology: A comprehensive review. Journal of Engineering Science and Technology Review, 16(3), 149–164. </w:t>
       </w:r>
       <w:hyperlink r:id="rId12" w:history="1">
         <w:r>
@@ -7137,49 +5822,7 @@
         <w:rPr>
           <w:szCs w:val="24"/>
         </w:rPr>
-        <w:t xml:space="preserve">Nasir, M. B., </w:t>
-      </w:r>
-      <w:proofErr w:type="spellStart"/>
-      <w:r>
-        <w:rPr>
-          <w:szCs w:val="24"/>
-        </w:rPr>
-        <w:t>Hussain</w:t>
-      </w:r>
-      <w:proofErr w:type="spellEnd"/>
-      <w:r>
-        <w:rPr>
-          <w:szCs w:val="24"/>
-        </w:rPr>
-        <w:t xml:space="preserve">, A., </w:t>
-      </w:r>
-      <w:proofErr w:type="spellStart"/>
-      <w:r>
-        <w:rPr>
-          <w:szCs w:val="24"/>
-        </w:rPr>
-        <w:t>Niazi</w:t>
-      </w:r>
-      <w:proofErr w:type="spellEnd"/>
-      <w:r>
-        <w:rPr>
-          <w:szCs w:val="24"/>
-        </w:rPr>
-        <w:t xml:space="preserve">, K. A. K., &amp; Nasir, M. (2022). An optimal energy management system (EMS) for residential and industrial </w:t>
-      </w:r>
-      <w:proofErr w:type="spellStart"/>
-      <w:r>
-        <w:rPr>
-          <w:szCs w:val="24"/>
-        </w:rPr>
-        <w:t>microgrids</w:t>
-      </w:r>
-      <w:proofErr w:type="spellEnd"/>
-      <w:r>
-        <w:rPr>
-          <w:szCs w:val="24"/>
-        </w:rPr>
-        <w:t>. Energies, 15(17), Article 6266. https://doi.org/10.3390/en15176266</w:t>
+        <w:t>Nasir, M. B., Hussain, A., Niazi, K. A. K., &amp; Nasir, M. (2022). An optimal energy management system (EMS) for residential and industrial microgrids. Energies, 15(17), Article 6266. https://doi.org/10.3390/en15176266</w:t>
       </w:r>
     </w:p>
     <w:p>
@@ -7278,7 +5921,7 @@
           <w:rPr>
             <w:noProof/>
           </w:rPr>
-          <w:t>6</w:t>
+          <w:t>10</w:t>
         </w:r>
         <w:r>
           <w:rPr>
@@ -10208,6 +8851,7 @@
   <w:style w:type="character" w:default="1" w:styleId="DefaultParagraphFont">
     <w:name w:val="Default Paragraph Font"/>
     <w:uiPriority w:val="1"/>
+    <w:semiHidden/>
     <w:unhideWhenUsed/>
   </w:style>
   <w:style w:type="table" w:default="1" w:styleId="TableNormal">
@@ -22374,7 +21018,7 @@
 </file>
 
 <file path=customXml/itemProps1.xml><?xml version="1.0" encoding="utf-8"?>
-<ds:datastoreItem xmlns:ds="http://schemas.openxmlformats.org/officeDocument/2006/customXml" ds:itemID="{FC629CD1-217B-4AB5-972B-5C82F3404A9D}">
+<ds:datastoreItem xmlns:ds="http://schemas.openxmlformats.org/officeDocument/2006/customXml" ds:itemID="{41005BC1-81B6-4979-878A-7C21DC8DA092}">
   <ds:schemaRefs>
     <ds:schemaRef ds:uri="http://schemas.openxmlformats.org/officeDocument/2006/bibliography"/>
   </ds:schemaRefs>

</xml_diff>